<commit_message>
Docs. update (UCLA - NEW SCOPE)
</commit_message>
<xml_diff>
--- a/docs/UCLA - NEW SCOPE.docx
+++ b/docs/UCLA - NEW SCOPE.docx
@@ -1,6 +1,6 @@
 
 <file path=word/document.xml><?xml version="1.0" encoding="utf-8"?>
-<w:document xmlns:wpc="http://schemas.microsoft.com/office/word/2010/wordprocessingCanvas" xmlns:cx="http://schemas.microsoft.com/office/drawing/2014/chartex" xmlns:cx1="http://schemas.microsoft.com/office/drawing/2015/9/8/chartex" xmlns:cx2="http://schemas.microsoft.com/office/drawing/2015/10/21/chartex" xmlns:cx3="http://schemas.microsoft.com/office/drawing/2016/5/9/chartex" xmlns:cx4="http://schemas.microsoft.com/office/drawing/2016/5/10/chartex" xmlns:cx5="http://schemas.microsoft.com/office/drawing/2016/5/11/chartex" xmlns:cx6="http://schemas.microsoft.com/office/drawing/2016/5/12/chartex" xmlns:cx7="http://schemas.microsoft.com/office/drawing/2016/5/13/chartex" xmlns:cx8="http://schemas.microsoft.com/office/drawing/2016/5/14/chartex" xmlns:mc="http://schemas.openxmlformats.org/markup-compatibility/2006" xmlns:aink="http://schemas.microsoft.com/office/drawing/2016/ink" xmlns:am3d="http://schemas.microsoft.com/office/drawing/2017/model3d" xmlns:o="urn:schemas-microsoft-com:office:office" xmlns:oel="http://schemas.microsoft.com/office/2019/extlst" xmlns:r="http://schemas.openxmlformats.org/officeDocument/2006/relationships" xmlns:m="http://schemas.openxmlformats.org/officeDocument/2006/math" xmlns:v="urn:schemas-microsoft-com:vml" xmlns:wp14="http://schemas.microsoft.com/office/word/2010/wordprocessingDrawing" xmlns:wp="http://schemas.openxmlformats.org/drawingml/2006/wordprocessingDrawing" xmlns:w10="urn:schemas-microsoft-com:office:word" xmlns:w="http://schemas.openxmlformats.org/wordprocessingml/2006/main" xmlns:w14="http://schemas.microsoft.com/office/word/2010/wordml" xmlns:w15="http://schemas.microsoft.com/office/word/2012/wordml" xmlns:w16cex="http://schemas.microsoft.com/office/word/2018/wordml/cex" xmlns:w16cid="http://schemas.microsoft.com/office/word/2016/wordml/cid" xmlns:w16="http://schemas.microsoft.com/office/word/2018/wordml" xmlns:w16du="http://schemas.microsoft.com/office/word/2023/wordml/word16du" xmlns:w16sdtdh="http://schemas.microsoft.com/office/word/2020/wordml/sdtdatahash" xmlns:w16se="http://schemas.microsoft.com/office/word/2015/wordml/symex" xmlns:wpg="http://schemas.microsoft.com/office/word/2010/wordprocessingGroup" xmlns:wpi="http://schemas.microsoft.com/office/word/2010/wordprocessingInk" xmlns:wne="http://schemas.microsoft.com/office/word/2006/wordml" xmlns:wps="http://schemas.microsoft.com/office/word/2010/wordprocessingShape" mc:Ignorable="w14 w15 w16se w16cid w16 w16cex w16sdtdh w16du wp14">
+<w:document xmlns:wpc="http://schemas.microsoft.com/office/word/2010/wordprocessingCanvas" xmlns:cx="http://schemas.microsoft.com/office/drawing/2014/chartex" xmlns:cx1="http://schemas.microsoft.com/office/drawing/2015/9/8/chartex" xmlns:cx2="http://schemas.microsoft.com/office/drawing/2015/10/21/chartex" xmlns:cx3="http://schemas.microsoft.com/office/drawing/2016/5/9/chartex" xmlns:cx4="http://schemas.microsoft.com/office/drawing/2016/5/10/chartex" xmlns:cx5="http://schemas.microsoft.com/office/drawing/2016/5/11/chartex" xmlns:cx6="http://schemas.microsoft.com/office/drawing/2016/5/12/chartex" xmlns:cx7="http://schemas.microsoft.com/office/drawing/2016/5/13/chartex" xmlns:cx8="http://schemas.microsoft.com/office/drawing/2016/5/14/chartex" xmlns:mc="http://schemas.openxmlformats.org/markup-compatibility/2006" xmlns:aink="http://schemas.microsoft.com/office/drawing/2016/ink" xmlns:am3d="http://schemas.microsoft.com/office/drawing/2017/model3d" xmlns:o="urn:schemas-microsoft-com:office:office" xmlns:oel="http://schemas.microsoft.com/office/2019/extlst" xmlns:r="http://schemas.openxmlformats.org/officeDocument/2006/relationships" xmlns:m="http://schemas.openxmlformats.org/officeDocument/2006/math" xmlns:v="urn:schemas-microsoft-com:vml" xmlns:wp14="http://schemas.microsoft.com/office/word/2010/wordprocessingDrawing" xmlns:wp="http://schemas.openxmlformats.org/drawingml/2006/wordprocessingDrawing" xmlns:w10="urn:schemas-microsoft-com:office:word" xmlns:w="http://schemas.openxmlformats.org/wordprocessingml/2006/main" xmlns:w14="http://schemas.microsoft.com/office/word/2010/wordml" xmlns:w15="http://schemas.microsoft.com/office/word/2012/wordml" xmlns:w16cex="http://schemas.microsoft.com/office/word/2018/wordml/cex" xmlns:w16cid="http://schemas.microsoft.com/office/word/2016/wordml/cid" xmlns:w16="http://schemas.microsoft.com/office/word/2018/wordml" xmlns:w16du="http://schemas.microsoft.com/office/word/2023/wordml/word16du" xmlns:w16sdtdh="http://schemas.microsoft.com/office/word/2020/wordml/sdtdatahash" xmlns:w16sdtfl="http://schemas.microsoft.com/office/word/2024/wordml/sdtformatlock" xmlns:w16se="http://schemas.microsoft.com/office/word/2015/wordml/symex" xmlns:wpg="http://schemas.microsoft.com/office/word/2010/wordprocessingGroup" xmlns:wpi="http://schemas.microsoft.com/office/word/2010/wordprocessingInk" xmlns:wne="http://schemas.microsoft.com/office/word/2006/wordml" xmlns:wps="http://schemas.microsoft.com/office/word/2010/wordprocessingShape" mc:Ignorable="w14 w15 w16se w16cid w16 w16cex w16sdtdh w16sdtfl w16du wp14">
   <w:body>
     <w:p>
       <w:pPr>
@@ -155,7 +155,6 @@
           <w:lang w:val="nl-NL"/>
         </w:rPr>
       </w:pPr>
-      <w:proofErr w:type="spellStart"/>
       <w:r>
         <w:rPr>
           <w:sz w:val="24"/>
@@ -164,7 +163,6 @@
         </w:rPr>
         <w:t>RenCloud</w:t>
       </w:r>
-      <w:proofErr w:type="spellEnd"/>
     </w:p>
     <w:p>
       <w:pPr>
@@ -234,6 +232,84 @@
           <w:lang w:val="en-IE"/>
         </w:rPr>
         <w:t>Section 1: Each Use Case:</w:t>
+      </w:r>
+    </w:p>
+    <w:p>
+      <w:pPr>
+        <w:jc w:val="center"/>
+        <w:rPr>
+          <w:b/>
+          <w:bCs/>
+          <w:sz w:val="24"/>
+          <w:szCs w:val="24"/>
+          <w:lang w:val="en-IE"/>
+        </w:rPr>
+      </w:pPr>
+      <w:r>
+        <w:rPr>
+          <w:b/>
+          <w:bCs/>
+          <w:sz w:val="24"/>
+          <w:szCs w:val="24"/>
+          <w:lang w:val="en-IE"/>
+        </w:rPr>
+        <w:t>Legend.</w:t>
+      </w:r>
+    </w:p>
+    <w:p>
+      <w:pPr>
+        <w:jc w:val="center"/>
+        <w:rPr>
+          <w:sz w:val="24"/>
+          <w:szCs w:val="24"/>
+          <w:lang w:val="en-IE"/>
+        </w:rPr>
+      </w:pPr>
+      <w:r>
+        <w:rPr>
+          <w:b/>
+          <w:bCs/>
+          <w:sz w:val="24"/>
+          <w:szCs w:val="24"/>
+          <w:lang w:val="en-IE"/>
+        </w:rPr>
+        <w:t xml:space="preserve">Segment – </w:t>
+      </w:r>
+      <w:r>
+        <w:rPr>
+          <w:sz w:val="24"/>
+          <w:szCs w:val="24"/>
+          <w:lang w:val="en-IE"/>
+        </w:rPr>
+        <w:t>a part of the video, e.g. on import initially there is 1 segment a.k.a. the full video length imported. When a split is done would result in 2 segments with different length depending on where the split has been made.</w:t>
+      </w:r>
+    </w:p>
+    <w:p>
+      <w:pPr>
+        <w:jc w:val="center"/>
+        <w:rPr>
+          <w:sz w:val="24"/>
+          <w:szCs w:val="24"/>
+          <w:lang w:val="en-IE"/>
+        </w:rPr>
+      </w:pPr>
+      <w:r>
+        <w:rPr>
+          <w:b/>
+          <w:bCs/>
+          <w:sz w:val="24"/>
+          <w:szCs w:val="24"/>
+          <w:lang w:val="en-IE"/>
+        </w:rPr>
+        <w:t xml:space="preserve">VLC – </w:t>
+      </w:r>
+      <w:r>
+        <w:rPr>
+          <w:sz w:val="24"/>
+          <w:szCs w:val="24"/>
+          <w:lang w:val="en-IE"/>
+        </w:rPr>
+        <w:t>library for playing media files.</w:t>
       </w:r>
     </w:p>
     <w:p>
@@ -403,7 +479,7 @@
                 <w:szCs w:val="24"/>
                 <w:lang w:val="en-IE"/>
               </w:rPr>
-              <w:t>User/Content creator</w:t>
+              <w:t>User</w:t>
             </w:r>
           </w:p>
         </w:tc>
@@ -475,7 +551,7 @@
                 <w:szCs w:val="24"/>
                 <w:lang w:val="en-IE"/>
               </w:rPr>
-              <w:t>Suppose the user want’s to log in for the first time. He can register by using the app or he can login if already done so.</w:t>
+              <w:t>The user wants to login either register or restore password.</w:t>
             </w:r>
           </w:p>
         </w:tc>
@@ -483,6 +559,7 @@
     </w:tbl>
     <w:p>
       <w:pPr>
+        <w:jc w:val="center"/>
         <w:rPr>
           <w:sz w:val="24"/>
           <w:szCs w:val="24"/>
@@ -576,7 +653,7 @@
                 <w:szCs w:val="24"/>
                 <w:lang w:val="en-IE"/>
               </w:rPr>
-              <w:t>Uploading Files</w:t>
+              <w:t>Skip Login</w:t>
             </w:r>
           </w:p>
         </w:tc>
@@ -648,7 +725,7 @@
                 <w:szCs w:val="24"/>
                 <w:lang w:val="en-IE"/>
               </w:rPr>
-              <w:t>User/Content creator</w:t>
+              <w:t>User</w:t>
             </w:r>
           </w:p>
         </w:tc>
@@ -720,25 +797,31 @@
                 <w:szCs w:val="24"/>
                 <w:lang w:val="en-IE"/>
               </w:rPr>
-              <w:t xml:space="preserve">Suppose the user want’s to upload the project files, He could press a button that would manually mount the NFS volume to </w:t>
-            </w:r>
-            <w:proofErr w:type="spellStart"/>
-            <w:r>
-              <w:rPr>
-                <w:sz w:val="24"/>
-                <w:szCs w:val="24"/>
-                <w:lang w:val="en-IE"/>
-              </w:rPr>
-              <w:t>it’s</w:t>
-            </w:r>
-            <w:proofErr w:type="spellEnd"/>
-            <w:r>
-              <w:rPr>
-                <w:sz w:val="24"/>
-                <w:szCs w:val="24"/>
-                <w:lang w:val="en-IE"/>
-              </w:rPr>
-              <w:t xml:space="preserve"> computer device</w:t>
+              <w:t xml:space="preserve">The user </w:t>
+            </w:r>
+            <w:r>
+              <w:rPr>
+                <w:sz w:val="24"/>
+                <w:szCs w:val="24"/>
+                <w:lang w:val="en-IE"/>
+              </w:rPr>
+              <w:t>wants</w:t>
+            </w:r>
+            <w:r>
+              <w:rPr>
+                <w:sz w:val="24"/>
+                <w:szCs w:val="24"/>
+                <w:lang w:val="en-IE"/>
+              </w:rPr>
+              <w:t xml:space="preserve"> </w:t>
+            </w:r>
+            <w:r>
+              <w:rPr>
+                <w:sz w:val="24"/>
+                <w:szCs w:val="24"/>
+                <w:lang w:val="en-IE"/>
+              </w:rPr>
+              <w:t>to skip the login and/or registration to start using the application with limited features.</w:t>
             </w:r>
           </w:p>
         </w:tc>
@@ -746,6 +829,7 @@
     </w:tbl>
     <w:p>
       <w:pPr>
+        <w:jc w:val="center"/>
         <w:rPr>
           <w:sz w:val="24"/>
           <w:szCs w:val="24"/>
@@ -839,7 +923,7 @@
                 <w:szCs w:val="24"/>
                 <w:lang w:val="en-IE"/>
               </w:rPr>
-              <w:t>Specifying the render settings</w:t>
+              <w:t>Import video to timeline</w:t>
             </w:r>
           </w:p>
         </w:tc>
@@ -911,7 +995,7 @@
                 <w:szCs w:val="24"/>
                 <w:lang w:val="en-IE"/>
               </w:rPr>
-              <w:t>User/Content creator</w:t>
+              <w:t>User</w:t>
             </w:r>
           </w:p>
         </w:tc>
@@ -983,7 +1067,55 @@
                 <w:szCs w:val="24"/>
                 <w:lang w:val="en-IE"/>
               </w:rPr>
-              <w:t>The user should pick the render settings before starting the render process.</w:t>
+              <w:t xml:space="preserve">After choosing what video/media file the user wants to edit, to begin the editing process he </w:t>
+            </w:r>
+            <w:r>
+              <w:rPr>
+                <w:sz w:val="24"/>
+                <w:szCs w:val="24"/>
+                <w:lang w:val="en-IE"/>
+              </w:rPr>
+              <w:t>must</w:t>
+            </w:r>
+            <w:r>
+              <w:rPr>
+                <w:sz w:val="24"/>
+                <w:szCs w:val="24"/>
+                <w:lang w:val="en-IE"/>
+              </w:rPr>
+              <w:t xml:space="preserve"> import the </w:t>
+            </w:r>
+            <w:r>
+              <w:rPr>
+                <w:sz w:val="24"/>
+                <w:szCs w:val="24"/>
+                <w:lang w:val="en-IE"/>
+              </w:rPr>
+              <w:t>file/files,</w:t>
+            </w:r>
+            <w:r>
+              <w:rPr>
+                <w:sz w:val="24"/>
+                <w:szCs w:val="24"/>
+                <w:lang w:val="en-IE"/>
+              </w:rPr>
+              <w:t xml:space="preserve"> so it appears on the </w:t>
+            </w:r>
+            <w:r>
+              <w:rPr>
+                <w:sz w:val="24"/>
+                <w:szCs w:val="24"/>
+                <w:lang w:val="en-IE"/>
+              </w:rPr>
+              <w:t>timeline (showing thumbnails at different timestamps and show audio amplitude bars for better interpretation of higher/lower notes)</w:t>
+            </w:r>
+            <w:r>
+              <w:rPr>
+                <w:sz w:val="24"/>
+                <w:szCs w:val="24"/>
+                <w:lang w:val="en-IE"/>
+              </w:rPr>
+              <w:t>.</w:t>
             </w:r>
           </w:p>
         </w:tc>
@@ -991,6 +1123,7 @@
     </w:tbl>
     <w:p>
       <w:pPr>
+        <w:jc w:val="center"/>
         <w:rPr>
           <w:sz w:val="24"/>
           <w:szCs w:val="24"/>
@@ -1084,7 +1217,25 @@
                 <w:szCs w:val="24"/>
                 <w:lang w:val="en-IE"/>
               </w:rPr>
-              <w:t>Starting/Finishing Render</w:t>
+              <w:t xml:space="preserve">Select the </w:t>
+            </w:r>
+            <w:r>
+              <w:rPr>
+                <w:b/>
+                <w:bCs/>
+                <w:sz w:val="24"/>
+                <w:szCs w:val="24"/>
+                <w:lang w:val="en-IE"/>
+              </w:rPr>
+              <w:t>segment</w:t>
+            </w:r>
+            <w:r>
+              <w:rPr>
+                <w:sz w:val="24"/>
+                <w:szCs w:val="24"/>
+                <w:lang w:val="en-IE"/>
+              </w:rPr>
+              <w:t>.</w:t>
             </w:r>
           </w:p>
         </w:tc>
@@ -1156,7 +1307,7 @@
                 <w:szCs w:val="24"/>
                 <w:lang w:val="en-IE"/>
               </w:rPr>
-              <w:t>User/Content creator</w:t>
+              <w:t>User</w:t>
             </w:r>
           </w:p>
         </w:tc>
@@ -1193,6 +1344,7 @@
                 <w:szCs w:val="24"/>
                 <w:lang w:val="en-IE"/>
               </w:rPr>
+              <w:lastRenderedPageBreak/>
               <w:t>Story</w:t>
             </w:r>
           </w:p>
@@ -1228,7 +1380,33 @@
                 <w:szCs w:val="24"/>
                 <w:lang w:val="en-IE"/>
               </w:rPr>
-              <w:t>After successful upload the user wants to start the render process. He press the start button and wait for a notification that would confirm the status.</w:t>
+              <w:t xml:space="preserve">The user wants to delete/reposition a specific length of the video. </w:t>
+            </w:r>
+            <w:r>
+              <w:rPr>
+                <w:sz w:val="24"/>
+                <w:szCs w:val="24"/>
+                <w:lang w:val="en-IE"/>
+              </w:rPr>
+              <w:t xml:space="preserve">In order to make changes the user would have to select what segment does he </w:t>
+            </w:r>
+            <w:proofErr w:type="gramStart"/>
+            <w:r>
+              <w:rPr>
+                <w:sz w:val="24"/>
+                <w:szCs w:val="24"/>
+                <w:lang w:val="en-IE"/>
+              </w:rPr>
+              <w:t>want’s</w:t>
+            </w:r>
+            <w:proofErr w:type="gramEnd"/>
+            <w:r>
+              <w:rPr>
+                <w:sz w:val="24"/>
+                <w:szCs w:val="24"/>
+                <w:lang w:val="en-IE"/>
+              </w:rPr>
+              <w:t xml:space="preserve"> to split/delete/move.</w:t>
             </w:r>
           </w:p>
         </w:tc>
@@ -1294,7 +1472,6 @@
                 <w:szCs w:val="24"/>
                 <w:lang w:val="en-IE"/>
               </w:rPr>
-              <w:lastRenderedPageBreak/>
               <w:t>Title (goal)</w:t>
             </w:r>
           </w:p>
@@ -1330,7 +1507,7 @@
                 <w:szCs w:val="24"/>
                 <w:lang w:val="en-IE"/>
               </w:rPr>
-              <w:t>Payment</w:t>
+              <w:t>Split video/audio.</w:t>
             </w:r>
           </w:p>
         </w:tc>
@@ -1402,7 +1579,7 @@
                 <w:szCs w:val="24"/>
                 <w:lang w:val="en-IE"/>
               </w:rPr>
-              <w:t>User/Content creator</w:t>
+              <w:t>User</w:t>
             </w:r>
           </w:p>
         </w:tc>
@@ -1474,7 +1651,49 @@
                 <w:szCs w:val="24"/>
                 <w:lang w:val="en-IE"/>
               </w:rPr>
-              <w:t>How much would the user have to pay using the service? Pay-As-You-Go implementation derived from prices from the cloud.</w:t>
+              <w:t>The user wants to delete/reposition a specific length of the vide</w:t>
+            </w:r>
+            <w:r>
+              <w:rPr>
+                <w:sz w:val="24"/>
+                <w:szCs w:val="24"/>
+                <w:lang w:val="en-IE"/>
+              </w:rPr>
+              <w:t>o</w:t>
+            </w:r>
+            <w:r>
+              <w:rPr>
+                <w:sz w:val="24"/>
+                <w:szCs w:val="24"/>
+                <w:lang w:val="en-IE"/>
+              </w:rPr>
+              <w:t xml:space="preserve"> (e.g. a video with 1 minute length has been imported, and the user wants to place the last 10 seconds of the clip at the start of the clip or, the user wants to delete the part from 15 - 35 seconds, the user would have to select that length first, which will require to divide the clip into more parts/applies for audio track the same way)</w:t>
+            </w:r>
+            <w:r>
+              <w:rPr>
+                <w:sz w:val="24"/>
+                <w:szCs w:val="24"/>
+                <w:lang w:val="en-IE"/>
+              </w:rPr>
+              <w:t xml:space="preserve">. </w:t>
+            </w:r>
+            <w:proofErr w:type="gramStart"/>
+            <w:r>
+              <w:rPr>
+                <w:sz w:val="24"/>
+                <w:szCs w:val="24"/>
+                <w:lang w:val="en-IE"/>
+              </w:rPr>
+              <w:t>In order to</w:t>
+            </w:r>
+            <w:proofErr w:type="gramEnd"/>
+            <w:r>
+              <w:rPr>
+                <w:sz w:val="24"/>
+                <w:szCs w:val="24"/>
+                <w:lang w:val="en-IE"/>
+              </w:rPr>
+              <w:t xml:space="preserve"> do so, as a prerequisite the user would have to select the segment to apply the operation on.</w:t>
             </w:r>
           </w:p>
         </w:tc>
@@ -1482,6 +1701,2529 @@
     </w:tbl>
     <w:p>
       <w:pPr>
+        <w:jc w:val="center"/>
+        <w:rPr>
+          <w:sz w:val="24"/>
+          <w:szCs w:val="24"/>
+          <w:lang w:val="en-IE"/>
+        </w:rPr>
+      </w:pPr>
+    </w:p>
+    <w:tbl>
+      <w:tblPr>
+        <w:tblW w:w="9000" w:type="dxa"/>
+        <w:tblInd w:w="100" w:type="dxa"/>
+        <w:tblBorders>
+          <w:top w:val="single" w:sz="8" w:space="0" w:color="000000"/>
+          <w:left w:val="single" w:sz="8" w:space="0" w:color="000000"/>
+          <w:bottom w:val="single" w:sz="8" w:space="0" w:color="000000"/>
+          <w:right w:val="single" w:sz="8" w:space="0" w:color="000000"/>
+          <w:insideH w:val="single" w:sz="8" w:space="0" w:color="000000"/>
+          <w:insideV w:val="single" w:sz="8" w:space="0" w:color="000000"/>
+        </w:tblBorders>
+        <w:tblLayout w:type="fixed"/>
+        <w:tblLook w:val="0600" w:firstRow="0" w:lastRow="0" w:firstColumn="0" w:lastColumn="0" w:noHBand="1" w:noVBand="1"/>
+      </w:tblPr>
+      <w:tblGrid>
+        <w:gridCol w:w="2085"/>
+        <w:gridCol w:w="6915"/>
+      </w:tblGrid>
+      <w:tr>
+        <w:tc>
+          <w:tcPr>
+            <w:tcW w:w="2085" w:type="dxa"/>
+            <w:tcBorders>
+              <w:top w:val="single" w:sz="8" w:space="0" w:color="000000"/>
+              <w:left w:val="single" w:sz="8" w:space="0" w:color="000000"/>
+              <w:bottom w:val="single" w:sz="8" w:space="0" w:color="000000"/>
+              <w:right w:val="single" w:sz="8" w:space="0" w:color="000000"/>
+            </w:tcBorders>
+            <w:tcMar>
+              <w:top w:w="100" w:type="dxa"/>
+              <w:left w:w="100" w:type="dxa"/>
+              <w:bottom w:w="100" w:type="dxa"/>
+              <w:right w:w="100" w:type="dxa"/>
+            </w:tcMar>
+            <w:hideMark/>
+          </w:tcPr>
+          <w:p>
+            <w:pPr>
+              <w:rPr>
+                <w:sz w:val="24"/>
+                <w:szCs w:val="24"/>
+                <w:lang w:val="en-IE"/>
+              </w:rPr>
+            </w:pPr>
+            <w:r>
+              <w:rPr>
+                <w:sz w:val="24"/>
+                <w:szCs w:val="24"/>
+                <w:lang w:val="en-IE"/>
+              </w:rPr>
+              <w:t>Title (goal)</w:t>
+            </w:r>
+          </w:p>
+        </w:tc>
+        <w:tc>
+          <w:tcPr>
+            <w:tcW w:w="6915" w:type="dxa"/>
+            <w:tcBorders>
+              <w:top w:val="single" w:sz="8" w:space="0" w:color="000000"/>
+              <w:left w:val="single" w:sz="8" w:space="0" w:color="000000"/>
+              <w:bottom w:val="single" w:sz="8" w:space="0" w:color="000000"/>
+              <w:right w:val="single" w:sz="8" w:space="0" w:color="000000"/>
+            </w:tcBorders>
+            <w:tcMar>
+              <w:top w:w="100" w:type="dxa"/>
+              <w:left w:w="100" w:type="dxa"/>
+              <w:bottom w:w="100" w:type="dxa"/>
+              <w:right w:w="100" w:type="dxa"/>
+            </w:tcMar>
+            <w:hideMark/>
+          </w:tcPr>
+          <w:p>
+            <w:pPr>
+              <w:rPr>
+                <w:sz w:val="24"/>
+                <w:szCs w:val="24"/>
+                <w:lang w:val="en-IE"/>
+              </w:rPr>
+            </w:pPr>
+            <w:r>
+              <w:rPr>
+                <w:sz w:val="24"/>
+                <w:szCs w:val="24"/>
+                <w:lang w:val="en-IE"/>
+              </w:rPr>
+              <w:t xml:space="preserve">Remove </w:t>
+            </w:r>
+            <w:r>
+              <w:rPr>
+                <w:sz w:val="24"/>
+                <w:szCs w:val="24"/>
+                <w:lang w:val="en-IE"/>
+              </w:rPr>
+              <w:t>video/audio.</w:t>
+            </w:r>
+          </w:p>
+        </w:tc>
+      </w:tr>
+      <w:tr>
+        <w:tc>
+          <w:tcPr>
+            <w:tcW w:w="2085" w:type="dxa"/>
+            <w:tcBorders>
+              <w:top w:val="single" w:sz="8" w:space="0" w:color="000000"/>
+              <w:left w:val="single" w:sz="8" w:space="0" w:color="000000"/>
+              <w:bottom w:val="single" w:sz="8" w:space="0" w:color="000000"/>
+              <w:right w:val="single" w:sz="8" w:space="0" w:color="000000"/>
+            </w:tcBorders>
+            <w:tcMar>
+              <w:top w:w="100" w:type="dxa"/>
+              <w:left w:w="100" w:type="dxa"/>
+              <w:bottom w:w="100" w:type="dxa"/>
+              <w:right w:w="100" w:type="dxa"/>
+            </w:tcMar>
+            <w:hideMark/>
+          </w:tcPr>
+          <w:p>
+            <w:pPr>
+              <w:rPr>
+                <w:sz w:val="24"/>
+                <w:szCs w:val="24"/>
+                <w:lang w:val="en-IE"/>
+              </w:rPr>
+            </w:pPr>
+            <w:r>
+              <w:rPr>
+                <w:sz w:val="24"/>
+                <w:szCs w:val="24"/>
+                <w:lang w:val="en-IE"/>
+              </w:rPr>
+              <w:t>Primary Actor</w:t>
+            </w:r>
+          </w:p>
+        </w:tc>
+        <w:tc>
+          <w:tcPr>
+            <w:tcW w:w="6915" w:type="dxa"/>
+            <w:tcBorders>
+              <w:top w:val="single" w:sz="8" w:space="0" w:color="000000"/>
+              <w:left w:val="single" w:sz="8" w:space="0" w:color="000000"/>
+              <w:bottom w:val="single" w:sz="8" w:space="0" w:color="000000"/>
+              <w:right w:val="single" w:sz="8" w:space="0" w:color="000000"/>
+            </w:tcBorders>
+            <w:tcMar>
+              <w:top w:w="100" w:type="dxa"/>
+              <w:left w:w="100" w:type="dxa"/>
+              <w:bottom w:w="100" w:type="dxa"/>
+              <w:right w:w="100" w:type="dxa"/>
+            </w:tcMar>
+            <w:hideMark/>
+          </w:tcPr>
+          <w:p>
+            <w:pPr>
+              <w:rPr>
+                <w:sz w:val="24"/>
+                <w:szCs w:val="24"/>
+                <w:lang w:val="en-IE"/>
+              </w:rPr>
+            </w:pPr>
+            <w:r>
+              <w:rPr>
+                <w:sz w:val="24"/>
+                <w:szCs w:val="24"/>
+                <w:lang w:val="en-IE"/>
+              </w:rPr>
+              <w:t>User</w:t>
+            </w:r>
+          </w:p>
+        </w:tc>
+      </w:tr>
+      <w:tr>
+        <w:tc>
+          <w:tcPr>
+            <w:tcW w:w="2085" w:type="dxa"/>
+            <w:tcBorders>
+              <w:top w:val="single" w:sz="8" w:space="0" w:color="000000"/>
+              <w:left w:val="single" w:sz="8" w:space="0" w:color="000000"/>
+              <w:bottom w:val="single" w:sz="8" w:space="0" w:color="000000"/>
+              <w:right w:val="single" w:sz="8" w:space="0" w:color="000000"/>
+            </w:tcBorders>
+            <w:tcMar>
+              <w:top w:w="100" w:type="dxa"/>
+              <w:left w:w="100" w:type="dxa"/>
+              <w:bottom w:w="100" w:type="dxa"/>
+              <w:right w:w="100" w:type="dxa"/>
+            </w:tcMar>
+            <w:hideMark/>
+          </w:tcPr>
+          <w:p>
+            <w:pPr>
+              <w:rPr>
+                <w:sz w:val="24"/>
+                <w:szCs w:val="24"/>
+                <w:lang w:val="en-IE"/>
+              </w:rPr>
+            </w:pPr>
+            <w:r>
+              <w:rPr>
+                <w:sz w:val="24"/>
+                <w:szCs w:val="24"/>
+                <w:lang w:val="en-IE"/>
+              </w:rPr>
+              <w:t>Story</w:t>
+            </w:r>
+          </w:p>
+        </w:tc>
+        <w:tc>
+          <w:tcPr>
+            <w:tcW w:w="6915" w:type="dxa"/>
+            <w:tcBorders>
+              <w:top w:val="single" w:sz="8" w:space="0" w:color="000000"/>
+              <w:left w:val="single" w:sz="8" w:space="0" w:color="000000"/>
+              <w:bottom w:val="single" w:sz="8" w:space="0" w:color="000000"/>
+              <w:right w:val="single" w:sz="8" w:space="0" w:color="000000"/>
+            </w:tcBorders>
+            <w:tcMar>
+              <w:top w:w="100" w:type="dxa"/>
+              <w:left w:w="100" w:type="dxa"/>
+              <w:bottom w:w="100" w:type="dxa"/>
+              <w:right w:w="100" w:type="dxa"/>
+            </w:tcMar>
+            <w:hideMark/>
+          </w:tcPr>
+          <w:p>
+            <w:pPr>
+              <w:rPr>
+                <w:sz w:val="24"/>
+                <w:szCs w:val="24"/>
+                <w:lang w:val="en-IE"/>
+              </w:rPr>
+            </w:pPr>
+            <w:r>
+              <w:rPr>
+                <w:sz w:val="24"/>
+                <w:szCs w:val="24"/>
+                <w:lang w:val="en-IE"/>
+              </w:rPr>
+              <w:t>The user wants to delete</w:t>
+            </w:r>
+            <w:r>
+              <w:rPr>
+                <w:sz w:val="24"/>
+                <w:szCs w:val="24"/>
+                <w:lang w:val="en-IE"/>
+              </w:rPr>
+              <w:t xml:space="preserve"> a specific length of the video. A selected segment would be removed from the timeline. (e.g. </w:t>
+            </w:r>
+            <w:r>
+              <w:rPr>
+                <w:sz w:val="24"/>
+                <w:szCs w:val="24"/>
+                <w:lang w:val="en-IE"/>
+              </w:rPr>
+              <w:t xml:space="preserve">a video with 1 minute length has been imported, and the user wants to </w:t>
+            </w:r>
+            <w:r>
+              <w:rPr>
+                <w:sz w:val="24"/>
+                <w:szCs w:val="24"/>
+                <w:lang w:val="en-IE"/>
+              </w:rPr>
+              <w:t>remove</w:t>
+            </w:r>
+            <w:r>
+              <w:rPr>
+                <w:sz w:val="24"/>
+                <w:szCs w:val="24"/>
+                <w:lang w:val="en-IE"/>
+              </w:rPr>
+              <w:t xml:space="preserve"> the last 10 seconds of the </w:t>
+            </w:r>
+            <w:r>
+              <w:rPr>
+                <w:sz w:val="24"/>
+                <w:szCs w:val="24"/>
+                <w:lang w:val="en-IE"/>
+              </w:rPr>
+              <w:t>video, it would result from 2 segments, in 1 segment with length of 50 seconds excluding the last 10 seconds of the video).</w:t>
+            </w:r>
+          </w:p>
+        </w:tc>
+      </w:tr>
+    </w:tbl>
+    <w:p>
+      <w:pPr>
+        <w:jc w:val="center"/>
+        <w:rPr>
+          <w:sz w:val="24"/>
+          <w:szCs w:val="24"/>
+          <w:lang w:val="en-IE"/>
+        </w:rPr>
+      </w:pPr>
+    </w:p>
+    <w:tbl>
+      <w:tblPr>
+        <w:tblW w:w="9000" w:type="dxa"/>
+        <w:tblInd w:w="100" w:type="dxa"/>
+        <w:tblBorders>
+          <w:top w:val="single" w:sz="8" w:space="0" w:color="000000"/>
+          <w:left w:val="single" w:sz="8" w:space="0" w:color="000000"/>
+          <w:bottom w:val="single" w:sz="8" w:space="0" w:color="000000"/>
+          <w:right w:val="single" w:sz="8" w:space="0" w:color="000000"/>
+          <w:insideH w:val="single" w:sz="8" w:space="0" w:color="000000"/>
+          <w:insideV w:val="single" w:sz="8" w:space="0" w:color="000000"/>
+        </w:tblBorders>
+        <w:tblLayout w:type="fixed"/>
+        <w:tblLook w:val="0600" w:firstRow="0" w:lastRow="0" w:firstColumn="0" w:lastColumn="0" w:noHBand="1" w:noVBand="1"/>
+      </w:tblPr>
+      <w:tblGrid>
+        <w:gridCol w:w="2085"/>
+        <w:gridCol w:w="6915"/>
+      </w:tblGrid>
+      <w:tr>
+        <w:tc>
+          <w:tcPr>
+            <w:tcW w:w="2085" w:type="dxa"/>
+            <w:tcBorders>
+              <w:top w:val="single" w:sz="8" w:space="0" w:color="000000"/>
+              <w:left w:val="single" w:sz="8" w:space="0" w:color="000000"/>
+              <w:bottom w:val="single" w:sz="8" w:space="0" w:color="000000"/>
+              <w:right w:val="single" w:sz="8" w:space="0" w:color="000000"/>
+            </w:tcBorders>
+            <w:tcMar>
+              <w:top w:w="100" w:type="dxa"/>
+              <w:left w:w="100" w:type="dxa"/>
+              <w:bottom w:w="100" w:type="dxa"/>
+              <w:right w:w="100" w:type="dxa"/>
+            </w:tcMar>
+            <w:hideMark/>
+          </w:tcPr>
+          <w:p>
+            <w:pPr>
+              <w:rPr>
+                <w:sz w:val="24"/>
+                <w:szCs w:val="24"/>
+                <w:lang w:val="en-IE"/>
+              </w:rPr>
+            </w:pPr>
+            <w:r>
+              <w:rPr>
+                <w:sz w:val="24"/>
+                <w:szCs w:val="24"/>
+                <w:lang w:val="en-IE"/>
+              </w:rPr>
+              <w:t>Title (goal)</w:t>
+            </w:r>
+          </w:p>
+        </w:tc>
+        <w:tc>
+          <w:tcPr>
+            <w:tcW w:w="6915" w:type="dxa"/>
+            <w:tcBorders>
+              <w:top w:val="single" w:sz="8" w:space="0" w:color="000000"/>
+              <w:left w:val="single" w:sz="8" w:space="0" w:color="000000"/>
+              <w:bottom w:val="single" w:sz="8" w:space="0" w:color="000000"/>
+              <w:right w:val="single" w:sz="8" w:space="0" w:color="000000"/>
+            </w:tcBorders>
+            <w:tcMar>
+              <w:top w:w="100" w:type="dxa"/>
+              <w:left w:w="100" w:type="dxa"/>
+              <w:bottom w:w="100" w:type="dxa"/>
+              <w:right w:w="100" w:type="dxa"/>
+            </w:tcMar>
+            <w:hideMark/>
+          </w:tcPr>
+          <w:p>
+            <w:pPr>
+              <w:rPr>
+                <w:sz w:val="24"/>
+                <w:szCs w:val="24"/>
+                <w:lang w:val="en-IE"/>
+              </w:rPr>
+            </w:pPr>
+            <w:r>
+              <w:rPr>
+                <w:sz w:val="24"/>
+                <w:szCs w:val="24"/>
+                <w:lang w:val="en-IE"/>
+              </w:rPr>
+              <w:t>Move</w:t>
+            </w:r>
+            <w:r>
+              <w:rPr>
+                <w:sz w:val="24"/>
+                <w:szCs w:val="24"/>
+                <w:lang w:val="en-IE"/>
+              </w:rPr>
+              <w:t xml:space="preserve"> video/audio.</w:t>
+            </w:r>
+          </w:p>
+        </w:tc>
+      </w:tr>
+      <w:tr>
+        <w:tc>
+          <w:tcPr>
+            <w:tcW w:w="2085" w:type="dxa"/>
+            <w:tcBorders>
+              <w:top w:val="single" w:sz="8" w:space="0" w:color="000000"/>
+              <w:left w:val="single" w:sz="8" w:space="0" w:color="000000"/>
+              <w:bottom w:val="single" w:sz="8" w:space="0" w:color="000000"/>
+              <w:right w:val="single" w:sz="8" w:space="0" w:color="000000"/>
+            </w:tcBorders>
+            <w:tcMar>
+              <w:top w:w="100" w:type="dxa"/>
+              <w:left w:w="100" w:type="dxa"/>
+              <w:bottom w:w="100" w:type="dxa"/>
+              <w:right w:w="100" w:type="dxa"/>
+            </w:tcMar>
+            <w:hideMark/>
+          </w:tcPr>
+          <w:p>
+            <w:pPr>
+              <w:rPr>
+                <w:sz w:val="24"/>
+                <w:szCs w:val="24"/>
+                <w:lang w:val="en-IE"/>
+              </w:rPr>
+            </w:pPr>
+            <w:r>
+              <w:rPr>
+                <w:sz w:val="24"/>
+                <w:szCs w:val="24"/>
+                <w:lang w:val="en-IE"/>
+              </w:rPr>
+              <w:t>Primary Actor</w:t>
+            </w:r>
+          </w:p>
+        </w:tc>
+        <w:tc>
+          <w:tcPr>
+            <w:tcW w:w="6915" w:type="dxa"/>
+            <w:tcBorders>
+              <w:top w:val="single" w:sz="8" w:space="0" w:color="000000"/>
+              <w:left w:val="single" w:sz="8" w:space="0" w:color="000000"/>
+              <w:bottom w:val="single" w:sz="8" w:space="0" w:color="000000"/>
+              <w:right w:val="single" w:sz="8" w:space="0" w:color="000000"/>
+            </w:tcBorders>
+            <w:tcMar>
+              <w:top w:w="100" w:type="dxa"/>
+              <w:left w:w="100" w:type="dxa"/>
+              <w:bottom w:w="100" w:type="dxa"/>
+              <w:right w:w="100" w:type="dxa"/>
+            </w:tcMar>
+            <w:hideMark/>
+          </w:tcPr>
+          <w:p>
+            <w:pPr>
+              <w:rPr>
+                <w:sz w:val="24"/>
+                <w:szCs w:val="24"/>
+                <w:lang w:val="en-IE"/>
+              </w:rPr>
+            </w:pPr>
+            <w:r>
+              <w:rPr>
+                <w:sz w:val="24"/>
+                <w:szCs w:val="24"/>
+                <w:lang w:val="en-IE"/>
+              </w:rPr>
+              <w:t>User</w:t>
+            </w:r>
+          </w:p>
+        </w:tc>
+      </w:tr>
+      <w:tr>
+        <w:tc>
+          <w:tcPr>
+            <w:tcW w:w="2085" w:type="dxa"/>
+            <w:tcBorders>
+              <w:top w:val="single" w:sz="8" w:space="0" w:color="000000"/>
+              <w:left w:val="single" w:sz="8" w:space="0" w:color="000000"/>
+              <w:bottom w:val="single" w:sz="8" w:space="0" w:color="000000"/>
+              <w:right w:val="single" w:sz="8" w:space="0" w:color="000000"/>
+            </w:tcBorders>
+            <w:tcMar>
+              <w:top w:w="100" w:type="dxa"/>
+              <w:left w:w="100" w:type="dxa"/>
+              <w:bottom w:w="100" w:type="dxa"/>
+              <w:right w:w="100" w:type="dxa"/>
+            </w:tcMar>
+            <w:hideMark/>
+          </w:tcPr>
+          <w:p>
+            <w:pPr>
+              <w:rPr>
+                <w:sz w:val="24"/>
+                <w:szCs w:val="24"/>
+                <w:lang w:val="en-IE"/>
+              </w:rPr>
+            </w:pPr>
+            <w:r>
+              <w:rPr>
+                <w:sz w:val="24"/>
+                <w:szCs w:val="24"/>
+                <w:lang w:val="en-IE"/>
+              </w:rPr>
+              <w:t>Story</w:t>
+            </w:r>
+          </w:p>
+        </w:tc>
+        <w:tc>
+          <w:tcPr>
+            <w:tcW w:w="6915" w:type="dxa"/>
+            <w:tcBorders>
+              <w:top w:val="single" w:sz="8" w:space="0" w:color="000000"/>
+              <w:left w:val="single" w:sz="8" w:space="0" w:color="000000"/>
+              <w:bottom w:val="single" w:sz="8" w:space="0" w:color="000000"/>
+              <w:right w:val="single" w:sz="8" w:space="0" w:color="000000"/>
+            </w:tcBorders>
+            <w:tcMar>
+              <w:top w:w="100" w:type="dxa"/>
+              <w:left w:w="100" w:type="dxa"/>
+              <w:bottom w:w="100" w:type="dxa"/>
+              <w:right w:w="100" w:type="dxa"/>
+            </w:tcMar>
+            <w:hideMark/>
+          </w:tcPr>
+          <w:p>
+            <w:pPr>
+              <w:rPr>
+                <w:sz w:val="24"/>
+                <w:szCs w:val="24"/>
+                <w:lang w:val="en-IE"/>
+              </w:rPr>
+            </w:pPr>
+            <w:r>
+              <w:rPr>
+                <w:sz w:val="24"/>
+                <w:szCs w:val="24"/>
+                <w:lang w:val="en-IE"/>
+              </w:rPr>
+              <w:t xml:space="preserve">The user wants to </w:t>
+            </w:r>
+            <w:r>
+              <w:rPr>
+                <w:sz w:val="24"/>
+                <w:szCs w:val="24"/>
+                <w:lang w:val="en-IE"/>
+              </w:rPr>
+              <w:t>move</w:t>
+            </w:r>
+            <w:r>
+              <w:rPr>
+                <w:sz w:val="24"/>
+                <w:szCs w:val="24"/>
+                <w:lang w:val="en-IE"/>
+              </w:rPr>
+              <w:t xml:space="preserve"> a specific length of the video</w:t>
+            </w:r>
+            <w:r>
+              <w:rPr>
+                <w:sz w:val="24"/>
+                <w:szCs w:val="24"/>
+                <w:lang w:val="en-IE"/>
+              </w:rPr>
+              <w:t xml:space="preserve"> at start/end or any position on the timeline</w:t>
+            </w:r>
+            <w:r>
+              <w:rPr>
+                <w:sz w:val="24"/>
+                <w:szCs w:val="24"/>
+                <w:lang w:val="en-IE"/>
+              </w:rPr>
+              <w:t xml:space="preserve">. A selected segment would be </w:t>
+            </w:r>
+            <w:r>
+              <w:rPr>
+                <w:sz w:val="24"/>
+                <w:szCs w:val="24"/>
+                <w:lang w:val="en-IE"/>
+              </w:rPr>
+              <w:t>moved</w:t>
+            </w:r>
+            <w:r>
+              <w:rPr>
+                <w:sz w:val="24"/>
+                <w:szCs w:val="24"/>
+                <w:lang w:val="en-IE"/>
+              </w:rPr>
+              <w:t xml:space="preserve"> </w:t>
+            </w:r>
+            <w:r>
+              <w:rPr>
+                <w:sz w:val="24"/>
+                <w:szCs w:val="24"/>
+                <w:lang w:val="en-IE"/>
+              </w:rPr>
+              <w:t>with use of drag-&amp;-drop functionality</w:t>
+            </w:r>
+            <w:r>
+              <w:rPr>
+                <w:sz w:val="24"/>
+                <w:szCs w:val="24"/>
+                <w:lang w:val="en-IE"/>
+              </w:rPr>
+              <w:t xml:space="preserve">. (e.g. a video with 1 minute length has been imported, and the user wants to </w:t>
+            </w:r>
+            <w:r>
+              <w:rPr>
+                <w:sz w:val="24"/>
+                <w:szCs w:val="24"/>
+                <w:lang w:val="en-IE"/>
+              </w:rPr>
+              <w:t>move</w:t>
+            </w:r>
+            <w:r>
+              <w:rPr>
+                <w:sz w:val="24"/>
+                <w:szCs w:val="24"/>
+                <w:lang w:val="en-IE"/>
+              </w:rPr>
+              <w:t xml:space="preserve"> the last 10 seconds of the video</w:t>
+            </w:r>
+            <w:r>
+              <w:rPr>
+                <w:sz w:val="24"/>
+                <w:szCs w:val="24"/>
+                <w:lang w:val="en-IE"/>
+              </w:rPr>
+              <w:t xml:space="preserve"> at the start</w:t>
+            </w:r>
+            <w:r>
+              <w:rPr>
+                <w:sz w:val="24"/>
+                <w:szCs w:val="24"/>
+                <w:lang w:val="en-IE"/>
+              </w:rPr>
+              <w:t>, it would result from 2 segments</w:t>
+            </w:r>
+            <w:r>
+              <w:rPr>
+                <w:sz w:val="24"/>
+                <w:szCs w:val="24"/>
+                <w:lang w:val="en-IE"/>
+              </w:rPr>
+              <w:t xml:space="preserve"> after the split</w:t>
+            </w:r>
+            <w:r>
+              <w:rPr>
+                <w:sz w:val="24"/>
+                <w:szCs w:val="24"/>
+                <w:lang w:val="en-IE"/>
+              </w:rPr>
+              <w:t xml:space="preserve">, in segment </w:t>
+            </w:r>
+            <w:r>
+              <w:rPr>
+                <w:sz w:val="24"/>
+                <w:szCs w:val="24"/>
+                <w:lang w:val="en-IE"/>
+              </w:rPr>
+              <w:t xml:space="preserve">nr. 2 </w:t>
+            </w:r>
+            <w:r>
+              <w:rPr>
+                <w:sz w:val="24"/>
+                <w:szCs w:val="24"/>
+                <w:lang w:val="en-IE"/>
+              </w:rPr>
+              <w:t xml:space="preserve">with length of </w:t>
+            </w:r>
+            <w:r>
+              <w:rPr>
+                <w:sz w:val="24"/>
+                <w:szCs w:val="24"/>
+                <w:lang w:val="en-IE"/>
+              </w:rPr>
+              <w:t>1</w:t>
+            </w:r>
+            <w:r>
+              <w:rPr>
+                <w:sz w:val="24"/>
+                <w:szCs w:val="24"/>
+                <w:lang w:val="en-IE"/>
+              </w:rPr>
+              <w:t xml:space="preserve">0 seconds </w:t>
+            </w:r>
+            <w:r>
+              <w:rPr>
+                <w:sz w:val="24"/>
+                <w:szCs w:val="24"/>
+                <w:lang w:val="en-IE"/>
+              </w:rPr>
+              <w:t>and segment nr. 1 with 50 seconds length</w:t>
+            </w:r>
+            <w:r>
+              <w:rPr>
+                <w:sz w:val="24"/>
+                <w:szCs w:val="24"/>
+                <w:lang w:val="en-IE"/>
+              </w:rPr>
+              <w:t>).</w:t>
+            </w:r>
+          </w:p>
+        </w:tc>
+      </w:tr>
+    </w:tbl>
+    <w:p>
+      <w:pPr>
+        <w:rPr>
+          <w:sz w:val="24"/>
+          <w:szCs w:val="24"/>
+          <w:lang w:val="en-IE"/>
+        </w:rPr>
+      </w:pPr>
+    </w:p>
+    <w:tbl>
+      <w:tblPr>
+        <w:tblW w:w="9000" w:type="dxa"/>
+        <w:tblInd w:w="100" w:type="dxa"/>
+        <w:tblBorders>
+          <w:top w:val="single" w:sz="8" w:space="0" w:color="000000"/>
+          <w:left w:val="single" w:sz="8" w:space="0" w:color="000000"/>
+          <w:bottom w:val="single" w:sz="8" w:space="0" w:color="000000"/>
+          <w:right w:val="single" w:sz="8" w:space="0" w:color="000000"/>
+          <w:insideH w:val="single" w:sz="8" w:space="0" w:color="000000"/>
+          <w:insideV w:val="single" w:sz="8" w:space="0" w:color="000000"/>
+        </w:tblBorders>
+        <w:tblLayout w:type="fixed"/>
+        <w:tblLook w:val="0600" w:firstRow="0" w:lastRow="0" w:firstColumn="0" w:lastColumn="0" w:noHBand="1" w:noVBand="1"/>
+      </w:tblPr>
+      <w:tblGrid>
+        <w:gridCol w:w="2085"/>
+        <w:gridCol w:w="6915"/>
+      </w:tblGrid>
+      <w:tr>
+        <w:tc>
+          <w:tcPr>
+            <w:tcW w:w="2085" w:type="dxa"/>
+            <w:tcBorders>
+              <w:top w:val="single" w:sz="8" w:space="0" w:color="000000"/>
+              <w:left w:val="single" w:sz="8" w:space="0" w:color="000000"/>
+              <w:bottom w:val="single" w:sz="8" w:space="0" w:color="000000"/>
+              <w:right w:val="single" w:sz="8" w:space="0" w:color="000000"/>
+            </w:tcBorders>
+            <w:tcMar>
+              <w:top w:w="100" w:type="dxa"/>
+              <w:left w:w="100" w:type="dxa"/>
+              <w:bottom w:w="100" w:type="dxa"/>
+              <w:right w:w="100" w:type="dxa"/>
+            </w:tcMar>
+            <w:hideMark/>
+          </w:tcPr>
+          <w:p>
+            <w:pPr>
+              <w:rPr>
+                <w:sz w:val="24"/>
+                <w:szCs w:val="24"/>
+                <w:lang w:val="en-IE"/>
+              </w:rPr>
+            </w:pPr>
+            <w:r>
+              <w:rPr>
+                <w:sz w:val="24"/>
+                <w:szCs w:val="24"/>
+                <w:lang w:val="en-IE"/>
+              </w:rPr>
+              <w:lastRenderedPageBreak/>
+              <w:t>Title (goal)</w:t>
+            </w:r>
+          </w:p>
+        </w:tc>
+        <w:tc>
+          <w:tcPr>
+            <w:tcW w:w="6915" w:type="dxa"/>
+            <w:tcBorders>
+              <w:top w:val="single" w:sz="8" w:space="0" w:color="000000"/>
+              <w:left w:val="single" w:sz="8" w:space="0" w:color="000000"/>
+              <w:bottom w:val="single" w:sz="8" w:space="0" w:color="000000"/>
+              <w:right w:val="single" w:sz="8" w:space="0" w:color="000000"/>
+            </w:tcBorders>
+            <w:tcMar>
+              <w:top w:w="100" w:type="dxa"/>
+              <w:left w:w="100" w:type="dxa"/>
+              <w:bottom w:w="100" w:type="dxa"/>
+              <w:right w:w="100" w:type="dxa"/>
+            </w:tcMar>
+            <w:hideMark/>
+          </w:tcPr>
+          <w:p>
+            <w:pPr>
+              <w:rPr>
+                <w:sz w:val="24"/>
+                <w:szCs w:val="24"/>
+                <w:lang w:val="en-IE"/>
+              </w:rPr>
+            </w:pPr>
+            <w:r>
+              <w:rPr>
+                <w:sz w:val="24"/>
+                <w:szCs w:val="24"/>
+                <w:lang w:val="en-IE"/>
+              </w:rPr>
+              <w:t>Preview the video based on time-line structure</w:t>
+            </w:r>
+          </w:p>
+        </w:tc>
+      </w:tr>
+      <w:tr>
+        <w:tc>
+          <w:tcPr>
+            <w:tcW w:w="2085" w:type="dxa"/>
+            <w:tcBorders>
+              <w:top w:val="single" w:sz="8" w:space="0" w:color="000000"/>
+              <w:left w:val="single" w:sz="8" w:space="0" w:color="000000"/>
+              <w:bottom w:val="single" w:sz="8" w:space="0" w:color="000000"/>
+              <w:right w:val="single" w:sz="8" w:space="0" w:color="000000"/>
+            </w:tcBorders>
+            <w:tcMar>
+              <w:top w:w="100" w:type="dxa"/>
+              <w:left w:w="100" w:type="dxa"/>
+              <w:bottom w:w="100" w:type="dxa"/>
+              <w:right w:w="100" w:type="dxa"/>
+            </w:tcMar>
+            <w:hideMark/>
+          </w:tcPr>
+          <w:p>
+            <w:pPr>
+              <w:rPr>
+                <w:sz w:val="24"/>
+                <w:szCs w:val="24"/>
+                <w:lang w:val="en-IE"/>
+              </w:rPr>
+            </w:pPr>
+            <w:r>
+              <w:rPr>
+                <w:sz w:val="24"/>
+                <w:szCs w:val="24"/>
+                <w:lang w:val="en-IE"/>
+              </w:rPr>
+              <w:t>Primary Actor</w:t>
+            </w:r>
+          </w:p>
+        </w:tc>
+        <w:tc>
+          <w:tcPr>
+            <w:tcW w:w="6915" w:type="dxa"/>
+            <w:tcBorders>
+              <w:top w:val="single" w:sz="8" w:space="0" w:color="000000"/>
+              <w:left w:val="single" w:sz="8" w:space="0" w:color="000000"/>
+              <w:bottom w:val="single" w:sz="8" w:space="0" w:color="000000"/>
+              <w:right w:val="single" w:sz="8" w:space="0" w:color="000000"/>
+            </w:tcBorders>
+            <w:tcMar>
+              <w:top w:w="100" w:type="dxa"/>
+              <w:left w:w="100" w:type="dxa"/>
+              <w:bottom w:w="100" w:type="dxa"/>
+              <w:right w:w="100" w:type="dxa"/>
+            </w:tcMar>
+            <w:hideMark/>
+          </w:tcPr>
+          <w:p>
+            <w:pPr>
+              <w:rPr>
+                <w:sz w:val="24"/>
+                <w:szCs w:val="24"/>
+                <w:lang w:val="en-IE"/>
+              </w:rPr>
+            </w:pPr>
+            <w:r>
+              <w:rPr>
+                <w:sz w:val="24"/>
+                <w:szCs w:val="24"/>
+                <w:lang w:val="en-IE"/>
+              </w:rPr>
+              <w:t>User</w:t>
+            </w:r>
+          </w:p>
+        </w:tc>
+      </w:tr>
+      <w:tr>
+        <w:tc>
+          <w:tcPr>
+            <w:tcW w:w="2085" w:type="dxa"/>
+            <w:tcBorders>
+              <w:top w:val="single" w:sz="8" w:space="0" w:color="000000"/>
+              <w:left w:val="single" w:sz="8" w:space="0" w:color="000000"/>
+              <w:bottom w:val="single" w:sz="8" w:space="0" w:color="000000"/>
+              <w:right w:val="single" w:sz="8" w:space="0" w:color="000000"/>
+            </w:tcBorders>
+            <w:tcMar>
+              <w:top w:w="100" w:type="dxa"/>
+              <w:left w:w="100" w:type="dxa"/>
+              <w:bottom w:w="100" w:type="dxa"/>
+              <w:right w:w="100" w:type="dxa"/>
+            </w:tcMar>
+            <w:hideMark/>
+          </w:tcPr>
+          <w:p>
+            <w:pPr>
+              <w:rPr>
+                <w:sz w:val="24"/>
+                <w:szCs w:val="24"/>
+                <w:lang w:val="en-IE"/>
+              </w:rPr>
+            </w:pPr>
+            <w:r>
+              <w:rPr>
+                <w:sz w:val="24"/>
+                <w:szCs w:val="24"/>
+                <w:lang w:val="en-IE"/>
+              </w:rPr>
+              <w:t>Story</w:t>
+            </w:r>
+          </w:p>
+        </w:tc>
+        <w:tc>
+          <w:tcPr>
+            <w:tcW w:w="6915" w:type="dxa"/>
+            <w:tcBorders>
+              <w:top w:val="single" w:sz="8" w:space="0" w:color="000000"/>
+              <w:left w:val="single" w:sz="8" w:space="0" w:color="000000"/>
+              <w:bottom w:val="single" w:sz="8" w:space="0" w:color="000000"/>
+              <w:right w:val="single" w:sz="8" w:space="0" w:color="000000"/>
+            </w:tcBorders>
+            <w:tcMar>
+              <w:top w:w="100" w:type="dxa"/>
+              <w:left w:w="100" w:type="dxa"/>
+              <w:bottom w:w="100" w:type="dxa"/>
+              <w:right w:w="100" w:type="dxa"/>
+            </w:tcMar>
+            <w:hideMark/>
+          </w:tcPr>
+          <w:p>
+            <w:pPr>
+              <w:rPr>
+                <w:sz w:val="24"/>
+                <w:szCs w:val="24"/>
+                <w:lang w:val="en-IE"/>
+              </w:rPr>
+            </w:pPr>
+            <w:r>
+              <w:rPr>
+                <w:sz w:val="24"/>
+                <w:szCs w:val="24"/>
+                <w:lang w:val="en-IE"/>
+              </w:rPr>
+              <w:t>The user wants to see the changes he/she made to the clip, providing with a fast preview before processing the changes</w:t>
+            </w:r>
+            <w:r>
+              <w:rPr>
+                <w:sz w:val="24"/>
+                <w:szCs w:val="24"/>
+                <w:lang w:val="en-IE"/>
+              </w:rPr>
+              <w:t xml:space="preserve"> into a final media file</w:t>
+            </w:r>
+            <w:r>
+              <w:rPr>
+                <w:sz w:val="24"/>
+                <w:szCs w:val="24"/>
+                <w:lang w:val="en-IE"/>
+              </w:rPr>
+              <w:t xml:space="preserve"> based on all split/remove/move operations made.</w:t>
+            </w:r>
+          </w:p>
+        </w:tc>
+      </w:tr>
+    </w:tbl>
+    <w:p>
+      <w:pPr>
+        <w:jc w:val="center"/>
+        <w:rPr>
+          <w:sz w:val="24"/>
+          <w:szCs w:val="24"/>
+          <w:lang w:val="en-IE"/>
+        </w:rPr>
+      </w:pPr>
+    </w:p>
+    <w:tbl>
+      <w:tblPr>
+        <w:tblW w:w="9000" w:type="dxa"/>
+        <w:tblInd w:w="100" w:type="dxa"/>
+        <w:tblBorders>
+          <w:top w:val="single" w:sz="8" w:space="0" w:color="000000"/>
+          <w:left w:val="single" w:sz="8" w:space="0" w:color="000000"/>
+          <w:bottom w:val="single" w:sz="8" w:space="0" w:color="000000"/>
+          <w:right w:val="single" w:sz="8" w:space="0" w:color="000000"/>
+          <w:insideH w:val="single" w:sz="8" w:space="0" w:color="000000"/>
+          <w:insideV w:val="single" w:sz="8" w:space="0" w:color="000000"/>
+        </w:tblBorders>
+        <w:tblLayout w:type="fixed"/>
+        <w:tblLook w:val="0600" w:firstRow="0" w:lastRow="0" w:firstColumn="0" w:lastColumn="0" w:noHBand="1" w:noVBand="1"/>
+      </w:tblPr>
+      <w:tblGrid>
+        <w:gridCol w:w="2085"/>
+        <w:gridCol w:w="6915"/>
+      </w:tblGrid>
+      <w:tr>
+        <w:tc>
+          <w:tcPr>
+            <w:tcW w:w="2085" w:type="dxa"/>
+            <w:tcBorders>
+              <w:top w:val="single" w:sz="8" w:space="0" w:color="000000"/>
+              <w:left w:val="single" w:sz="8" w:space="0" w:color="000000"/>
+              <w:bottom w:val="single" w:sz="8" w:space="0" w:color="000000"/>
+              <w:right w:val="single" w:sz="8" w:space="0" w:color="000000"/>
+            </w:tcBorders>
+            <w:tcMar>
+              <w:top w:w="100" w:type="dxa"/>
+              <w:left w:w="100" w:type="dxa"/>
+              <w:bottom w:w="100" w:type="dxa"/>
+              <w:right w:w="100" w:type="dxa"/>
+            </w:tcMar>
+            <w:hideMark/>
+          </w:tcPr>
+          <w:p>
+            <w:pPr>
+              <w:rPr>
+                <w:sz w:val="24"/>
+                <w:szCs w:val="24"/>
+                <w:lang w:val="en-IE"/>
+              </w:rPr>
+            </w:pPr>
+            <w:r>
+              <w:rPr>
+                <w:sz w:val="24"/>
+                <w:szCs w:val="24"/>
+                <w:lang w:val="en-IE"/>
+              </w:rPr>
+              <w:t>Title (goal)</w:t>
+            </w:r>
+          </w:p>
+        </w:tc>
+        <w:tc>
+          <w:tcPr>
+            <w:tcW w:w="6915" w:type="dxa"/>
+            <w:tcBorders>
+              <w:top w:val="single" w:sz="8" w:space="0" w:color="000000"/>
+              <w:left w:val="single" w:sz="8" w:space="0" w:color="000000"/>
+              <w:bottom w:val="single" w:sz="8" w:space="0" w:color="000000"/>
+              <w:right w:val="single" w:sz="8" w:space="0" w:color="000000"/>
+            </w:tcBorders>
+            <w:tcMar>
+              <w:top w:w="100" w:type="dxa"/>
+              <w:left w:w="100" w:type="dxa"/>
+              <w:bottom w:w="100" w:type="dxa"/>
+              <w:right w:w="100" w:type="dxa"/>
+            </w:tcMar>
+            <w:hideMark/>
+          </w:tcPr>
+          <w:p>
+            <w:pPr>
+              <w:rPr>
+                <w:sz w:val="24"/>
+                <w:szCs w:val="24"/>
+                <w:lang w:val="en-IE"/>
+              </w:rPr>
+            </w:pPr>
+            <w:r>
+              <w:rPr>
+                <w:sz w:val="24"/>
+                <w:szCs w:val="24"/>
+                <w:lang w:val="en-IE"/>
+              </w:rPr>
+              <w:t>Play preview.</w:t>
+            </w:r>
+          </w:p>
+        </w:tc>
+      </w:tr>
+      <w:tr>
+        <w:tc>
+          <w:tcPr>
+            <w:tcW w:w="2085" w:type="dxa"/>
+            <w:tcBorders>
+              <w:top w:val="single" w:sz="8" w:space="0" w:color="000000"/>
+              <w:left w:val="single" w:sz="8" w:space="0" w:color="000000"/>
+              <w:bottom w:val="single" w:sz="8" w:space="0" w:color="000000"/>
+              <w:right w:val="single" w:sz="8" w:space="0" w:color="000000"/>
+            </w:tcBorders>
+            <w:tcMar>
+              <w:top w:w="100" w:type="dxa"/>
+              <w:left w:w="100" w:type="dxa"/>
+              <w:bottom w:w="100" w:type="dxa"/>
+              <w:right w:w="100" w:type="dxa"/>
+            </w:tcMar>
+            <w:hideMark/>
+          </w:tcPr>
+          <w:p>
+            <w:pPr>
+              <w:rPr>
+                <w:sz w:val="24"/>
+                <w:szCs w:val="24"/>
+                <w:lang w:val="en-IE"/>
+              </w:rPr>
+            </w:pPr>
+            <w:r>
+              <w:rPr>
+                <w:sz w:val="24"/>
+                <w:szCs w:val="24"/>
+                <w:lang w:val="en-IE"/>
+              </w:rPr>
+              <w:t>Primary Actor</w:t>
+            </w:r>
+          </w:p>
+        </w:tc>
+        <w:tc>
+          <w:tcPr>
+            <w:tcW w:w="6915" w:type="dxa"/>
+            <w:tcBorders>
+              <w:top w:val="single" w:sz="8" w:space="0" w:color="000000"/>
+              <w:left w:val="single" w:sz="8" w:space="0" w:color="000000"/>
+              <w:bottom w:val="single" w:sz="8" w:space="0" w:color="000000"/>
+              <w:right w:val="single" w:sz="8" w:space="0" w:color="000000"/>
+            </w:tcBorders>
+            <w:tcMar>
+              <w:top w:w="100" w:type="dxa"/>
+              <w:left w:w="100" w:type="dxa"/>
+              <w:bottom w:w="100" w:type="dxa"/>
+              <w:right w:w="100" w:type="dxa"/>
+            </w:tcMar>
+            <w:hideMark/>
+          </w:tcPr>
+          <w:p>
+            <w:pPr>
+              <w:rPr>
+                <w:sz w:val="24"/>
+                <w:szCs w:val="24"/>
+                <w:lang w:val="en-IE"/>
+              </w:rPr>
+            </w:pPr>
+            <w:r>
+              <w:rPr>
+                <w:sz w:val="24"/>
+                <w:szCs w:val="24"/>
+                <w:lang w:val="en-IE"/>
+              </w:rPr>
+              <w:t>User</w:t>
+            </w:r>
+          </w:p>
+        </w:tc>
+      </w:tr>
+      <w:tr>
+        <w:tc>
+          <w:tcPr>
+            <w:tcW w:w="2085" w:type="dxa"/>
+            <w:tcBorders>
+              <w:top w:val="single" w:sz="8" w:space="0" w:color="000000"/>
+              <w:left w:val="single" w:sz="8" w:space="0" w:color="000000"/>
+              <w:bottom w:val="single" w:sz="8" w:space="0" w:color="000000"/>
+              <w:right w:val="single" w:sz="8" w:space="0" w:color="000000"/>
+            </w:tcBorders>
+            <w:tcMar>
+              <w:top w:w="100" w:type="dxa"/>
+              <w:left w:w="100" w:type="dxa"/>
+              <w:bottom w:w="100" w:type="dxa"/>
+              <w:right w:w="100" w:type="dxa"/>
+            </w:tcMar>
+            <w:hideMark/>
+          </w:tcPr>
+          <w:p>
+            <w:pPr>
+              <w:rPr>
+                <w:sz w:val="24"/>
+                <w:szCs w:val="24"/>
+                <w:lang w:val="en-IE"/>
+              </w:rPr>
+            </w:pPr>
+            <w:r>
+              <w:rPr>
+                <w:sz w:val="24"/>
+                <w:szCs w:val="24"/>
+                <w:lang w:val="en-IE"/>
+              </w:rPr>
+              <w:t>Story</w:t>
+            </w:r>
+          </w:p>
+        </w:tc>
+        <w:tc>
+          <w:tcPr>
+            <w:tcW w:w="6915" w:type="dxa"/>
+            <w:tcBorders>
+              <w:top w:val="single" w:sz="8" w:space="0" w:color="000000"/>
+              <w:left w:val="single" w:sz="8" w:space="0" w:color="000000"/>
+              <w:bottom w:val="single" w:sz="8" w:space="0" w:color="000000"/>
+              <w:right w:val="single" w:sz="8" w:space="0" w:color="000000"/>
+            </w:tcBorders>
+            <w:tcMar>
+              <w:top w:w="100" w:type="dxa"/>
+              <w:left w:w="100" w:type="dxa"/>
+              <w:bottom w:w="100" w:type="dxa"/>
+              <w:right w:w="100" w:type="dxa"/>
+            </w:tcMar>
+            <w:hideMark/>
+          </w:tcPr>
+          <w:p>
+            <w:pPr>
+              <w:rPr>
+                <w:sz w:val="24"/>
+                <w:szCs w:val="24"/>
+                <w:lang w:val="en-IE"/>
+              </w:rPr>
+            </w:pPr>
+            <w:r>
+              <w:rPr>
+                <w:sz w:val="24"/>
+                <w:szCs w:val="24"/>
+                <w:lang w:val="en-IE"/>
+              </w:rPr>
+              <w:t xml:space="preserve">The user wants to see the changes he/she made to the clip, </w:t>
+            </w:r>
+            <w:r>
+              <w:rPr>
+                <w:sz w:val="24"/>
+                <w:szCs w:val="24"/>
+                <w:lang w:val="en-IE"/>
+              </w:rPr>
+              <w:t>based on where the timestamp pointer is, the VLC media-player would play the clip from that timestamp.</w:t>
+            </w:r>
+          </w:p>
+        </w:tc>
+      </w:tr>
+    </w:tbl>
+    <w:p>
+      <w:pPr>
+        <w:jc w:val="center"/>
+        <w:rPr>
+          <w:sz w:val="24"/>
+          <w:szCs w:val="24"/>
+          <w:lang w:val="en-IE"/>
+        </w:rPr>
+      </w:pPr>
+    </w:p>
+    <w:tbl>
+      <w:tblPr>
+        <w:tblW w:w="9000" w:type="dxa"/>
+        <w:tblInd w:w="100" w:type="dxa"/>
+        <w:tblBorders>
+          <w:top w:val="single" w:sz="8" w:space="0" w:color="000000"/>
+          <w:left w:val="single" w:sz="8" w:space="0" w:color="000000"/>
+          <w:bottom w:val="single" w:sz="8" w:space="0" w:color="000000"/>
+          <w:right w:val="single" w:sz="8" w:space="0" w:color="000000"/>
+          <w:insideH w:val="single" w:sz="8" w:space="0" w:color="000000"/>
+          <w:insideV w:val="single" w:sz="8" w:space="0" w:color="000000"/>
+        </w:tblBorders>
+        <w:tblLayout w:type="fixed"/>
+        <w:tblLook w:val="0600" w:firstRow="0" w:lastRow="0" w:firstColumn="0" w:lastColumn="0" w:noHBand="1" w:noVBand="1"/>
+      </w:tblPr>
+      <w:tblGrid>
+        <w:gridCol w:w="2085"/>
+        <w:gridCol w:w="6915"/>
+      </w:tblGrid>
+      <w:tr>
+        <w:tc>
+          <w:tcPr>
+            <w:tcW w:w="2085" w:type="dxa"/>
+            <w:tcBorders>
+              <w:top w:val="single" w:sz="8" w:space="0" w:color="000000"/>
+              <w:left w:val="single" w:sz="8" w:space="0" w:color="000000"/>
+              <w:bottom w:val="single" w:sz="8" w:space="0" w:color="000000"/>
+              <w:right w:val="single" w:sz="8" w:space="0" w:color="000000"/>
+            </w:tcBorders>
+            <w:tcMar>
+              <w:top w:w="100" w:type="dxa"/>
+              <w:left w:w="100" w:type="dxa"/>
+              <w:bottom w:w="100" w:type="dxa"/>
+              <w:right w:w="100" w:type="dxa"/>
+            </w:tcMar>
+            <w:hideMark/>
+          </w:tcPr>
+          <w:p>
+            <w:pPr>
+              <w:rPr>
+                <w:sz w:val="24"/>
+                <w:szCs w:val="24"/>
+                <w:lang w:val="en-IE"/>
+              </w:rPr>
+            </w:pPr>
+            <w:r>
+              <w:rPr>
+                <w:sz w:val="24"/>
+                <w:szCs w:val="24"/>
+                <w:lang w:val="en-IE"/>
+              </w:rPr>
+              <w:t>Title (goal)</w:t>
+            </w:r>
+          </w:p>
+        </w:tc>
+        <w:tc>
+          <w:tcPr>
+            <w:tcW w:w="6915" w:type="dxa"/>
+            <w:tcBorders>
+              <w:top w:val="single" w:sz="8" w:space="0" w:color="000000"/>
+              <w:left w:val="single" w:sz="8" w:space="0" w:color="000000"/>
+              <w:bottom w:val="single" w:sz="8" w:space="0" w:color="000000"/>
+              <w:right w:val="single" w:sz="8" w:space="0" w:color="000000"/>
+            </w:tcBorders>
+            <w:tcMar>
+              <w:top w:w="100" w:type="dxa"/>
+              <w:left w:w="100" w:type="dxa"/>
+              <w:bottom w:w="100" w:type="dxa"/>
+              <w:right w:w="100" w:type="dxa"/>
+            </w:tcMar>
+            <w:hideMark/>
+          </w:tcPr>
+          <w:p>
+            <w:pPr>
+              <w:rPr>
+                <w:sz w:val="24"/>
+                <w:szCs w:val="24"/>
+                <w:lang w:val="en-IE"/>
+              </w:rPr>
+            </w:pPr>
+            <w:r>
+              <w:rPr>
+                <w:sz w:val="24"/>
+                <w:szCs w:val="24"/>
+                <w:lang w:val="en-IE"/>
+              </w:rPr>
+              <w:t>Play preview.</w:t>
+            </w:r>
+          </w:p>
+        </w:tc>
+      </w:tr>
+      <w:tr>
+        <w:tc>
+          <w:tcPr>
+            <w:tcW w:w="2085" w:type="dxa"/>
+            <w:tcBorders>
+              <w:top w:val="single" w:sz="8" w:space="0" w:color="000000"/>
+              <w:left w:val="single" w:sz="8" w:space="0" w:color="000000"/>
+              <w:bottom w:val="single" w:sz="8" w:space="0" w:color="000000"/>
+              <w:right w:val="single" w:sz="8" w:space="0" w:color="000000"/>
+            </w:tcBorders>
+            <w:tcMar>
+              <w:top w:w="100" w:type="dxa"/>
+              <w:left w:w="100" w:type="dxa"/>
+              <w:bottom w:w="100" w:type="dxa"/>
+              <w:right w:w="100" w:type="dxa"/>
+            </w:tcMar>
+            <w:hideMark/>
+          </w:tcPr>
+          <w:p>
+            <w:pPr>
+              <w:rPr>
+                <w:sz w:val="24"/>
+                <w:szCs w:val="24"/>
+                <w:lang w:val="en-IE"/>
+              </w:rPr>
+            </w:pPr>
+            <w:r>
+              <w:rPr>
+                <w:sz w:val="24"/>
+                <w:szCs w:val="24"/>
+                <w:lang w:val="en-IE"/>
+              </w:rPr>
+              <w:t>Primary Actor</w:t>
+            </w:r>
+          </w:p>
+        </w:tc>
+        <w:tc>
+          <w:tcPr>
+            <w:tcW w:w="6915" w:type="dxa"/>
+            <w:tcBorders>
+              <w:top w:val="single" w:sz="8" w:space="0" w:color="000000"/>
+              <w:left w:val="single" w:sz="8" w:space="0" w:color="000000"/>
+              <w:bottom w:val="single" w:sz="8" w:space="0" w:color="000000"/>
+              <w:right w:val="single" w:sz="8" w:space="0" w:color="000000"/>
+            </w:tcBorders>
+            <w:tcMar>
+              <w:top w:w="100" w:type="dxa"/>
+              <w:left w:w="100" w:type="dxa"/>
+              <w:bottom w:w="100" w:type="dxa"/>
+              <w:right w:w="100" w:type="dxa"/>
+            </w:tcMar>
+            <w:hideMark/>
+          </w:tcPr>
+          <w:p>
+            <w:pPr>
+              <w:rPr>
+                <w:sz w:val="24"/>
+                <w:szCs w:val="24"/>
+                <w:lang w:val="en-IE"/>
+              </w:rPr>
+            </w:pPr>
+            <w:r>
+              <w:rPr>
+                <w:sz w:val="24"/>
+                <w:szCs w:val="24"/>
+                <w:lang w:val="en-IE"/>
+              </w:rPr>
+              <w:t>User</w:t>
+            </w:r>
+          </w:p>
+        </w:tc>
+      </w:tr>
+      <w:tr>
+        <w:tc>
+          <w:tcPr>
+            <w:tcW w:w="2085" w:type="dxa"/>
+            <w:tcBorders>
+              <w:top w:val="single" w:sz="8" w:space="0" w:color="000000"/>
+              <w:left w:val="single" w:sz="8" w:space="0" w:color="000000"/>
+              <w:bottom w:val="single" w:sz="8" w:space="0" w:color="000000"/>
+              <w:right w:val="single" w:sz="8" w:space="0" w:color="000000"/>
+            </w:tcBorders>
+            <w:tcMar>
+              <w:top w:w="100" w:type="dxa"/>
+              <w:left w:w="100" w:type="dxa"/>
+              <w:bottom w:w="100" w:type="dxa"/>
+              <w:right w:w="100" w:type="dxa"/>
+            </w:tcMar>
+            <w:hideMark/>
+          </w:tcPr>
+          <w:p>
+            <w:pPr>
+              <w:rPr>
+                <w:sz w:val="24"/>
+                <w:szCs w:val="24"/>
+                <w:lang w:val="en-IE"/>
+              </w:rPr>
+            </w:pPr>
+            <w:r>
+              <w:rPr>
+                <w:sz w:val="24"/>
+                <w:szCs w:val="24"/>
+                <w:lang w:val="en-IE"/>
+              </w:rPr>
+              <w:t>Story</w:t>
+            </w:r>
+          </w:p>
+        </w:tc>
+        <w:tc>
+          <w:tcPr>
+            <w:tcW w:w="6915" w:type="dxa"/>
+            <w:tcBorders>
+              <w:top w:val="single" w:sz="8" w:space="0" w:color="000000"/>
+              <w:left w:val="single" w:sz="8" w:space="0" w:color="000000"/>
+              <w:bottom w:val="single" w:sz="8" w:space="0" w:color="000000"/>
+              <w:right w:val="single" w:sz="8" w:space="0" w:color="000000"/>
+            </w:tcBorders>
+            <w:tcMar>
+              <w:top w:w="100" w:type="dxa"/>
+              <w:left w:w="100" w:type="dxa"/>
+              <w:bottom w:w="100" w:type="dxa"/>
+              <w:right w:w="100" w:type="dxa"/>
+            </w:tcMar>
+            <w:hideMark/>
+          </w:tcPr>
+          <w:p>
+            <w:pPr>
+              <w:rPr>
+                <w:sz w:val="24"/>
+                <w:szCs w:val="24"/>
+                <w:lang w:val="en-IE"/>
+              </w:rPr>
+            </w:pPr>
+            <w:r>
+              <w:rPr>
+                <w:sz w:val="24"/>
+                <w:szCs w:val="24"/>
+                <w:lang w:val="en-IE"/>
+              </w:rPr>
+              <w:t xml:space="preserve">The user wants to see the changes he/she made to the clip, based on where the timestamp pointer is, the </w:t>
+            </w:r>
+            <w:r>
+              <w:rPr>
+                <w:sz w:val="24"/>
+                <w:szCs w:val="24"/>
+                <w:lang w:val="en-IE"/>
+              </w:rPr>
+              <w:t>VLC</w:t>
+            </w:r>
+            <w:r>
+              <w:rPr>
+                <w:sz w:val="24"/>
+                <w:szCs w:val="24"/>
+                <w:lang w:val="en-IE"/>
+              </w:rPr>
+              <w:t xml:space="preserve"> media-player would play the clip from that timestamp.</w:t>
+            </w:r>
+          </w:p>
+        </w:tc>
+      </w:tr>
+    </w:tbl>
+    <w:p>
+      <w:pPr>
+        <w:jc w:val="center"/>
+        <w:rPr>
+          <w:sz w:val="24"/>
+          <w:szCs w:val="24"/>
+          <w:lang w:val="en-IE"/>
+        </w:rPr>
+      </w:pPr>
+    </w:p>
+    <w:tbl>
+      <w:tblPr>
+        <w:tblW w:w="9000" w:type="dxa"/>
+        <w:tblInd w:w="100" w:type="dxa"/>
+        <w:tblBorders>
+          <w:top w:val="single" w:sz="8" w:space="0" w:color="000000"/>
+          <w:left w:val="single" w:sz="8" w:space="0" w:color="000000"/>
+          <w:bottom w:val="single" w:sz="8" w:space="0" w:color="000000"/>
+          <w:right w:val="single" w:sz="8" w:space="0" w:color="000000"/>
+          <w:insideH w:val="single" w:sz="8" w:space="0" w:color="000000"/>
+          <w:insideV w:val="single" w:sz="8" w:space="0" w:color="000000"/>
+        </w:tblBorders>
+        <w:tblLayout w:type="fixed"/>
+        <w:tblLook w:val="0600" w:firstRow="0" w:lastRow="0" w:firstColumn="0" w:lastColumn="0" w:noHBand="1" w:noVBand="1"/>
+      </w:tblPr>
+      <w:tblGrid>
+        <w:gridCol w:w="2085"/>
+        <w:gridCol w:w="6915"/>
+      </w:tblGrid>
+      <w:tr>
+        <w:tc>
+          <w:tcPr>
+            <w:tcW w:w="2085" w:type="dxa"/>
+            <w:tcBorders>
+              <w:top w:val="single" w:sz="8" w:space="0" w:color="000000"/>
+              <w:left w:val="single" w:sz="8" w:space="0" w:color="000000"/>
+              <w:bottom w:val="single" w:sz="8" w:space="0" w:color="000000"/>
+              <w:right w:val="single" w:sz="8" w:space="0" w:color="000000"/>
+            </w:tcBorders>
+            <w:tcMar>
+              <w:top w:w="100" w:type="dxa"/>
+              <w:left w:w="100" w:type="dxa"/>
+              <w:bottom w:w="100" w:type="dxa"/>
+              <w:right w:w="100" w:type="dxa"/>
+            </w:tcMar>
+            <w:hideMark/>
+          </w:tcPr>
+          <w:p>
+            <w:pPr>
+              <w:rPr>
+                <w:sz w:val="24"/>
+                <w:szCs w:val="24"/>
+                <w:lang w:val="en-IE"/>
+              </w:rPr>
+            </w:pPr>
+            <w:r>
+              <w:rPr>
+                <w:sz w:val="24"/>
+                <w:szCs w:val="24"/>
+                <w:lang w:val="en-IE"/>
+              </w:rPr>
+              <w:t>Title (goal)</w:t>
+            </w:r>
+          </w:p>
+        </w:tc>
+        <w:tc>
+          <w:tcPr>
+            <w:tcW w:w="6915" w:type="dxa"/>
+            <w:tcBorders>
+              <w:top w:val="single" w:sz="8" w:space="0" w:color="000000"/>
+              <w:left w:val="single" w:sz="8" w:space="0" w:color="000000"/>
+              <w:bottom w:val="single" w:sz="8" w:space="0" w:color="000000"/>
+              <w:right w:val="single" w:sz="8" w:space="0" w:color="000000"/>
+            </w:tcBorders>
+            <w:tcMar>
+              <w:top w:w="100" w:type="dxa"/>
+              <w:left w:w="100" w:type="dxa"/>
+              <w:bottom w:w="100" w:type="dxa"/>
+              <w:right w:w="100" w:type="dxa"/>
+            </w:tcMar>
+            <w:hideMark/>
+          </w:tcPr>
+          <w:p>
+            <w:pPr>
+              <w:rPr>
+                <w:sz w:val="24"/>
+                <w:szCs w:val="24"/>
+                <w:lang w:val="en-IE"/>
+              </w:rPr>
+            </w:pPr>
+            <w:r>
+              <w:rPr>
+                <w:sz w:val="24"/>
+                <w:szCs w:val="24"/>
+                <w:lang w:val="en-IE"/>
+              </w:rPr>
+              <w:t>P</w:t>
+            </w:r>
+            <w:r>
+              <w:rPr>
+                <w:sz w:val="24"/>
+                <w:szCs w:val="24"/>
+                <w:lang w:val="en-IE"/>
+              </w:rPr>
+              <w:t>ause</w:t>
+            </w:r>
+            <w:r>
+              <w:rPr>
+                <w:sz w:val="24"/>
+                <w:szCs w:val="24"/>
+                <w:lang w:val="en-IE"/>
+              </w:rPr>
+              <w:t xml:space="preserve"> preview.</w:t>
+            </w:r>
+          </w:p>
+        </w:tc>
+      </w:tr>
+      <w:tr>
+        <w:tc>
+          <w:tcPr>
+            <w:tcW w:w="2085" w:type="dxa"/>
+            <w:tcBorders>
+              <w:top w:val="single" w:sz="8" w:space="0" w:color="000000"/>
+              <w:left w:val="single" w:sz="8" w:space="0" w:color="000000"/>
+              <w:bottom w:val="single" w:sz="8" w:space="0" w:color="000000"/>
+              <w:right w:val="single" w:sz="8" w:space="0" w:color="000000"/>
+            </w:tcBorders>
+            <w:tcMar>
+              <w:top w:w="100" w:type="dxa"/>
+              <w:left w:w="100" w:type="dxa"/>
+              <w:bottom w:w="100" w:type="dxa"/>
+              <w:right w:w="100" w:type="dxa"/>
+            </w:tcMar>
+            <w:hideMark/>
+          </w:tcPr>
+          <w:p>
+            <w:pPr>
+              <w:rPr>
+                <w:sz w:val="24"/>
+                <w:szCs w:val="24"/>
+                <w:lang w:val="en-IE"/>
+              </w:rPr>
+            </w:pPr>
+            <w:r>
+              <w:rPr>
+                <w:sz w:val="24"/>
+                <w:szCs w:val="24"/>
+                <w:lang w:val="en-IE"/>
+              </w:rPr>
+              <w:t>Primary Actor</w:t>
+            </w:r>
+          </w:p>
+        </w:tc>
+        <w:tc>
+          <w:tcPr>
+            <w:tcW w:w="6915" w:type="dxa"/>
+            <w:tcBorders>
+              <w:top w:val="single" w:sz="8" w:space="0" w:color="000000"/>
+              <w:left w:val="single" w:sz="8" w:space="0" w:color="000000"/>
+              <w:bottom w:val="single" w:sz="8" w:space="0" w:color="000000"/>
+              <w:right w:val="single" w:sz="8" w:space="0" w:color="000000"/>
+            </w:tcBorders>
+            <w:tcMar>
+              <w:top w:w="100" w:type="dxa"/>
+              <w:left w:w="100" w:type="dxa"/>
+              <w:bottom w:w="100" w:type="dxa"/>
+              <w:right w:w="100" w:type="dxa"/>
+            </w:tcMar>
+            <w:hideMark/>
+          </w:tcPr>
+          <w:p>
+            <w:pPr>
+              <w:rPr>
+                <w:sz w:val="24"/>
+                <w:szCs w:val="24"/>
+                <w:lang w:val="en-IE"/>
+              </w:rPr>
+            </w:pPr>
+            <w:r>
+              <w:rPr>
+                <w:sz w:val="24"/>
+                <w:szCs w:val="24"/>
+                <w:lang w:val="en-IE"/>
+              </w:rPr>
+              <w:t>User</w:t>
+            </w:r>
+          </w:p>
+        </w:tc>
+      </w:tr>
+      <w:tr>
+        <w:tc>
+          <w:tcPr>
+            <w:tcW w:w="2085" w:type="dxa"/>
+            <w:tcBorders>
+              <w:top w:val="single" w:sz="8" w:space="0" w:color="000000"/>
+              <w:left w:val="single" w:sz="8" w:space="0" w:color="000000"/>
+              <w:bottom w:val="single" w:sz="8" w:space="0" w:color="000000"/>
+              <w:right w:val="single" w:sz="8" w:space="0" w:color="000000"/>
+            </w:tcBorders>
+            <w:tcMar>
+              <w:top w:w="100" w:type="dxa"/>
+              <w:left w:w="100" w:type="dxa"/>
+              <w:bottom w:w="100" w:type="dxa"/>
+              <w:right w:w="100" w:type="dxa"/>
+            </w:tcMar>
+            <w:hideMark/>
+          </w:tcPr>
+          <w:p>
+            <w:pPr>
+              <w:rPr>
+                <w:sz w:val="24"/>
+                <w:szCs w:val="24"/>
+                <w:lang w:val="en-IE"/>
+              </w:rPr>
+            </w:pPr>
+            <w:r>
+              <w:rPr>
+                <w:sz w:val="24"/>
+                <w:szCs w:val="24"/>
+                <w:lang w:val="en-IE"/>
+              </w:rPr>
+              <w:t>Story</w:t>
+            </w:r>
+          </w:p>
+        </w:tc>
+        <w:tc>
+          <w:tcPr>
+            <w:tcW w:w="6915" w:type="dxa"/>
+            <w:tcBorders>
+              <w:top w:val="single" w:sz="8" w:space="0" w:color="000000"/>
+              <w:left w:val="single" w:sz="8" w:space="0" w:color="000000"/>
+              <w:bottom w:val="single" w:sz="8" w:space="0" w:color="000000"/>
+              <w:right w:val="single" w:sz="8" w:space="0" w:color="000000"/>
+            </w:tcBorders>
+            <w:tcMar>
+              <w:top w:w="100" w:type="dxa"/>
+              <w:left w:w="100" w:type="dxa"/>
+              <w:bottom w:w="100" w:type="dxa"/>
+              <w:right w:w="100" w:type="dxa"/>
+            </w:tcMar>
+            <w:hideMark/>
+          </w:tcPr>
+          <w:p>
+            <w:pPr>
+              <w:rPr>
+                <w:sz w:val="24"/>
+                <w:szCs w:val="24"/>
+                <w:lang w:val="en-IE"/>
+              </w:rPr>
+            </w:pPr>
+            <w:r>
+              <w:rPr>
+                <w:sz w:val="24"/>
+                <w:szCs w:val="24"/>
+                <w:lang w:val="en-IE"/>
+              </w:rPr>
+              <w:t xml:space="preserve">The user wants to </w:t>
+            </w:r>
+            <w:r>
+              <w:rPr>
+                <w:sz w:val="24"/>
+                <w:szCs w:val="24"/>
+                <w:lang w:val="en-IE"/>
+              </w:rPr>
+              <w:t>pause the preview. Based on where the timestamp pointer is, the VLC-media player would stop the clip at that timestamp.</w:t>
+            </w:r>
+          </w:p>
+        </w:tc>
+      </w:tr>
+    </w:tbl>
+    <w:p>
+      <w:pPr>
+        <w:jc w:val="center"/>
+        <w:rPr>
+          <w:sz w:val="24"/>
+          <w:szCs w:val="24"/>
+          <w:lang w:val="en-IE"/>
+        </w:rPr>
+      </w:pPr>
+    </w:p>
+    <w:tbl>
+      <w:tblPr>
+        <w:tblW w:w="9000" w:type="dxa"/>
+        <w:tblInd w:w="100" w:type="dxa"/>
+        <w:tblBorders>
+          <w:top w:val="single" w:sz="8" w:space="0" w:color="000000"/>
+          <w:left w:val="single" w:sz="8" w:space="0" w:color="000000"/>
+          <w:bottom w:val="single" w:sz="8" w:space="0" w:color="000000"/>
+          <w:right w:val="single" w:sz="8" w:space="0" w:color="000000"/>
+          <w:insideH w:val="single" w:sz="8" w:space="0" w:color="000000"/>
+          <w:insideV w:val="single" w:sz="8" w:space="0" w:color="000000"/>
+        </w:tblBorders>
+        <w:tblLayout w:type="fixed"/>
+        <w:tblLook w:val="0600" w:firstRow="0" w:lastRow="0" w:firstColumn="0" w:lastColumn="0" w:noHBand="1" w:noVBand="1"/>
+      </w:tblPr>
+      <w:tblGrid>
+        <w:gridCol w:w="2085"/>
+        <w:gridCol w:w="6915"/>
+      </w:tblGrid>
+      <w:tr>
+        <w:tc>
+          <w:tcPr>
+            <w:tcW w:w="2085" w:type="dxa"/>
+            <w:tcBorders>
+              <w:top w:val="single" w:sz="8" w:space="0" w:color="000000"/>
+              <w:left w:val="single" w:sz="8" w:space="0" w:color="000000"/>
+              <w:bottom w:val="single" w:sz="8" w:space="0" w:color="000000"/>
+              <w:right w:val="single" w:sz="8" w:space="0" w:color="000000"/>
+            </w:tcBorders>
+            <w:tcMar>
+              <w:top w:w="100" w:type="dxa"/>
+              <w:left w:w="100" w:type="dxa"/>
+              <w:bottom w:w="100" w:type="dxa"/>
+              <w:right w:w="100" w:type="dxa"/>
+            </w:tcMar>
+            <w:hideMark/>
+          </w:tcPr>
+          <w:p>
+            <w:pPr>
+              <w:rPr>
+                <w:sz w:val="24"/>
+                <w:szCs w:val="24"/>
+                <w:lang w:val="en-IE"/>
+              </w:rPr>
+            </w:pPr>
+            <w:r>
+              <w:rPr>
+                <w:sz w:val="24"/>
+                <w:szCs w:val="24"/>
+                <w:lang w:val="en-IE"/>
+              </w:rPr>
+              <w:t>Title (goal)</w:t>
+            </w:r>
+          </w:p>
+        </w:tc>
+        <w:tc>
+          <w:tcPr>
+            <w:tcW w:w="6915" w:type="dxa"/>
+            <w:tcBorders>
+              <w:top w:val="single" w:sz="8" w:space="0" w:color="000000"/>
+              <w:left w:val="single" w:sz="8" w:space="0" w:color="000000"/>
+              <w:bottom w:val="single" w:sz="8" w:space="0" w:color="000000"/>
+              <w:right w:val="single" w:sz="8" w:space="0" w:color="000000"/>
+            </w:tcBorders>
+            <w:tcMar>
+              <w:top w:w="100" w:type="dxa"/>
+              <w:left w:w="100" w:type="dxa"/>
+              <w:bottom w:w="100" w:type="dxa"/>
+              <w:right w:w="100" w:type="dxa"/>
+            </w:tcMar>
+            <w:hideMark/>
+          </w:tcPr>
+          <w:p>
+            <w:pPr>
+              <w:rPr>
+                <w:sz w:val="24"/>
+                <w:szCs w:val="24"/>
+                <w:lang w:val="en-IE"/>
+              </w:rPr>
+            </w:pPr>
+            <w:r>
+              <w:rPr>
+                <w:sz w:val="24"/>
+                <w:szCs w:val="24"/>
+                <w:lang w:val="en-IE"/>
+              </w:rPr>
+              <w:t>Scroll through timeline.</w:t>
+            </w:r>
+          </w:p>
+        </w:tc>
+      </w:tr>
+      <w:tr>
+        <w:tc>
+          <w:tcPr>
+            <w:tcW w:w="2085" w:type="dxa"/>
+            <w:tcBorders>
+              <w:top w:val="single" w:sz="8" w:space="0" w:color="000000"/>
+              <w:left w:val="single" w:sz="8" w:space="0" w:color="000000"/>
+              <w:bottom w:val="single" w:sz="8" w:space="0" w:color="000000"/>
+              <w:right w:val="single" w:sz="8" w:space="0" w:color="000000"/>
+            </w:tcBorders>
+            <w:tcMar>
+              <w:top w:w="100" w:type="dxa"/>
+              <w:left w:w="100" w:type="dxa"/>
+              <w:bottom w:w="100" w:type="dxa"/>
+              <w:right w:w="100" w:type="dxa"/>
+            </w:tcMar>
+            <w:hideMark/>
+          </w:tcPr>
+          <w:p>
+            <w:pPr>
+              <w:rPr>
+                <w:sz w:val="24"/>
+                <w:szCs w:val="24"/>
+                <w:lang w:val="en-IE"/>
+              </w:rPr>
+            </w:pPr>
+            <w:r>
+              <w:rPr>
+                <w:sz w:val="24"/>
+                <w:szCs w:val="24"/>
+                <w:lang w:val="en-IE"/>
+              </w:rPr>
+              <w:t>Primary Actor</w:t>
+            </w:r>
+          </w:p>
+        </w:tc>
+        <w:tc>
+          <w:tcPr>
+            <w:tcW w:w="6915" w:type="dxa"/>
+            <w:tcBorders>
+              <w:top w:val="single" w:sz="8" w:space="0" w:color="000000"/>
+              <w:left w:val="single" w:sz="8" w:space="0" w:color="000000"/>
+              <w:bottom w:val="single" w:sz="8" w:space="0" w:color="000000"/>
+              <w:right w:val="single" w:sz="8" w:space="0" w:color="000000"/>
+            </w:tcBorders>
+            <w:tcMar>
+              <w:top w:w="100" w:type="dxa"/>
+              <w:left w:w="100" w:type="dxa"/>
+              <w:bottom w:w="100" w:type="dxa"/>
+              <w:right w:w="100" w:type="dxa"/>
+            </w:tcMar>
+            <w:hideMark/>
+          </w:tcPr>
+          <w:p>
+            <w:pPr>
+              <w:rPr>
+                <w:sz w:val="24"/>
+                <w:szCs w:val="24"/>
+                <w:lang w:val="en-IE"/>
+              </w:rPr>
+            </w:pPr>
+            <w:r>
+              <w:rPr>
+                <w:sz w:val="24"/>
+                <w:szCs w:val="24"/>
+                <w:lang w:val="en-IE"/>
+              </w:rPr>
+              <w:t>User</w:t>
+            </w:r>
+          </w:p>
+        </w:tc>
+      </w:tr>
+      <w:tr>
+        <w:tc>
+          <w:tcPr>
+            <w:tcW w:w="2085" w:type="dxa"/>
+            <w:tcBorders>
+              <w:top w:val="single" w:sz="8" w:space="0" w:color="000000"/>
+              <w:left w:val="single" w:sz="8" w:space="0" w:color="000000"/>
+              <w:bottom w:val="single" w:sz="8" w:space="0" w:color="000000"/>
+              <w:right w:val="single" w:sz="8" w:space="0" w:color="000000"/>
+            </w:tcBorders>
+            <w:tcMar>
+              <w:top w:w="100" w:type="dxa"/>
+              <w:left w:w="100" w:type="dxa"/>
+              <w:bottom w:w="100" w:type="dxa"/>
+              <w:right w:w="100" w:type="dxa"/>
+            </w:tcMar>
+            <w:hideMark/>
+          </w:tcPr>
+          <w:p>
+            <w:pPr>
+              <w:rPr>
+                <w:sz w:val="24"/>
+                <w:szCs w:val="24"/>
+                <w:lang w:val="en-IE"/>
+              </w:rPr>
+            </w:pPr>
+            <w:r>
+              <w:rPr>
+                <w:sz w:val="24"/>
+                <w:szCs w:val="24"/>
+                <w:lang w:val="en-IE"/>
+              </w:rPr>
+              <w:t>Story</w:t>
+            </w:r>
+          </w:p>
+        </w:tc>
+        <w:tc>
+          <w:tcPr>
+            <w:tcW w:w="6915" w:type="dxa"/>
+            <w:tcBorders>
+              <w:top w:val="single" w:sz="8" w:space="0" w:color="000000"/>
+              <w:left w:val="single" w:sz="8" w:space="0" w:color="000000"/>
+              <w:bottom w:val="single" w:sz="8" w:space="0" w:color="000000"/>
+              <w:right w:val="single" w:sz="8" w:space="0" w:color="000000"/>
+            </w:tcBorders>
+            <w:tcMar>
+              <w:top w:w="100" w:type="dxa"/>
+              <w:left w:w="100" w:type="dxa"/>
+              <w:bottom w:w="100" w:type="dxa"/>
+              <w:right w:w="100" w:type="dxa"/>
+            </w:tcMar>
+            <w:hideMark/>
+          </w:tcPr>
+          <w:p>
+            <w:pPr>
+              <w:rPr>
+                <w:sz w:val="24"/>
+                <w:szCs w:val="24"/>
+                <w:lang w:val="en-IE"/>
+              </w:rPr>
+            </w:pPr>
+            <w:r>
+              <w:rPr>
+                <w:sz w:val="24"/>
+                <w:szCs w:val="24"/>
+                <w:lang w:val="en-IE"/>
+              </w:rPr>
+              <w:t xml:space="preserve">The user wants to find a certain moment from the video/audio (e.g. the part the user wants to remove or apply operations on). </w:t>
+            </w:r>
+          </w:p>
+          <w:p>
+            <w:pPr>
+              <w:rPr>
+                <w:sz w:val="24"/>
+                <w:szCs w:val="24"/>
+                <w:lang w:val="en-IE"/>
+              </w:rPr>
+            </w:pPr>
+            <w:r>
+              <w:rPr>
+                <w:sz w:val="24"/>
+                <w:szCs w:val="24"/>
+                <w:lang w:val="en-IE"/>
+              </w:rPr>
+              <w:t>Using the VLC-media player, it would update it</w:t>
+            </w:r>
+            <w:r>
+              <w:rPr>
+                <w:sz w:val="24"/>
+                <w:szCs w:val="24"/>
+                <w:lang w:val="en-IE"/>
+              </w:rPr>
+              <w:t>s</w:t>
+            </w:r>
+            <w:r>
+              <w:rPr>
+                <w:sz w:val="24"/>
+                <w:szCs w:val="24"/>
+                <w:lang w:val="en-IE"/>
+              </w:rPr>
+              <w:t xml:space="preserve"> timestamp based on where the timestamp pointer is dragged, providing user with fast glance of media file. The media player would update its thumbnail each millisecond when scrolling.</w:t>
+            </w:r>
+          </w:p>
+        </w:tc>
+      </w:tr>
+      <w:tr>
+        <w:tc>
+          <w:tcPr>
+            <w:tcW w:w="2085" w:type="dxa"/>
+            <w:tcBorders>
+              <w:top w:val="single" w:sz="8" w:space="0" w:color="000000"/>
+              <w:left w:val="single" w:sz="8" w:space="0" w:color="000000"/>
+              <w:bottom w:val="single" w:sz="8" w:space="0" w:color="000000"/>
+              <w:right w:val="single" w:sz="8" w:space="0" w:color="000000"/>
+            </w:tcBorders>
+            <w:tcMar>
+              <w:top w:w="100" w:type="dxa"/>
+              <w:left w:w="100" w:type="dxa"/>
+              <w:bottom w:w="100" w:type="dxa"/>
+              <w:right w:w="100" w:type="dxa"/>
+            </w:tcMar>
+            <w:hideMark/>
+          </w:tcPr>
+          <w:p>
+            <w:pPr>
+              <w:rPr>
+                <w:sz w:val="24"/>
+                <w:szCs w:val="24"/>
+                <w:lang w:val="en-IE"/>
+              </w:rPr>
+            </w:pPr>
+            <w:r>
+              <w:rPr>
+                <w:sz w:val="24"/>
+                <w:szCs w:val="24"/>
+                <w:lang w:val="en-IE"/>
+              </w:rPr>
+              <w:lastRenderedPageBreak/>
+              <w:t>Title (goal)</w:t>
+            </w:r>
+          </w:p>
+        </w:tc>
+        <w:tc>
+          <w:tcPr>
+            <w:tcW w:w="6915" w:type="dxa"/>
+            <w:tcBorders>
+              <w:top w:val="single" w:sz="8" w:space="0" w:color="000000"/>
+              <w:left w:val="single" w:sz="8" w:space="0" w:color="000000"/>
+              <w:bottom w:val="single" w:sz="8" w:space="0" w:color="000000"/>
+              <w:right w:val="single" w:sz="8" w:space="0" w:color="000000"/>
+            </w:tcBorders>
+            <w:tcMar>
+              <w:top w:w="100" w:type="dxa"/>
+              <w:left w:w="100" w:type="dxa"/>
+              <w:bottom w:w="100" w:type="dxa"/>
+              <w:right w:w="100" w:type="dxa"/>
+            </w:tcMar>
+            <w:hideMark/>
+          </w:tcPr>
+          <w:p>
+            <w:pPr>
+              <w:rPr>
+                <w:sz w:val="24"/>
+                <w:szCs w:val="24"/>
+                <w:lang w:val="en-IE"/>
+              </w:rPr>
+            </w:pPr>
+            <w:r>
+              <w:rPr>
+                <w:sz w:val="24"/>
+                <w:szCs w:val="24"/>
+                <w:lang w:val="en-IE"/>
+              </w:rPr>
+              <w:t>S</w:t>
+            </w:r>
+            <w:r>
+              <w:rPr>
+                <w:sz w:val="24"/>
+                <w:szCs w:val="24"/>
+                <w:lang w:val="en-IE"/>
+              </w:rPr>
+              <w:t>pecify preview settings</w:t>
+            </w:r>
+          </w:p>
+        </w:tc>
+      </w:tr>
+      <w:tr>
+        <w:tc>
+          <w:tcPr>
+            <w:tcW w:w="2085" w:type="dxa"/>
+            <w:tcBorders>
+              <w:top w:val="single" w:sz="8" w:space="0" w:color="000000"/>
+              <w:left w:val="single" w:sz="8" w:space="0" w:color="000000"/>
+              <w:bottom w:val="single" w:sz="8" w:space="0" w:color="000000"/>
+              <w:right w:val="single" w:sz="8" w:space="0" w:color="000000"/>
+            </w:tcBorders>
+            <w:tcMar>
+              <w:top w:w="100" w:type="dxa"/>
+              <w:left w:w="100" w:type="dxa"/>
+              <w:bottom w:w="100" w:type="dxa"/>
+              <w:right w:w="100" w:type="dxa"/>
+            </w:tcMar>
+            <w:hideMark/>
+          </w:tcPr>
+          <w:p>
+            <w:pPr>
+              <w:rPr>
+                <w:sz w:val="24"/>
+                <w:szCs w:val="24"/>
+                <w:lang w:val="en-IE"/>
+              </w:rPr>
+            </w:pPr>
+            <w:r>
+              <w:rPr>
+                <w:sz w:val="24"/>
+                <w:szCs w:val="24"/>
+                <w:lang w:val="en-IE"/>
+              </w:rPr>
+              <w:t>Primary Actor</w:t>
+            </w:r>
+          </w:p>
+        </w:tc>
+        <w:tc>
+          <w:tcPr>
+            <w:tcW w:w="6915" w:type="dxa"/>
+            <w:tcBorders>
+              <w:top w:val="single" w:sz="8" w:space="0" w:color="000000"/>
+              <w:left w:val="single" w:sz="8" w:space="0" w:color="000000"/>
+              <w:bottom w:val="single" w:sz="8" w:space="0" w:color="000000"/>
+              <w:right w:val="single" w:sz="8" w:space="0" w:color="000000"/>
+            </w:tcBorders>
+            <w:tcMar>
+              <w:top w:w="100" w:type="dxa"/>
+              <w:left w:w="100" w:type="dxa"/>
+              <w:bottom w:w="100" w:type="dxa"/>
+              <w:right w:w="100" w:type="dxa"/>
+            </w:tcMar>
+            <w:hideMark/>
+          </w:tcPr>
+          <w:p>
+            <w:pPr>
+              <w:rPr>
+                <w:sz w:val="24"/>
+                <w:szCs w:val="24"/>
+                <w:lang w:val="en-IE"/>
+              </w:rPr>
+            </w:pPr>
+            <w:r>
+              <w:rPr>
+                <w:sz w:val="24"/>
+                <w:szCs w:val="24"/>
+                <w:lang w:val="en-IE"/>
+              </w:rPr>
+              <w:t>User</w:t>
+            </w:r>
+          </w:p>
+        </w:tc>
+      </w:tr>
+      <w:tr>
+        <w:tc>
+          <w:tcPr>
+            <w:tcW w:w="2085" w:type="dxa"/>
+            <w:tcBorders>
+              <w:top w:val="single" w:sz="8" w:space="0" w:color="000000"/>
+              <w:left w:val="single" w:sz="8" w:space="0" w:color="000000"/>
+              <w:bottom w:val="single" w:sz="8" w:space="0" w:color="000000"/>
+              <w:right w:val="single" w:sz="8" w:space="0" w:color="000000"/>
+            </w:tcBorders>
+            <w:tcMar>
+              <w:top w:w="100" w:type="dxa"/>
+              <w:left w:w="100" w:type="dxa"/>
+              <w:bottom w:w="100" w:type="dxa"/>
+              <w:right w:w="100" w:type="dxa"/>
+            </w:tcMar>
+            <w:hideMark/>
+          </w:tcPr>
+          <w:p>
+            <w:pPr>
+              <w:rPr>
+                <w:sz w:val="24"/>
+                <w:szCs w:val="24"/>
+                <w:lang w:val="en-IE"/>
+              </w:rPr>
+            </w:pPr>
+            <w:r>
+              <w:rPr>
+                <w:sz w:val="24"/>
+                <w:szCs w:val="24"/>
+                <w:lang w:val="en-IE"/>
+              </w:rPr>
+              <w:t>Story</w:t>
+            </w:r>
+          </w:p>
+        </w:tc>
+        <w:tc>
+          <w:tcPr>
+            <w:tcW w:w="6915" w:type="dxa"/>
+            <w:tcBorders>
+              <w:top w:val="single" w:sz="8" w:space="0" w:color="000000"/>
+              <w:left w:val="single" w:sz="8" w:space="0" w:color="000000"/>
+              <w:bottom w:val="single" w:sz="8" w:space="0" w:color="000000"/>
+              <w:right w:val="single" w:sz="8" w:space="0" w:color="000000"/>
+            </w:tcBorders>
+            <w:tcMar>
+              <w:top w:w="100" w:type="dxa"/>
+              <w:left w:w="100" w:type="dxa"/>
+              <w:bottom w:w="100" w:type="dxa"/>
+              <w:right w:w="100" w:type="dxa"/>
+            </w:tcMar>
+            <w:hideMark/>
+          </w:tcPr>
+          <w:p>
+            <w:pPr>
+              <w:rPr>
+                <w:sz w:val="24"/>
+                <w:szCs w:val="24"/>
+                <w:lang w:val="en-IE"/>
+              </w:rPr>
+            </w:pPr>
+            <w:r>
+              <w:rPr>
+                <w:sz w:val="24"/>
+                <w:szCs w:val="24"/>
+                <w:lang w:val="en-IE"/>
+              </w:rPr>
+              <w:t xml:space="preserve">The user wants to </w:t>
+            </w:r>
+            <w:r>
+              <w:rPr>
+                <w:sz w:val="24"/>
+                <w:szCs w:val="24"/>
+                <w:lang w:val="en-IE"/>
+              </w:rPr>
+              <w:t>set specific preview settings in order to visualize the timeline, user would be able to set those and choose the right settings based on their hardware compatibilities, better settings results in more hardware resource usage, less settings results in less hardware resource usage, this directly impact how fast the preview is generated</w:t>
+            </w:r>
+            <w:r>
+              <w:rPr>
+                <w:sz w:val="24"/>
+                <w:szCs w:val="24"/>
+                <w:lang w:val="en-IE"/>
+              </w:rPr>
+              <w:t xml:space="preserve"> after certain changes so it directly depends on hardware the machine holds, therefore providing user with a way to select the best settings for comfortable use.</w:t>
+            </w:r>
+          </w:p>
+        </w:tc>
+      </w:tr>
+    </w:tbl>
+    <w:p>
+      <w:pPr>
+        <w:jc w:val="center"/>
+        <w:rPr>
+          <w:sz w:val="24"/>
+          <w:szCs w:val="24"/>
+          <w:lang w:val="en-IE"/>
+        </w:rPr>
+      </w:pPr>
+    </w:p>
+    <w:tbl>
+      <w:tblPr>
+        <w:tblW w:w="9000" w:type="dxa"/>
+        <w:tblInd w:w="100" w:type="dxa"/>
+        <w:tblBorders>
+          <w:top w:val="single" w:sz="8" w:space="0" w:color="000000"/>
+          <w:left w:val="single" w:sz="8" w:space="0" w:color="000000"/>
+          <w:bottom w:val="single" w:sz="8" w:space="0" w:color="000000"/>
+          <w:right w:val="single" w:sz="8" w:space="0" w:color="000000"/>
+          <w:insideH w:val="single" w:sz="8" w:space="0" w:color="000000"/>
+          <w:insideV w:val="single" w:sz="8" w:space="0" w:color="000000"/>
+        </w:tblBorders>
+        <w:tblLayout w:type="fixed"/>
+        <w:tblLook w:val="0600" w:firstRow="0" w:lastRow="0" w:firstColumn="0" w:lastColumn="0" w:noHBand="1" w:noVBand="1"/>
+      </w:tblPr>
+      <w:tblGrid>
+        <w:gridCol w:w="2085"/>
+        <w:gridCol w:w="6915"/>
+      </w:tblGrid>
+      <w:tr>
+        <w:tc>
+          <w:tcPr>
+            <w:tcW w:w="2085" w:type="dxa"/>
+            <w:tcBorders>
+              <w:top w:val="single" w:sz="8" w:space="0" w:color="000000"/>
+              <w:left w:val="single" w:sz="8" w:space="0" w:color="000000"/>
+              <w:bottom w:val="single" w:sz="8" w:space="0" w:color="000000"/>
+              <w:right w:val="single" w:sz="8" w:space="0" w:color="000000"/>
+            </w:tcBorders>
+            <w:tcMar>
+              <w:top w:w="100" w:type="dxa"/>
+              <w:left w:w="100" w:type="dxa"/>
+              <w:bottom w:w="100" w:type="dxa"/>
+              <w:right w:w="100" w:type="dxa"/>
+            </w:tcMar>
+            <w:hideMark/>
+          </w:tcPr>
+          <w:p>
+            <w:pPr>
+              <w:rPr>
+                <w:sz w:val="24"/>
+                <w:szCs w:val="24"/>
+                <w:lang w:val="en-IE"/>
+              </w:rPr>
+            </w:pPr>
+            <w:r>
+              <w:rPr>
+                <w:sz w:val="24"/>
+                <w:szCs w:val="24"/>
+                <w:lang w:val="en-IE"/>
+              </w:rPr>
+              <w:t>Title (goal)</w:t>
+            </w:r>
+          </w:p>
+        </w:tc>
+        <w:tc>
+          <w:tcPr>
+            <w:tcW w:w="6915" w:type="dxa"/>
+            <w:tcBorders>
+              <w:top w:val="single" w:sz="8" w:space="0" w:color="000000"/>
+              <w:left w:val="single" w:sz="8" w:space="0" w:color="000000"/>
+              <w:bottom w:val="single" w:sz="8" w:space="0" w:color="000000"/>
+              <w:right w:val="single" w:sz="8" w:space="0" w:color="000000"/>
+            </w:tcBorders>
+            <w:tcMar>
+              <w:top w:w="100" w:type="dxa"/>
+              <w:left w:w="100" w:type="dxa"/>
+              <w:bottom w:w="100" w:type="dxa"/>
+              <w:right w:w="100" w:type="dxa"/>
+            </w:tcMar>
+            <w:hideMark/>
+          </w:tcPr>
+          <w:p>
+            <w:pPr>
+              <w:rPr>
+                <w:sz w:val="24"/>
+                <w:szCs w:val="24"/>
+                <w:lang w:val="en-IE"/>
+              </w:rPr>
+            </w:pPr>
+            <w:r>
+              <w:rPr>
+                <w:sz w:val="24"/>
+                <w:szCs w:val="24"/>
+                <w:lang w:val="en-IE"/>
+              </w:rPr>
+              <w:t>Pause preview.</w:t>
+            </w:r>
+          </w:p>
+        </w:tc>
+      </w:tr>
+      <w:tr>
+        <w:tc>
+          <w:tcPr>
+            <w:tcW w:w="2085" w:type="dxa"/>
+            <w:tcBorders>
+              <w:top w:val="single" w:sz="8" w:space="0" w:color="000000"/>
+              <w:left w:val="single" w:sz="8" w:space="0" w:color="000000"/>
+              <w:bottom w:val="single" w:sz="8" w:space="0" w:color="000000"/>
+              <w:right w:val="single" w:sz="8" w:space="0" w:color="000000"/>
+            </w:tcBorders>
+            <w:tcMar>
+              <w:top w:w="100" w:type="dxa"/>
+              <w:left w:w="100" w:type="dxa"/>
+              <w:bottom w:w="100" w:type="dxa"/>
+              <w:right w:w="100" w:type="dxa"/>
+            </w:tcMar>
+            <w:hideMark/>
+          </w:tcPr>
+          <w:p>
+            <w:pPr>
+              <w:rPr>
+                <w:sz w:val="24"/>
+                <w:szCs w:val="24"/>
+                <w:lang w:val="en-IE"/>
+              </w:rPr>
+            </w:pPr>
+            <w:r>
+              <w:rPr>
+                <w:sz w:val="24"/>
+                <w:szCs w:val="24"/>
+                <w:lang w:val="en-IE"/>
+              </w:rPr>
+              <w:t>Primary Actor</w:t>
+            </w:r>
+          </w:p>
+        </w:tc>
+        <w:tc>
+          <w:tcPr>
+            <w:tcW w:w="6915" w:type="dxa"/>
+            <w:tcBorders>
+              <w:top w:val="single" w:sz="8" w:space="0" w:color="000000"/>
+              <w:left w:val="single" w:sz="8" w:space="0" w:color="000000"/>
+              <w:bottom w:val="single" w:sz="8" w:space="0" w:color="000000"/>
+              <w:right w:val="single" w:sz="8" w:space="0" w:color="000000"/>
+            </w:tcBorders>
+            <w:tcMar>
+              <w:top w:w="100" w:type="dxa"/>
+              <w:left w:w="100" w:type="dxa"/>
+              <w:bottom w:w="100" w:type="dxa"/>
+              <w:right w:w="100" w:type="dxa"/>
+            </w:tcMar>
+            <w:hideMark/>
+          </w:tcPr>
+          <w:p>
+            <w:pPr>
+              <w:rPr>
+                <w:sz w:val="24"/>
+                <w:szCs w:val="24"/>
+                <w:lang w:val="en-IE"/>
+              </w:rPr>
+            </w:pPr>
+            <w:r>
+              <w:rPr>
+                <w:sz w:val="24"/>
+                <w:szCs w:val="24"/>
+                <w:lang w:val="en-IE"/>
+              </w:rPr>
+              <w:t>User</w:t>
+            </w:r>
+          </w:p>
+        </w:tc>
+      </w:tr>
+      <w:tr>
+        <w:tc>
+          <w:tcPr>
+            <w:tcW w:w="2085" w:type="dxa"/>
+            <w:tcBorders>
+              <w:top w:val="single" w:sz="8" w:space="0" w:color="000000"/>
+              <w:left w:val="single" w:sz="8" w:space="0" w:color="000000"/>
+              <w:bottom w:val="single" w:sz="8" w:space="0" w:color="000000"/>
+              <w:right w:val="single" w:sz="8" w:space="0" w:color="000000"/>
+            </w:tcBorders>
+            <w:tcMar>
+              <w:top w:w="100" w:type="dxa"/>
+              <w:left w:w="100" w:type="dxa"/>
+              <w:bottom w:w="100" w:type="dxa"/>
+              <w:right w:w="100" w:type="dxa"/>
+            </w:tcMar>
+            <w:hideMark/>
+          </w:tcPr>
+          <w:p>
+            <w:pPr>
+              <w:rPr>
+                <w:sz w:val="24"/>
+                <w:szCs w:val="24"/>
+                <w:lang w:val="en-IE"/>
+              </w:rPr>
+            </w:pPr>
+            <w:r>
+              <w:rPr>
+                <w:sz w:val="24"/>
+                <w:szCs w:val="24"/>
+                <w:lang w:val="en-IE"/>
+              </w:rPr>
+              <w:t>Story</w:t>
+            </w:r>
+          </w:p>
+        </w:tc>
+        <w:tc>
+          <w:tcPr>
+            <w:tcW w:w="6915" w:type="dxa"/>
+            <w:tcBorders>
+              <w:top w:val="single" w:sz="8" w:space="0" w:color="000000"/>
+              <w:left w:val="single" w:sz="8" w:space="0" w:color="000000"/>
+              <w:bottom w:val="single" w:sz="8" w:space="0" w:color="000000"/>
+              <w:right w:val="single" w:sz="8" w:space="0" w:color="000000"/>
+            </w:tcBorders>
+            <w:tcMar>
+              <w:top w:w="100" w:type="dxa"/>
+              <w:left w:w="100" w:type="dxa"/>
+              <w:bottom w:w="100" w:type="dxa"/>
+              <w:right w:w="100" w:type="dxa"/>
+            </w:tcMar>
+            <w:hideMark/>
+          </w:tcPr>
+          <w:p>
+            <w:pPr>
+              <w:rPr>
+                <w:sz w:val="24"/>
+                <w:szCs w:val="24"/>
+                <w:lang w:val="en-IE"/>
+              </w:rPr>
+            </w:pPr>
+            <w:r>
+              <w:rPr>
+                <w:sz w:val="24"/>
+                <w:szCs w:val="24"/>
+                <w:lang w:val="en-IE"/>
+              </w:rPr>
+              <w:t>The user wants to pause the preview. Based on where the timestamp pointer is, the VLC-media player would stop the clip at that timestamp.</w:t>
+            </w:r>
+          </w:p>
+        </w:tc>
+      </w:tr>
+    </w:tbl>
+    <w:p>
+      <w:pPr>
+        <w:jc w:val="center"/>
         <w:rPr>
           <w:sz w:val="24"/>
           <w:szCs w:val="24"/>
@@ -1493,26 +4235,16 @@
       <w:pPr>
         <w:jc w:val="center"/>
         <w:rPr>
-          <w:b/>
-          <w:bCs/>
           <w:sz w:val="24"/>
           <w:szCs w:val="24"/>
           <w:lang w:val="en-IE"/>
         </w:rPr>
       </w:pPr>
-      <w:bookmarkStart w:id="3" w:name="_dx62i1ti7ttb"/>
-      <w:bookmarkStart w:id="4" w:name="_5vbiyg1wdh2a"/>
-      <w:bookmarkStart w:id="5" w:name="_bu4f8g7mpodt"/>
-      <w:bookmarkEnd w:id="3"/>
-      <w:bookmarkEnd w:id="4"/>
-      <w:bookmarkEnd w:id="5"/>
     </w:p>
     <w:p>
       <w:pPr>
         <w:jc w:val="center"/>
         <w:rPr>
-          <w:b/>
-          <w:bCs/>
           <w:sz w:val="24"/>
           <w:szCs w:val="24"/>
           <w:lang w:val="en-IE"/>
@@ -1523,8 +4255,6 @@
       <w:pPr>
         <w:jc w:val="center"/>
         <w:rPr>
-          <w:b/>
-          <w:bCs/>
           <w:sz w:val="24"/>
           <w:szCs w:val="24"/>
           <w:lang w:val="en-IE"/>
@@ -1535,8 +4265,6 @@
       <w:pPr>
         <w:jc w:val="center"/>
         <w:rPr>
-          <w:b/>
-          <w:bCs/>
           <w:sz w:val="24"/>
           <w:szCs w:val="24"/>
           <w:lang w:val="en-IE"/>
@@ -1547,8 +4275,6 @@
       <w:pPr>
         <w:jc w:val="center"/>
         <w:rPr>
-          <w:b/>
-          <w:bCs/>
           <w:sz w:val="24"/>
           <w:szCs w:val="24"/>
           <w:lang w:val="en-IE"/>
@@ -1559,8 +4285,6 @@
       <w:pPr>
         <w:jc w:val="center"/>
         <w:rPr>
-          <w:b/>
-          <w:bCs/>
           <w:sz w:val="24"/>
           <w:szCs w:val="24"/>
           <w:lang w:val="en-IE"/>
@@ -1571,8 +4295,6 @@
       <w:pPr>
         <w:jc w:val="center"/>
         <w:rPr>
-          <w:b/>
-          <w:bCs/>
           <w:sz w:val="24"/>
           <w:szCs w:val="24"/>
           <w:lang w:val="en-IE"/>
@@ -1583,8 +4305,6 @@
       <w:pPr>
         <w:jc w:val="center"/>
         <w:rPr>
-          <w:b/>
-          <w:bCs/>
           <w:sz w:val="24"/>
           <w:szCs w:val="24"/>
           <w:lang w:val="en-IE"/>
@@ -1595,8 +4315,6 @@
       <w:pPr>
         <w:jc w:val="center"/>
         <w:rPr>
-          <w:b/>
-          <w:bCs/>
           <w:sz w:val="24"/>
           <w:szCs w:val="24"/>
           <w:lang w:val="en-IE"/>
@@ -1607,8 +4325,6 @@
       <w:pPr>
         <w:jc w:val="center"/>
         <w:rPr>
-          <w:b/>
-          <w:bCs/>
           <w:sz w:val="24"/>
           <w:szCs w:val="24"/>
           <w:lang w:val="en-IE"/>
@@ -1619,8 +4335,6 @@
       <w:pPr>
         <w:jc w:val="center"/>
         <w:rPr>
-          <w:b/>
-          <w:bCs/>
           <w:sz w:val="24"/>
           <w:szCs w:val="24"/>
           <w:lang w:val="en-IE"/>
@@ -1631,8 +4345,6 @@
       <w:pPr>
         <w:jc w:val="center"/>
         <w:rPr>
-          <w:b/>
-          <w:bCs/>
           <w:sz w:val="24"/>
           <w:szCs w:val="24"/>
           <w:lang w:val="en-IE"/>
@@ -1643,8 +4355,6 @@
       <w:pPr>
         <w:jc w:val="center"/>
         <w:rPr>
-          <w:b/>
-          <w:bCs/>
           <w:sz w:val="24"/>
           <w:szCs w:val="24"/>
           <w:lang w:val="en-IE"/>
@@ -1655,8 +4365,6 @@
       <w:pPr>
         <w:jc w:val="center"/>
         <w:rPr>
-          <w:b/>
-          <w:bCs/>
           <w:sz w:val="24"/>
           <w:szCs w:val="24"/>
           <w:lang w:val="en-IE"/>
@@ -1667,8 +4375,6 @@
       <w:pPr>
         <w:jc w:val="center"/>
         <w:rPr>
-          <w:b/>
-          <w:bCs/>
           <w:sz w:val="24"/>
           <w:szCs w:val="24"/>
           <w:lang w:val="en-IE"/>
@@ -1679,8 +4385,6 @@
       <w:pPr>
         <w:jc w:val="center"/>
         <w:rPr>
-          <w:b/>
-          <w:bCs/>
           <w:sz w:val="24"/>
           <w:szCs w:val="24"/>
           <w:lang w:val="en-IE"/>
@@ -1691,8 +4395,6 @@
       <w:pPr>
         <w:jc w:val="center"/>
         <w:rPr>
-          <w:b/>
-          <w:bCs/>
           <w:sz w:val="24"/>
           <w:szCs w:val="24"/>
           <w:lang w:val="en-IE"/>
@@ -1703,8 +4405,6 @@
       <w:pPr>
         <w:jc w:val="center"/>
         <w:rPr>
-          <w:b/>
-          <w:bCs/>
           <w:sz w:val="24"/>
           <w:szCs w:val="24"/>
           <w:lang w:val="en-IE"/>
@@ -1715,8 +4415,6 @@
       <w:pPr>
         <w:jc w:val="center"/>
         <w:rPr>
-          <w:b/>
-          <w:bCs/>
           <w:sz w:val="24"/>
           <w:szCs w:val="24"/>
           <w:lang w:val="en-IE"/>
@@ -1727,188 +4425,6 @@
       <w:pPr>
         <w:jc w:val="center"/>
         <w:rPr>
-          <w:b/>
-          <w:bCs/>
-          <w:sz w:val="24"/>
-          <w:szCs w:val="24"/>
-          <w:lang w:val="en-IE"/>
-        </w:rPr>
-      </w:pPr>
-    </w:p>
-    <w:p>
-      <w:pPr>
-        <w:jc w:val="center"/>
-        <w:rPr>
-          <w:b/>
-          <w:bCs/>
-          <w:sz w:val="24"/>
-          <w:szCs w:val="24"/>
-          <w:lang w:val="en-IE"/>
-        </w:rPr>
-      </w:pPr>
-    </w:p>
-    <w:p>
-      <w:pPr>
-        <w:jc w:val="center"/>
-        <w:rPr>
-          <w:b/>
-          <w:bCs/>
-          <w:sz w:val="24"/>
-          <w:szCs w:val="24"/>
-          <w:lang w:val="en-IE"/>
-        </w:rPr>
-      </w:pPr>
-    </w:p>
-    <w:p>
-      <w:pPr>
-        <w:jc w:val="center"/>
-        <w:rPr>
-          <w:b/>
-          <w:bCs/>
-          <w:sz w:val="24"/>
-          <w:szCs w:val="24"/>
-          <w:lang w:val="en-IE"/>
-        </w:rPr>
-      </w:pPr>
-    </w:p>
-    <w:p>
-      <w:pPr>
-        <w:jc w:val="center"/>
-        <w:rPr>
-          <w:b/>
-          <w:bCs/>
-          <w:sz w:val="24"/>
-          <w:szCs w:val="24"/>
-          <w:lang w:val="en-IE"/>
-        </w:rPr>
-      </w:pPr>
-    </w:p>
-    <w:p>
-      <w:pPr>
-        <w:jc w:val="center"/>
-        <w:rPr>
-          <w:b/>
-          <w:bCs/>
-          <w:sz w:val="24"/>
-          <w:szCs w:val="24"/>
-          <w:lang w:val="en-IE"/>
-        </w:rPr>
-      </w:pPr>
-    </w:p>
-    <w:p>
-      <w:pPr>
-        <w:jc w:val="center"/>
-        <w:rPr>
-          <w:b/>
-          <w:bCs/>
-          <w:sz w:val="24"/>
-          <w:szCs w:val="24"/>
-          <w:lang w:val="en-IE"/>
-        </w:rPr>
-      </w:pPr>
-    </w:p>
-    <w:p>
-      <w:pPr>
-        <w:jc w:val="center"/>
-        <w:rPr>
-          <w:b/>
-          <w:bCs/>
-          <w:sz w:val="24"/>
-          <w:szCs w:val="24"/>
-          <w:lang w:val="en-IE"/>
-        </w:rPr>
-      </w:pPr>
-    </w:p>
-    <w:p>
-      <w:pPr>
-        <w:jc w:val="center"/>
-        <w:rPr>
-          <w:b/>
-          <w:bCs/>
-          <w:sz w:val="24"/>
-          <w:szCs w:val="24"/>
-          <w:lang w:val="en-IE"/>
-        </w:rPr>
-      </w:pPr>
-    </w:p>
-    <w:p>
-      <w:pPr>
-        <w:jc w:val="center"/>
-        <w:rPr>
-          <w:b/>
-          <w:bCs/>
-          <w:sz w:val="24"/>
-          <w:szCs w:val="24"/>
-          <w:lang w:val="en-IE"/>
-        </w:rPr>
-      </w:pPr>
-    </w:p>
-    <w:p>
-      <w:pPr>
-        <w:jc w:val="center"/>
-        <w:rPr>
-          <w:b/>
-          <w:bCs/>
-          <w:sz w:val="24"/>
-          <w:szCs w:val="24"/>
-          <w:lang w:val="en-IE"/>
-        </w:rPr>
-      </w:pPr>
-    </w:p>
-    <w:p>
-      <w:pPr>
-        <w:jc w:val="center"/>
-        <w:rPr>
-          <w:b/>
-          <w:bCs/>
-          <w:sz w:val="24"/>
-          <w:szCs w:val="24"/>
-          <w:lang w:val="en-IE"/>
-        </w:rPr>
-      </w:pPr>
-    </w:p>
-    <w:p>
-      <w:pPr>
-        <w:jc w:val="center"/>
-        <w:rPr>
-          <w:b/>
-          <w:bCs/>
-          <w:sz w:val="24"/>
-          <w:szCs w:val="24"/>
-          <w:lang w:val="en-IE"/>
-        </w:rPr>
-      </w:pPr>
-    </w:p>
-    <w:p>
-      <w:pPr>
-        <w:jc w:val="center"/>
-        <w:rPr>
-          <w:b/>
-          <w:bCs/>
-          <w:sz w:val="24"/>
-          <w:szCs w:val="24"/>
-          <w:lang w:val="en-IE"/>
-        </w:rPr>
-      </w:pPr>
-    </w:p>
-    <w:p>
-      <w:pPr>
-        <w:jc w:val="center"/>
-        <w:rPr>
-          <w:b/>
-          <w:bCs/>
-          <w:sz w:val="24"/>
-          <w:szCs w:val="24"/>
-          <w:lang w:val="en-IE"/>
-        </w:rPr>
-      </w:pPr>
-    </w:p>
-    <w:p>
-      <w:pPr>
-        <w:jc w:val="center"/>
-        <w:rPr>
-          <w:b/>
-          <w:bCs/>
           <w:sz w:val="24"/>
           <w:szCs w:val="24"/>
           <w:lang w:val="en-IE"/>
@@ -2048,533 +4564,14 @@
     </w:p>
     <w:p>
       <w:pPr>
-        <w:jc w:val="center"/>
-        <w:rPr>
-          <w:b/>
-          <w:bCs/>
+        <w:rPr>
           <w:sz w:val="24"/>
           <w:szCs w:val="24"/>
           <w:lang w:val="en-IE"/>
         </w:rPr>
       </w:pPr>
-      <w:r>
-        <w:rPr>
-          <w:b/>
-          <w:bCs/>
-          <w:sz w:val="24"/>
-          <w:szCs w:val="24"/>
-          <w:lang w:val="en-IE"/>
-        </w:rPr>
-        <w:t>Files Upload</w:t>
-      </w:r>
-    </w:p>
-    <w:p>
-      <w:pPr>
-        <w:rPr>
-          <w:sz w:val="24"/>
-          <w:szCs w:val="24"/>
-          <w:lang w:val="en-IE"/>
-        </w:rPr>
-      </w:pPr>
-      <w:r>
-        <w:rPr>
-          <w:noProof/>
-          <w:sz w:val="24"/>
-          <w:szCs w:val="24"/>
-          <w:lang w:val="en-IE"/>
-        </w:rPr>
-        <w:drawing>
-          <wp:inline distT="0" distB="0" distL="0" distR="0" wp14:anchorId="0C58FF28" wp14:editId="1ED8AB17">
-            <wp:extent cx="5733415" cy="3685540"/>
-            <wp:effectExtent l="0" t="0" r="635" b="0"/>
-            <wp:docPr id="851610988" name="Picture 10" descr="A computer screen shot of a cloud&#10;&#10;Description automatically generated"/>
-            <wp:cNvGraphicFramePr>
-              <a:graphicFrameLocks xmlns:a="http://schemas.openxmlformats.org/drawingml/2006/main" noChangeAspect="1"/>
-            </wp:cNvGraphicFramePr>
-            <a:graphic xmlns:a="http://schemas.openxmlformats.org/drawingml/2006/main">
-              <a:graphicData uri="http://schemas.openxmlformats.org/drawingml/2006/picture">
-                <pic:pic xmlns:pic="http://schemas.openxmlformats.org/drawingml/2006/picture">
-                  <pic:nvPicPr>
-                    <pic:cNvPr id="0" name="Picture 33" descr="A computer screen shot of a cloud&#10;&#10;Description automatically generated"/>
-                    <pic:cNvPicPr>
-                      <a:picLocks noChangeAspect="1" noChangeArrowheads="1"/>
-                    </pic:cNvPicPr>
-                  </pic:nvPicPr>
-                  <pic:blipFill>
-                    <a:blip r:embed="rId7">
-                      <a:extLst>
-                        <a:ext uri="{28A0092B-C50C-407E-A947-70E740481C1C}">
-                          <a14:useLocalDpi xmlns:a14="http://schemas.microsoft.com/office/drawing/2010/main" val="0"/>
-                        </a:ext>
-                      </a:extLst>
-                    </a:blip>
-                    <a:srcRect/>
-                    <a:stretch>
-                      <a:fillRect/>
-                    </a:stretch>
-                  </pic:blipFill>
-                  <pic:spPr bwMode="auto">
-                    <a:xfrm>
-                      <a:off x="0" y="0"/>
-                      <a:ext cx="5733415" cy="3685540"/>
-                    </a:xfrm>
-                    <a:prstGeom prst="rect">
-                      <a:avLst/>
-                    </a:prstGeom>
-                    <a:noFill/>
-                    <a:ln>
-                      <a:noFill/>
-                    </a:ln>
-                  </pic:spPr>
-                </pic:pic>
-              </a:graphicData>
-            </a:graphic>
-          </wp:inline>
-        </w:drawing>
-      </w:r>
-    </w:p>
-    <w:p>
-      <w:pPr>
-        <w:rPr>
-          <w:sz w:val="24"/>
-          <w:szCs w:val="24"/>
-          <w:lang w:val="en-IE"/>
-        </w:rPr>
-      </w:pPr>
-    </w:p>
-    <w:p>
-      <w:pPr>
-        <w:rPr>
-          <w:sz w:val="24"/>
-          <w:szCs w:val="24"/>
-          <w:lang w:val="en-IE"/>
-        </w:rPr>
-      </w:pPr>
-    </w:p>
-    <w:p>
-      <w:pPr>
-        <w:rPr>
-          <w:sz w:val="24"/>
-          <w:szCs w:val="24"/>
-          <w:lang w:val="en-IE"/>
-        </w:rPr>
-      </w:pPr>
-    </w:p>
-    <w:p>
-      <w:pPr>
-        <w:rPr>
-          <w:sz w:val="24"/>
-          <w:szCs w:val="24"/>
-          <w:lang w:val="en-IE"/>
-        </w:rPr>
-      </w:pPr>
-    </w:p>
-    <w:p>
-      <w:pPr>
-        <w:rPr>
-          <w:sz w:val="24"/>
-          <w:szCs w:val="24"/>
-          <w:lang w:val="en-IE"/>
-        </w:rPr>
-      </w:pPr>
-    </w:p>
-    <w:p>
-      <w:pPr>
-        <w:rPr>
-          <w:sz w:val="24"/>
-          <w:szCs w:val="24"/>
-          <w:lang w:val="en-IE"/>
-        </w:rPr>
-      </w:pPr>
-    </w:p>
-    <w:p>
-      <w:pPr>
-        <w:rPr>
-          <w:sz w:val="24"/>
-          <w:szCs w:val="24"/>
-          <w:lang w:val="en-IE"/>
-        </w:rPr>
-      </w:pPr>
-    </w:p>
-    <w:p>
-      <w:pPr>
-        <w:rPr>
-          <w:sz w:val="24"/>
-          <w:szCs w:val="24"/>
-          <w:lang w:val="en-IE"/>
-        </w:rPr>
-      </w:pPr>
-    </w:p>
-    <w:p>
-      <w:pPr>
-        <w:rPr>
-          <w:sz w:val="24"/>
-          <w:szCs w:val="24"/>
-          <w:lang w:val="en-IE"/>
-        </w:rPr>
-      </w:pPr>
-    </w:p>
-    <w:p>
-      <w:pPr>
-        <w:jc w:val="center"/>
-        <w:rPr>
-          <w:b/>
-          <w:bCs/>
-          <w:sz w:val="24"/>
-          <w:szCs w:val="24"/>
-          <w:lang w:val="en-IE"/>
-        </w:rPr>
-      </w:pPr>
-      <w:r>
-        <w:rPr>
-          <w:b/>
-          <w:bCs/>
-          <w:sz w:val="24"/>
-          <w:szCs w:val="24"/>
-          <w:lang w:val="en-IE"/>
-        </w:rPr>
-        <w:t>Render Settings</w:t>
-      </w:r>
-    </w:p>
-    <w:p>
-      <w:pPr>
-        <w:rPr>
-          <w:sz w:val="24"/>
-          <w:szCs w:val="24"/>
-          <w:lang w:val="en-IE"/>
-        </w:rPr>
-      </w:pPr>
-      <w:r>
-        <w:rPr>
-          <w:noProof/>
-          <w:sz w:val="24"/>
-          <w:szCs w:val="24"/>
-          <w:lang w:val="en-IE"/>
-        </w:rPr>
-        <w:drawing>
-          <wp:inline distT="0" distB="0" distL="0" distR="0" wp14:anchorId="4D414F50" wp14:editId="7B1098DB">
-            <wp:extent cx="5733415" cy="3117850"/>
-            <wp:effectExtent l="0" t="0" r="635" b="6350"/>
-            <wp:docPr id="486378118" name="Picture 9" descr="A computer screen shot of a cloud&#10;&#10;Description automatically generated"/>
-            <wp:cNvGraphicFramePr>
-              <a:graphicFrameLocks xmlns:a="http://schemas.openxmlformats.org/drawingml/2006/main" noChangeAspect="1"/>
-            </wp:cNvGraphicFramePr>
-            <a:graphic xmlns:a="http://schemas.openxmlformats.org/drawingml/2006/main">
-              <a:graphicData uri="http://schemas.openxmlformats.org/drawingml/2006/picture">
-                <pic:pic xmlns:pic="http://schemas.openxmlformats.org/drawingml/2006/picture">
-                  <pic:nvPicPr>
-                    <pic:cNvPr id="0" name="Picture 34" descr="A computer screen shot of a cloud&#10;&#10;Description automatically generated"/>
-                    <pic:cNvPicPr>
-                      <a:picLocks noChangeAspect="1" noChangeArrowheads="1"/>
-                    </pic:cNvPicPr>
-                  </pic:nvPicPr>
-                  <pic:blipFill>
-                    <a:blip r:embed="rId8" cstate="print">
-                      <a:extLst>
-                        <a:ext uri="{28A0092B-C50C-407E-A947-70E740481C1C}">
-                          <a14:useLocalDpi xmlns:a14="http://schemas.microsoft.com/office/drawing/2010/main" val="0"/>
-                        </a:ext>
-                      </a:extLst>
-                    </a:blip>
-                    <a:srcRect/>
-                    <a:stretch>
-                      <a:fillRect/>
-                    </a:stretch>
-                  </pic:blipFill>
-                  <pic:spPr bwMode="auto">
-                    <a:xfrm>
-                      <a:off x="0" y="0"/>
-                      <a:ext cx="5733415" cy="3117850"/>
-                    </a:xfrm>
-                    <a:prstGeom prst="rect">
-                      <a:avLst/>
-                    </a:prstGeom>
-                    <a:noFill/>
-                    <a:ln>
-                      <a:noFill/>
-                    </a:ln>
-                  </pic:spPr>
-                </pic:pic>
-              </a:graphicData>
-            </a:graphic>
-          </wp:inline>
-        </w:drawing>
-      </w:r>
-    </w:p>
-    <w:p>
-      <w:pPr>
-        <w:rPr>
-          <w:sz w:val="24"/>
-          <w:szCs w:val="24"/>
-          <w:lang w:val="en-IE"/>
-        </w:rPr>
-      </w:pPr>
-    </w:p>
-    <w:p>
-      <w:pPr>
-        <w:jc w:val="center"/>
-        <w:rPr>
-          <w:b/>
-          <w:bCs/>
-          <w:sz w:val="24"/>
-          <w:szCs w:val="24"/>
-          <w:lang w:val="en-IE"/>
-        </w:rPr>
-      </w:pPr>
-      <w:r>
-        <w:rPr>
-          <w:b/>
-          <w:bCs/>
-          <w:sz w:val="24"/>
-          <w:szCs w:val="24"/>
-          <w:lang w:val="en-IE"/>
-        </w:rPr>
-        <w:t>Start/Finishing Render</w:t>
-      </w:r>
-    </w:p>
-    <w:p>
-      <w:pPr>
-        <w:rPr>
-          <w:sz w:val="24"/>
-          <w:szCs w:val="24"/>
-          <w:lang w:val="en-IE"/>
-        </w:rPr>
-      </w:pPr>
-      <w:r>
-        <w:rPr>
-          <w:noProof/>
-          <w:sz w:val="24"/>
-          <w:szCs w:val="24"/>
-          <w:lang w:val="en-IE"/>
-        </w:rPr>
-        <w:drawing>
-          <wp:inline distT="0" distB="0" distL="0" distR="0" wp14:anchorId="5D8C893A" wp14:editId="3B31A841">
-            <wp:extent cx="5729605" cy="3148330"/>
-            <wp:effectExtent l="0" t="0" r="4445" b="0"/>
-            <wp:docPr id="290266109" name="Picture 8" descr="A computer network diagram with text&#10;&#10;Description automatically generated with medium confidence"/>
-            <wp:cNvGraphicFramePr>
-              <a:graphicFrameLocks xmlns:a="http://schemas.openxmlformats.org/drawingml/2006/main" noChangeAspect="1"/>
-            </wp:cNvGraphicFramePr>
-            <a:graphic xmlns:a="http://schemas.openxmlformats.org/drawingml/2006/main">
-              <a:graphicData uri="http://schemas.openxmlformats.org/drawingml/2006/picture">
-                <pic:pic xmlns:pic="http://schemas.openxmlformats.org/drawingml/2006/picture">
-                  <pic:nvPicPr>
-                    <pic:cNvPr id="0" name="Picture 35" descr="A computer network diagram with text&#10;&#10;Description automatically generated with medium confidence"/>
-                    <pic:cNvPicPr>
-                      <a:picLocks noChangeAspect="1" noChangeArrowheads="1"/>
-                    </pic:cNvPicPr>
-                  </pic:nvPicPr>
-                  <pic:blipFill>
-                    <a:blip r:embed="rId9" cstate="print">
-                      <a:extLst>
-                        <a:ext uri="{28A0092B-C50C-407E-A947-70E740481C1C}">
-                          <a14:useLocalDpi xmlns:a14="http://schemas.microsoft.com/office/drawing/2010/main" val="0"/>
-                        </a:ext>
-                      </a:extLst>
-                    </a:blip>
-                    <a:srcRect/>
-                    <a:stretch>
-                      <a:fillRect/>
-                    </a:stretch>
-                  </pic:blipFill>
-                  <pic:spPr bwMode="auto">
-                    <a:xfrm>
-                      <a:off x="0" y="0"/>
-                      <a:ext cx="5729605" cy="3148330"/>
-                    </a:xfrm>
-                    <a:prstGeom prst="rect">
-                      <a:avLst/>
-                    </a:prstGeom>
-                    <a:noFill/>
-                    <a:ln>
-                      <a:noFill/>
-                    </a:ln>
-                  </pic:spPr>
-                </pic:pic>
-              </a:graphicData>
-            </a:graphic>
-          </wp:inline>
-        </w:drawing>
-      </w:r>
-    </w:p>
-    <w:p>
-      <w:pPr>
-        <w:rPr>
-          <w:sz w:val="24"/>
-          <w:szCs w:val="24"/>
-          <w:lang w:val="en-IE"/>
-        </w:rPr>
-      </w:pPr>
-    </w:p>
-    <w:p>
-      <w:pPr>
-        <w:rPr>
-          <w:sz w:val="24"/>
-          <w:szCs w:val="24"/>
-          <w:lang w:val="en-IE"/>
-        </w:rPr>
-      </w:pPr>
-    </w:p>
-    <w:p>
-      <w:pPr>
-        <w:rPr>
-          <w:sz w:val="24"/>
-          <w:szCs w:val="24"/>
-          <w:lang w:val="en-IE"/>
-        </w:rPr>
-      </w:pPr>
-    </w:p>
-    <w:p>
-      <w:pPr>
-        <w:rPr>
-          <w:sz w:val="24"/>
-          <w:szCs w:val="24"/>
-          <w:lang w:val="en-IE"/>
-        </w:rPr>
-      </w:pPr>
-    </w:p>
-    <w:p>
-      <w:pPr>
-        <w:rPr>
-          <w:sz w:val="24"/>
-          <w:szCs w:val="24"/>
-          <w:lang w:val="en-IE"/>
-        </w:rPr>
-      </w:pPr>
-    </w:p>
-    <w:p>
-      <w:pPr>
-        <w:rPr>
-          <w:sz w:val="24"/>
-          <w:szCs w:val="24"/>
-          <w:lang w:val="en-IE"/>
-        </w:rPr>
-      </w:pPr>
-    </w:p>
-    <w:p>
-      <w:pPr>
-        <w:rPr>
-          <w:sz w:val="24"/>
-          <w:szCs w:val="24"/>
-          <w:lang w:val="en-IE"/>
-        </w:rPr>
-      </w:pPr>
-    </w:p>
-    <w:p>
-      <w:pPr>
-        <w:rPr>
-          <w:sz w:val="24"/>
-          <w:szCs w:val="24"/>
-          <w:lang w:val="en-IE"/>
-        </w:rPr>
-      </w:pPr>
-    </w:p>
-    <w:p>
-      <w:pPr>
-        <w:rPr>
-          <w:sz w:val="24"/>
-          <w:szCs w:val="24"/>
-          <w:lang w:val="en-IE"/>
-        </w:rPr>
-      </w:pPr>
-    </w:p>
-    <w:p>
-      <w:pPr>
-        <w:rPr>
-          <w:sz w:val="24"/>
-          <w:szCs w:val="24"/>
-          <w:lang w:val="en-IE"/>
-        </w:rPr>
-      </w:pPr>
-    </w:p>
-    <w:p>
-      <w:pPr>
-        <w:jc w:val="center"/>
-        <w:rPr>
-          <w:b/>
-          <w:bCs/>
-          <w:sz w:val="24"/>
-          <w:szCs w:val="24"/>
-          <w:lang w:val="en-IE"/>
-        </w:rPr>
-      </w:pPr>
-      <w:r>
-        <w:rPr>
-          <w:b/>
-          <w:bCs/>
-          <w:sz w:val="24"/>
-          <w:szCs w:val="24"/>
-          <w:lang w:val="en-IE"/>
-        </w:rPr>
-        <w:t>Payment</w:t>
-      </w:r>
-    </w:p>
-    <w:p>
-      <w:pPr>
-        <w:rPr>
-          <w:sz w:val="24"/>
-          <w:szCs w:val="24"/>
-          <w:lang w:val="en-IE"/>
-        </w:rPr>
-      </w:pPr>
-      <w:r>
-        <w:rPr>
-          <w:noProof/>
-          <w:sz w:val="24"/>
-          <w:szCs w:val="24"/>
-          <w:lang w:val="en-IE"/>
-        </w:rPr>
-        <w:drawing>
-          <wp:inline distT="0" distB="0" distL="0" distR="0" wp14:anchorId="737955C0" wp14:editId="6EB1EF2E">
-            <wp:extent cx="5733415" cy="3169920"/>
-            <wp:effectExtent l="0" t="0" r="635" b="0"/>
-            <wp:docPr id="847935833" name="Picture 7" descr="A screenshot of a computer&#10;&#10;Description automatically generated"/>
-            <wp:cNvGraphicFramePr>
-              <a:graphicFrameLocks xmlns:a="http://schemas.openxmlformats.org/drawingml/2006/main" noChangeAspect="1"/>
-            </wp:cNvGraphicFramePr>
-            <a:graphic xmlns:a="http://schemas.openxmlformats.org/drawingml/2006/main">
-              <a:graphicData uri="http://schemas.openxmlformats.org/drawingml/2006/picture">
-                <pic:pic xmlns:pic="http://schemas.openxmlformats.org/drawingml/2006/picture">
-                  <pic:nvPicPr>
-                    <pic:cNvPr id="0" name="Picture 1" descr="A screenshot of a computer&#10;&#10;Description automatically generated"/>
-                    <pic:cNvPicPr>
-                      <a:picLocks noChangeAspect="1" noChangeArrowheads="1"/>
-                    </pic:cNvPicPr>
-                  </pic:nvPicPr>
-                  <pic:blipFill>
-                    <a:blip r:embed="rId10" cstate="print">
-                      <a:extLst>
-                        <a:ext uri="{28A0092B-C50C-407E-A947-70E740481C1C}">
-                          <a14:useLocalDpi xmlns:a14="http://schemas.microsoft.com/office/drawing/2010/main" val="0"/>
-                        </a:ext>
-                      </a:extLst>
-                    </a:blip>
-                    <a:srcRect/>
-                    <a:stretch>
-                      <a:fillRect/>
-                    </a:stretch>
-                  </pic:blipFill>
-                  <pic:spPr bwMode="auto">
-                    <a:xfrm>
-                      <a:off x="0" y="0"/>
-                      <a:ext cx="5733415" cy="3169920"/>
-                    </a:xfrm>
-                    <a:prstGeom prst="rect">
-                      <a:avLst/>
-                    </a:prstGeom>
-                    <a:noFill/>
-                    <a:ln>
-                      <a:noFill/>
-                    </a:ln>
-                  </pic:spPr>
-                </pic:pic>
-              </a:graphicData>
-            </a:graphic>
-          </wp:inline>
-        </w:drawing>
-      </w:r>
-      <w:bookmarkStart w:id="6" w:name="_cxon0n7msjii"/>
-      <w:bookmarkEnd w:id="6"/>
+      <w:bookmarkStart w:id="3" w:name="_cxon0n7msjii"/>
+      <w:bookmarkEnd w:id="3"/>
     </w:p>
     <w:sectPr>
       <w:pgSz w:w="11909" w:h="16834"/>
@@ -2587,7 +4584,7 @@
 </file>
 
 <file path=word/numbering.xml><?xml version="1.0" encoding="utf-8"?>
-<w:numbering xmlns:wpc="http://schemas.microsoft.com/office/word/2010/wordprocessingCanvas" xmlns:cx="http://schemas.microsoft.com/office/drawing/2014/chartex" xmlns:cx1="http://schemas.microsoft.com/office/drawing/2015/9/8/chartex" xmlns:cx2="http://schemas.microsoft.com/office/drawing/2015/10/21/chartex" xmlns:cx3="http://schemas.microsoft.com/office/drawing/2016/5/9/chartex" xmlns:cx4="http://schemas.microsoft.com/office/drawing/2016/5/10/chartex" xmlns:cx5="http://schemas.microsoft.com/office/drawing/2016/5/11/chartex" xmlns:cx6="http://schemas.microsoft.com/office/drawing/2016/5/12/chartex" xmlns:cx7="http://schemas.microsoft.com/office/drawing/2016/5/13/chartex" xmlns:cx8="http://schemas.microsoft.com/office/drawing/2016/5/14/chartex" xmlns:mc="http://schemas.openxmlformats.org/markup-compatibility/2006" xmlns:aink="http://schemas.microsoft.com/office/drawing/2016/ink" xmlns:am3d="http://schemas.microsoft.com/office/drawing/2017/model3d" xmlns:o="urn:schemas-microsoft-com:office:office" xmlns:oel="http://schemas.microsoft.com/office/2019/extlst" xmlns:r="http://schemas.openxmlformats.org/officeDocument/2006/relationships" xmlns:m="http://schemas.openxmlformats.org/officeDocument/2006/math" xmlns:v="urn:schemas-microsoft-com:vml" xmlns:wp14="http://schemas.microsoft.com/office/word/2010/wordprocessingDrawing" xmlns:wp="http://schemas.openxmlformats.org/drawingml/2006/wordprocessingDrawing" xmlns:w10="urn:schemas-microsoft-com:office:word" xmlns:w="http://schemas.openxmlformats.org/wordprocessingml/2006/main" xmlns:w14="http://schemas.microsoft.com/office/word/2010/wordml" xmlns:w15="http://schemas.microsoft.com/office/word/2012/wordml" xmlns:w16cex="http://schemas.microsoft.com/office/word/2018/wordml/cex" xmlns:w16cid="http://schemas.microsoft.com/office/word/2016/wordml/cid" xmlns:w16="http://schemas.microsoft.com/office/word/2018/wordml" xmlns:w16du="http://schemas.microsoft.com/office/word/2023/wordml/word16du" xmlns:w16sdtdh="http://schemas.microsoft.com/office/word/2020/wordml/sdtdatahash" xmlns:w16se="http://schemas.microsoft.com/office/word/2015/wordml/symex" xmlns:wpg="http://schemas.microsoft.com/office/word/2010/wordprocessingGroup" xmlns:wpi="http://schemas.microsoft.com/office/word/2010/wordprocessingInk" xmlns:wne="http://schemas.microsoft.com/office/word/2006/wordml" xmlns:wps="http://schemas.microsoft.com/office/word/2010/wordprocessingShape" mc:Ignorable="w14 w15 w16se w16cid w16 w16cex w16sdtdh w16du wp14">
+<w:numbering xmlns:wpc="http://schemas.microsoft.com/office/word/2010/wordprocessingCanvas" xmlns:cx="http://schemas.microsoft.com/office/drawing/2014/chartex" xmlns:cx1="http://schemas.microsoft.com/office/drawing/2015/9/8/chartex" xmlns:cx2="http://schemas.microsoft.com/office/drawing/2015/10/21/chartex" xmlns:cx3="http://schemas.microsoft.com/office/drawing/2016/5/9/chartex" xmlns:cx4="http://schemas.microsoft.com/office/drawing/2016/5/10/chartex" xmlns:cx5="http://schemas.microsoft.com/office/drawing/2016/5/11/chartex" xmlns:cx6="http://schemas.microsoft.com/office/drawing/2016/5/12/chartex" xmlns:cx7="http://schemas.microsoft.com/office/drawing/2016/5/13/chartex" xmlns:cx8="http://schemas.microsoft.com/office/drawing/2016/5/14/chartex" xmlns:mc="http://schemas.openxmlformats.org/markup-compatibility/2006" xmlns:aink="http://schemas.microsoft.com/office/drawing/2016/ink" xmlns:am3d="http://schemas.microsoft.com/office/drawing/2017/model3d" xmlns:o="urn:schemas-microsoft-com:office:office" xmlns:oel="http://schemas.microsoft.com/office/2019/extlst" xmlns:r="http://schemas.openxmlformats.org/officeDocument/2006/relationships" xmlns:m="http://schemas.openxmlformats.org/officeDocument/2006/math" xmlns:v="urn:schemas-microsoft-com:vml" xmlns:wp14="http://schemas.microsoft.com/office/word/2010/wordprocessingDrawing" xmlns:wp="http://schemas.openxmlformats.org/drawingml/2006/wordprocessingDrawing" xmlns:w10="urn:schemas-microsoft-com:office:word" xmlns:w="http://schemas.openxmlformats.org/wordprocessingml/2006/main" xmlns:w14="http://schemas.microsoft.com/office/word/2010/wordml" xmlns:w15="http://schemas.microsoft.com/office/word/2012/wordml" xmlns:w16cex="http://schemas.microsoft.com/office/word/2018/wordml/cex" xmlns:w16cid="http://schemas.microsoft.com/office/word/2016/wordml/cid" xmlns:w16="http://schemas.microsoft.com/office/word/2018/wordml" xmlns:w16du="http://schemas.microsoft.com/office/word/2023/wordml/word16du" xmlns:w16sdtdh="http://schemas.microsoft.com/office/word/2020/wordml/sdtdatahash" xmlns:w16sdtfl="http://schemas.microsoft.com/office/word/2024/wordml/sdtformatlock" xmlns:w16se="http://schemas.microsoft.com/office/word/2015/wordml/symex" xmlns:wpg="http://schemas.microsoft.com/office/word/2010/wordprocessingGroup" xmlns:wpi="http://schemas.microsoft.com/office/word/2010/wordprocessingInk" xmlns:wne="http://schemas.microsoft.com/office/word/2006/wordml" xmlns:wps="http://schemas.microsoft.com/office/word/2010/wordprocessingShape" mc:Ignorable="w14 w15 w16se w16cid w16 w16cex w16sdtdh w16sdtfl w16du wp14">
   <w:abstractNum w:abstractNumId="0" w15:restartNumberingAfterBreak="0">
     <w:nsid w:val="34100E88"/>
     <w:multiLevelType w:val="multilevel"/>
@@ -2878,7 +4875,7 @@
 </file>
 
 <file path=word/styles.xml><?xml version="1.0" encoding="utf-8"?>
-<w:styles xmlns:mc="http://schemas.openxmlformats.org/markup-compatibility/2006" xmlns:r="http://schemas.openxmlformats.org/officeDocument/2006/relationships" xmlns:w="http://schemas.openxmlformats.org/wordprocessingml/2006/main" xmlns:w14="http://schemas.microsoft.com/office/word/2010/wordml" xmlns:w15="http://schemas.microsoft.com/office/word/2012/wordml" xmlns:w16cex="http://schemas.microsoft.com/office/word/2018/wordml/cex" xmlns:w16cid="http://schemas.microsoft.com/office/word/2016/wordml/cid" xmlns:w16="http://schemas.microsoft.com/office/word/2018/wordml" xmlns:w16du="http://schemas.microsoft.com/office/word/2023/wordml/word16du" xmlns:w16sdtdh="http://schemas.microsoft.com/office/word/2020/wordml/sdtdatahash" xmlns:w16se="http://schemas.microsoft.com/office/word/2015/wordml/symex" mc:Ignorable="w14 w15 w16se w16cid w16 w16cex w16sdtdh w16du">
+<w:styles xmlns:mc="http://schemas.openxmlformats.org/markup-compatibility/2006" xmlns:r="http://schemas.openxmlformats.org/officeDocument/2006/relationships" xmlns:w="http://schemas.openxmlformats.org/wordprocessingml/2006/main" xmlns:w14="http://schemas.microsoft.com/office/word/2010/wordml" xmlns:w15="http://schemas.microsoft.com/office/word/2012/wordml" xmlns:w16cex="http://schemas.microsoft.com/office/word/2018/wordml/cex" xmlns:w16cid="http://schemas.microsoft.com/office/word/2016/wordml/cid" xmlns:w16="http://schemas.microsoft.com/office/word/2018/wordml" xmlns:w16du="http://schemas.microsoft.com/office/word/2023/wordml/word16du" xmlns:w16sdtdh="http://schemas.microsoft.com/office/word/2020/wordml/sdtdatahash" xmlns:w16sdtfl="http://schemas.microsoft.com/office/word/2024/wordml/sdtformatlock" xmlns:w16se="http://schemas.microsoft.com/office/word/2015/wordml/symex" mc:Ignorable="w14 w15 w16se w16cid w16 w16cex w16sdtdh w16sdtfl w16du">
   <w:docDefaults>
     <w:rPrDefault>
       <w:rPr>

</xml_diff>

<commit_message>
Docs update (UCLA - NEW SCOPE)
</commit_message>
<xml_diff>
--- a/docs/UCLA - NEW SCOPE.docx
+++ b/docs/UCLA - NEW SCOPE.docx
@@ -797,31 +797,7 @@
                 <w:szCs w:val="24"/>
                 <w:lang w:val="en-IE"/>
               </w:rPr>
-              <w:t xml:space="preserve">The user </w:t>
-            </w:r>
-            <w:r>
-              <w:rPr>
-                <w:sz w:val="24"/>
-                <w:szCs w:val="24"/>
-                <w:lang w:val="en-IE"/>
-              </w:rPr>
-              <w:t>wants</w:t>
-            </w:r>
-            <w:r>
-              <w:rPr>
-                <w:sz w:val="24"/>
-                <w:szCs w:val="24"/>
-                <w:lang w:val="en-IE"/>
-              </w:rPr>
-              <w:t xml:space="preserve"> </w:t>
-            </w:r>
-            <w:r>
-              <w:rPr>
-                <w:sz w:val="24"/>
-                <w:szCs w:val="24"/>
-                <w:lang w:val="en-IE"/>
-              </w:rPr>
-              <w:t>to skip the login and/or registration to start using the application with limited features.</w:t>
+              <w:t>The user wants to skip the login and/or registration to start using the application with limited features.</w:t>
             </w:r>
           </w:p>
         </w:tc>
@@ -1651,31 +1627,7 @@
                 <w:szCs w:val="24"/>
                 <w:lang w:val="en-IE"/>
               </w:rPr>
-              <w:t>The user wants to delete/reposition a specific length of the vide</w:t>
-            </w:r>
-            <w:r>
-              <w:rPr>
-                <w:sz w:val="24"/>
-                <w:szCs w:val="24"/>
-                <w:lang w:val="en-IE"/>
-              </w:rPr>
-              <w:t>o</w:t>
-            </w:r>
-            <w:r>
-              <w:rPr>
-                <w:sz w:val="24"/>
-                <w:szCs w:val="24"/>
-                <w:lang w:val="en-IE"/>
-              </w:rPr>
-              <w:t xml:space="preserve"> (e.g. a video with 1 minute length has been imported, and the user wants to place the last 10 seconds of the clip at the start of the clip or, the user wants to delete the part from 15 - 35 seconds, the user would have to select that length first, which will require to divide the clip into more parts/applies for audio track the same way)</w:t>
-            </w:r>
-            <w:r>
-              <w:rPr>
-                <w:sz w:val="24"/>
-                <w:szCs w:val="24"/>
-                <w:lang w:val="en-IE"/>
-              </w:rPr>
-              <w:t xml:space="preserve">. </w:t>
+              <w:t xml:space="preserve">The user wants to delete/reposition a specific length of the video (e.g. a video with 1 minute length has been imported, and the user wants to place the last 10 seconds of the clip at the start of the clip or, the user wants to delete the part from 15 - 35 seconds, the user would have to select that length first, which will require to divide the clip into more parts/applies for audio track the same way). </w:t>
             </w:r>
             <w:proofErr w:type="gramStart"/>
             <w:r>
@@ -1795,15 +1747,7 @@
                 <w:szCs w:val="24"/>
                 <w:lang w:val="en-IE"/>
               </w:rPr>
-              <w:t xml:space="preserve">Remove </w:t>
-            </w:r>
-            <w:r>
-              <w:rPr>
-                <w:sz w:val="24"/>
-                <w:szCs w:val="24"/>
-                <w:lang w:val="en-IE"/>
-              </w:rPr>
-              <w:t>video/audio.</w:t>
+              <w:t>Remove video/audio.</w:t>
             </w:r>
           </w:p>
         </w:tc>
@@ -1947,47 +1891,7 @@
                 <w:szCs w:val="24"/>
                 <w:lang w:val="en-IE"/>
               </w:rPr>
-              <w:t>The user wants to delete</w:t>
-            </w:r>
-            <w:r>
-              <w:rPr>
-                <w:sz w:val="24"/>
-                <w:szCs w:val="24"/>
-                <w:lang w:val="en-IE"/>
-              </w:rPr>
-              <w:t xml:space="preserve"> a specific length of the video. A selected segment would be removed from the timeline. (e.g. </w:t>
-            </w:r>
-            <w:r>
-              <w:rPr>
-                <w:sz w:val="24"/>
-                <w:szCs w:val="24"/>
-                <w:lang w:val="en-IE"/>
-              </w:rPr>
-              <w:t xml:space="preserve">a video with 1 minute length has been imported, and the user wants to </w:t>
-            </w:r>
-            <w:r>
-              <w:rPr>
-                <w:sz w:val="24"/>
-                <w:szCs w:val="24"/>
-                <w:lang w:val="en-IE"/>
-              </w:rPr>
-              <w:t>remove</w:t>
-            </w:r>
-            <w:r>
-              <w:rPr>
-                <w:sz w:val="24"/>
-                <w:szCs w:val="24"/>
-                <w:lang w:val="en-IE"/>
-              </w:rPr>
-              <w:t xml:space="preserve"> the last 10 seconds of the </w:t>
-            </w:r>
-            <w:r>
-              <w:rPr>
-                <w:sz w:val="24"/>
-                <w:szCs w:val="24"/>
-                <w:lang w:val="en-IE"/>
-              </w:rPr>
-              <w:t>video, it would result from 2 segments, in 1 segment with length of 50 seconds excluding the last 10 seconds of the video).</w:t>
+              <w:t>The user wants to delete a specific length of the video. A selected segment would be removed from the timeline. (e.g. a video with 1 minute length has been imported, and the user wants to remove the last 10 seconds of the video, it would result from 2 segments, in 1 segment with length of 50 seconds excluding the last 10 seconds of the video).</w:t>
             </w:r>
           </w:p>
         </w:tc>
@@ -2089,15 +1993,7 @@
                 <w:szCs w:val="24"/>
                 <w:lang w:val="en-IE"/>
               </w:rPr>
-              <w:t>Move</w:t>
-            </w:r>
-            <w:r>
-              <w:rPr>
-                <w:sz w:val="24"/>
-                <w:szCs w:val="24"/>
-                <w:lang w:val="en-IE"/>
-              </w:rPr>
-              <w:t xml:space="preserve"> video/audio.</w:t>
+              <w:t>Move video/audio.</w:t>
             </w:r>
           </w:p>
         </w:tc>
@@ -2241,167 +2137,7 @@
                 <w:szCs w:val="24"/>
                 <w:lang w:val="en-IE"/>
               </w:rPr>
-              <w:t xml:space="preserve">The user wants to </w:t>
-            </w:r>
-            <w:r>
-              <w:rPr>
-                <w:sz w:val="24"/>
-                <w:szCs w:val="24"/>
-                <w:lang w:val="en-IE"/>
-              </w:rPr>
-              <w:t>move</w:t>
-            </w:r>
-            <w:r>
-              <w:rPr>
-                <w:sz w:val="24"/>
-                <w:szCs w:val="24"/>
-                <w:lang w:val="en-IE"/>
-              </w:rPr>
-              <w:t xml:space="preserve"> a specific length of the video</w:t>
-            </w:r>
-            <w:r>
-              <w:rPr>
-                <w:sz w:val="24"/>
-                <w:szCs w:val="24"/>
-                <w:lang w:val="en-IE"/>
-              </w:rPr>
-              <w:t xml:space="preserve"> at start/end or any position on the timeline</w:t>
-            </w:r>
-            <w:r>
-              <w:rPr>
-                <w:sz w:val="24"/>
-                <w:szCs w:val="24"/>
-                <w:lang w:val="en-IE"/>
-              </w:rPr>
-              <w:t xml:space="preserve">. A selected segment would be </w:t>
-            </w:r>
-            <w:r>
-              <w:rPr>
-                <w:sz w:val="24"/>
-                <w:szCs w:val="24"/>
-                <w:lang w:val="en-IE"/>
-              </w:rPr>
-              <w:t>moved</w:t>
-            </w:r>
-            <w:r>
-              <w:rPr>
-                <w:sz w:val="24"/>
-                <w:szCs w:val="24"/>
-                <w:lang w:val="en-IE"/>
-              </w:rPr>
-              <w:t xml:space="preserve"> </w:t>
-            </w:r>
-            <w:r>
-              <w:rPr>
-                <w:sz w:val="24"/>
-                <w:szCs w:val="24"/>
-                <w:lang w:val="en-IE"/>
-              </w:rPr>
-              <w:t>with use of drag-&amp;-drop functionality</w:t>
-            </w:r>
-            <w:r>
-              <w:rPr>
-                <w:sz w:val="24"/>
-                <w:szCs w:val="24"/>
-                <w:lang w:val="en-IE"/>
-              </w:rPr>
-              <w:t xml:space="preserve">. (e.g. a video with 1 minute length has been imported, and the user wants to </w:t>
-            </w:r>
-            <w:r>
-              <w:rPr>
-                <w:sz w:val="24"/>
-                <w:szCs w:val="24"/>
-                <w:lang w:val="en-IE"/>
-              </w:rPr>
-              <w:t>move</w:t>
-            </w:r>
-            <w:r>
-              <w:rPr>
-                <w:sz w:val="24"/>
-                <w:szCs w:val="24"/>
-                <w:lang w:val="en-IE"/>
-              </w:rPr>
-              <w:t xml:space="preserve"> the last 10 seconds of the video</w:t>
-            </w:r>
-            <w:r>
-              <w:rPr>
-                <w:sz w:val="24"/>
-                <w:szCs w:val="24"/>
-                <w:lang w:val="en-IE"/>
-              </w:rPr>
-              <w:t xml:space="preserve"> at the start</w:t>
-            </w:r>
-            <w:r>
-              <w:rPr>
-                <w:sz w:val="24"/>
-                <w:szCs w:val="24"/>
-                <w:lang w:val="en-IE"/>
-              </w:rPr>
-              <w:t>, it would result from 2 segments</w:t>
-            </w:r>
-            <w:r>
-              <w:rPr>
-                <w:sz w:val="24"/>
-                <w:szCs w:val="24"/>
-                <w:lang w:val="en-IE"/>
-              </w:rPr>
-              <w:t xml:space="preserve"> after the split</w:t>
-            </w:r>
-            <w:r>
-              <w:rPr>
-                <w:sz w:val="24"/>
-                <w:szCs w:val="24"/>
-                <w:lang w:val="en-IE"/>
-              </w:rPr>
-              <w:t xml:space="preserve">, in segment </w:t>
-            </w:r>
-            <w:r>
-              <w:rPr>
-                <w:sz w:val="24"/>
-                <w:szCs w:val="24"/>
-                <w:lang w:val="en-IE"/>
-              </w:rPr>
-              <w:t xml:space="preserve">nr. 2 </w:t>
-            </w:r>
-            <w:r>
-              <w:rPr>
-                <w:sz w:val="24"/>
-                <w:szCs w:val="24"/>
-                <w:lang w:val="en-IE"/>
-              </w:rPr>
-              <w:t xml:space="preserve">with length of </w:t>
-            </w:r>
-            <w:r>
-              <w:rPr>
-                <w:sz w:val="24"/>
-                <w:szCs w:val="24"/>
-                <w:lang w:val="en-IE"/>
-              </w:rPr>
-              <w:t>1</w:t>
-            </w:r>
-            <w:r>
-              <w:rPr>
-                <w:sz w:val="24"/>
-                <w:szCs w:val="24"/>
-                <w:lang w:val="en-IE"/>
-              </w:rPr>
-              <w:t xml:space="preserve">0 seconds </w:t>
-            </w:r>
-            <w:r>
-              <w:rPr>
-                <w:sz w:val="24"/>
-                <w:szCs w:val="24"/>
-                <w:lang w:val="en-IE"/>
-              </w:rPr>
-              <w:t>and segment nr. 1 with 50 seconds length</w:t>
-            </w:r>
-            <w:r>
-              <w:rPr>
-                <w:sz w:val="24"/>
-                <w:szCs w:val="24"/>
-                <w:lang w:val="en-IE"/>
-              </w:rPr>
-              <w:t>).</w:t>
+              <w:t>The user wants to move a specific length of the video at start/end or any position on the timeline. A selected segment would be moved with use of drag-&amp;-drop functionality. (e.g. a video with 1 minute length has been imported, and the user wants to move the last 10 seconds of the video at the start, it would result from 2 segments after the split, in segment nr. 2 with length of 10 seconds and segment nr. 1 with 50 seconds length).</w:t>
             </w:r>
           </w:p>
         </w:tc>
@@ -2909,15 +2645,7 @@
                 <w:szCs w:val="24"/>
                 <w:lang w:val="en-IE"/>
               </w:rPr>
-              <w:t xml:space="preserve">The user wants to see the changes he/she made to the clip, </w:t>
-            </w:r>
-            <w:r>
-              <w:rPr>
-                <w:sz w:val="24"/>
-                <w:szCs w:val="24"/>
-                <w:lang w:val="en-IE"/>
-              </w:rPr>
-              <w:t>based on where the timestamp pointer is, the VLC media-player would play the clip from that timestamp.</w:t>
+              <w:t>The user wants to see the changes he/she made to the clip, based on where the timestamp pointer is, the VLC media-player would play the clip from that timestamp.</w:t>
             </w:r>
           </w:p>
         </w:tc>
@@ -3019,7 +2747,7 @@
                 <w:szCs w:val="24"/>
                 <w:lang w:val="en-IE"/>
               </w:rPr>
-              <w:t>Play preview.</w:t>
+              <w:t>Pause preview.</w:t>
             </w:r>
           </w:p>
         </w:tc>
@@ -3163,23 +2891,7 @@
                 <w:szCs w:val="24"/>
                 <w:lang w:val="en-IE"/>
               </w:rPr>
-              <w:t xml:space="preserve">The user wants to see the changes he/she made to the clip, based on where the timestamp pointer is, the </w:t>
-            </w:r>
-            <w:r>
-              <w:rPr>
-                <w:sz w:val="24"/>
-                <w:szCs w:val="24"/>
-                <w:lang w:val="en-IE"/>
-              </w:rPr>
-              <w:t>VLC</w:t>
-            </w:r>
-            <w:r>
-              <w:rPr>
-                <w:sz w:val="24"/>
-                <w:szCs w:val="24"/>
-                <w:lang w:val="en-IE"/>
-              </w:rPr>
-              <w:t xml:space="preserve"> media-player would play the clip from that timestamp.</w:t>
+              <w:t>The user wants to pause the preview. Based on where the timestamp pointer is, the VLC-media player would stop the clip at that timestamp.</w:t>
             </w:r>
           </w:p>
         </w:tc>
@@ -3281,23 +2993,7 @@
                 <w:szCs w:val="24"/>
                 <w:lang w:val="en-IE"/>
               </w:rPr>
-              <w:t>P</w:t>
-            </w:r>
-            <w:r>
-              <w:rPr>
-                <w:sz w:val="24"/>
-                <w:szCs w:val="24"/>
-                <w:lang w:val="en-IE"/>
-              </w:rPr>
-              <w:t>ause</w:t>
-            </w:r>
-            <w:r>
-              <w:rPr>
-                <w:sz w:val="24"/>
-                <w:szCs w:val="24"/>
-                <w:lang w:val="en-IE"/>
-              </w:rPr>
-              <w:t xml:space="preserve"> preview.</w:t>
+              <w:t>Scroll through timeline.</w:t>
             </w:r>
           </w:p>
         </w:tc>
@@ -3441,15 +3137,40 @@
                 <w:szCs w:val="24"/>
                 <w:lang w:val="en-IE"/>
               </w:rPr>
-              <w:t xml:space="preserve">The user wants to </w:t>
-            </w:r>
-            <w:r>
-              <w:rPr>
-                <w:sz w:val="24"/>
-                <w:szCs w:val="24"/>
-                <w:lang w:val="en-IE"/>
-              </w:rPr>
-              <w:t>pause the preview. Based on where the timestamp pointer is, the VLC-media player would stop the clip at that timestamp.</w:t>
+              <w:t xml:space="preserve">The user wants to find a certain moment from the video/audio (e.g. the part the user wants to remove or apply operations on). </w:t>
+            </w:r>
+          </w:p>
+          <w:p>
+            <w:pPr>
+              <w:rPr>
+                <w:sz w:val="24"/>
+                <w:szCs w:val="24"/>
+                <w:lang w:val="en-IE"/>
+              </w:rPr>
+            </w:pPr>
+            <w:r>
+              <w:rPr>
+                <w:sz w:val="24"/>
+                <w:szCs w:val="24"/>
+                <w:lang w:val="en-IE"/>
+              </w:rPr>
+              <w:t>Using the VLC-media player, it would update it</w:t>
+            </w:r>
+            <w:r>
+              <w:rPr>
+                <w:sz w:val="24"/>
+                <w:szCs w:val="24"/>
+                <w:lang w:val="en-IE"/>
+              </w:rPr>
+              <w:t>s</w:t>
+            </w:r>
+            <w:r>
+              <w:rPr>
+                <w:sz w:val="24"/>
+                <w:szCs w:val="24"/>
+                <w:lang w:val="en-IE"/>
+              </w:rPr>
+              <w:t xml:space="preserve"> timestamp based on where the timestamp pointer is dragged, providing user with fast glance of media file. The media player would update its thumbnail each millisecond when scrolling.</w:t>
             </w:r>
           </w:p>
         </w:tc>
@@ -3551,7 +3272,7 @@
                 <w:szCs w:val="24"/>
                 <w:lang w:val="en-IE"/>
               </w:rPr>
-              <w:t>Scroll through timeline.</w:t>
+              <w:t>Specify preview settings</w:t>
             </w:r>
           </w:p>
         </w:tc>
@@ -3695,70 +3416,8 @@
                 <w:szCs w:val="24"/>
                 <w:lang w:val="en-IE"/>
               </w:rPr>
-              <w:t xml:space="preserve">The user wants to find a certain moment from the video/audio (e.g. the part the user wants to remove or apply operations on). </w:t>
-            </w:r>
-          </w:p>
-          <w:p>
-            <w:pPr>
-              <w:rPr>
-                <w:sz w:val="24"/>
-                <w:szCs w:val="24"/>
-                <w:lang w:val="en-IE"/>
-              </w:rPr>
-            </w:pPr>
-            <w:r>
-              <w:rPr>
-                <w:sz w:val="24"/>
-                <w:szCs w:val="24"/>
-                <w:lang w:val="en-IE"/>
-              </w:rPr>
-              <w:t>Using the VLC-media player, it would update it</w:t>
-            </w:r>
-            <w:r>
-              <w:rPr>
-                <w:sz w:val="24"/>
-                <w:szCs w:val="24"/>
-                <w:lang w:val="en-IE"/>
-              </w:rPr>
-              <w:t>s</w:t>
-            </w:r>
-            <w:r>
-              <w:rPr>
-                <w:sz w:val="24"/>
-                <w:szCs w:val="24"/>
-                <w:lang w:val="en-IE"/>
-              </w:rPr>
-              <w:t xml:space="preserve"> timestamp based on where the timestamp pointer is dragged, providing user with fast glance of media file. The media player would update its thumbnail each millisecond when scrolling.</w:t>
-            </w:r>
-          </w:p>
-        </w:tc>
-      </w:tr>
-      <w:tr>
-        <w:tc>
-          <w:tcPr>
-            <w:tcW w:w="2085" w:type="dxa"/>
-            <w:tcBorders>
-              <w:top w:val="single" w:sz="8" w:space="0" w:color="000000"/>
-              <w:left w:val="single" w:sz="8" w:space="0" w:color="000000"/>
-              <w:bottom w:val="single" w:sz="8" w:space="0" w:color="000000"/>
-              <w:right w:val="single" w:sz="8" w:space="0" w:color="000000"/>
-            </w:tcBorders>
-            <w:tcMar>
-              <w:top w:w="100" w:type="dxa"/>
-              <w:left w:w="100" w:type="dxa"/>
-              <w:bottom w:w="100" w:type="dxa"/>
-              <w:right w:w="100" w:type="dxa"/>
-            </w:tcMar>
-            <w:hideMark/>
-          </w:tcPr>
-          <w:p>
-            <w:pPr>
-              <w:rPr>
-                <w:sz w:val="24"/>
-                <w:szCs w:val="24"/>
-                <w:lang w:val="en-IE"/>
-              </w:rPr>
-            </w:pPr>
+              <w:t xml:space="preserve">The user wants to set specific preview settings in order to visualize the timeline, user would be able to set those and choose the right settings based on their hardware </w:t>
+            </w:r>
             <w:r>
               <w:rPr>
                 <w:sz w:val="24"/>
@@ -3766,210 +3425,7 @@
                 <w:lang w:val="en-IE"/>
               </w:rPr>
               <w:lastRenderedPageBreak/>
-              <w:t>Title (goal)</w:t>
-            </w:r>
-          </w:p>
-        </w:tc>
-        <w:tc>
-          <w:tcPr>
-            <w:tcW w:w="6915" w:type="dxa"/>
-            <w:tcBorders>
-              <w:top w:val="single" w:sz="8" w:space="0" w:color="000000"/>
-              <w:left w:val="single" w:sz="8" w:space="0" w:color="000000"/>
-              <w:bottom w:val="single" w:sz="8" w:space="0" w:color="000000"/>
-              <w:right w:val="single" w:sz="8" w:space="0" w:color="000000"/>
-            </w:tcBorders>
-            <w:tcMar>
-              <w:top w:w="100" w:type="dxa"/>
-              <w:left w:w="100" w:type="dxa"/>
-              <w:bottom w:w="100" w:type="dxa"/>
-              <w:right w:w="100" w:type="dxa"/>
-            </w:tcMar>
-            <w:hideMark/>
-          </w:tcPr>
-          <w:p>
-            <w:pPr>
-              <w:rPr>
-                <w:sz w:val="24"/>
-                <w:szCs w:val="24"/>
-                <w:lang w:val="en-IE"/>
-              </w:rPr>
-            </w:pPr>
-            <w:r>
-              <w:rPr>
-                <w:sz w:val="24"/>
-                <w:szCs w:val="24"/>
-                <w:lang w:val="en-IE"/>
-              </w:rPr>
-              <w:t>S</w:t>
-            </w:r>
-            <w:r>
-              <w:rPr>
-                <w:sz w:val="24"/>
-                <w:szCs w:val="24"/>
-                <w:lang w:val="en-IE"/>
-              </w:rPr>
-              <w:t>pecify preview settings</w:t>
-            </w:r>
-          </w:p>
-        </w:tc>
-      </w:tr>
-      <w:tr>
-        <w:tc>
-          <w:tcPr>
-            <w:tcW w:w="2085" w:type="dxa"/>
-            <w:tcBorders>
-              <w:top w:val="single" w:sz="8" w:space="0" w:color="000000"/>
-              <w:left w:val="single" w:sz="8" w:space="0" w:color="000000"/>
-              <w:bottom w:val="single" w:sz="8" w:space="0" w:color="000000"/>
-              <w:right w:val="single" w:sz="8" w:space="0" w:color="000000"/>
-            </w:tcBorders>
-            <w:tcMar>
-              <w:top w:w="100" w:type="dxa"/>
-              <w:left w:w="100" w:type="dxa"/>
-              <w:bottom w:w="100" w:type="dxa"/>
-              <w:right w:w="100" w:type="dxa"/>
-            </w:tcMar>
-            <w:hideMark/>
-          </w:tcPr>
-          <w:p>
-            <w:pPr>
-              <w:rPr>
-                <w:sz w:val="24"/>
-                <w:szCs w:val="24"/>
-                <w:lang w:val="en-IE"/>
-              </w:rPr>
-            </w:pPr>
-            <w:r>
-              <w:rPr>
-                <w:sz w:val="24"/>
-                <w:szCs w:val="24"/>
-                <w:lang w:val="en-IE"/>
-              </w:rPr>
-              <w:t>Primary Actor</w:t>
-            </w:r>
-          </w:p>
-        </w:tc>
-        <w:tc>
-          <w:tcPr>
-            <w:tcW w:w="6915" w:type="dxa"/>
-            <w:tcBorders>
-              <w:top w:val="single" w:sz="8" w:space="0" w:color="000000"/>
-              <w:left w:val="single" w:sz="8" w:space="0" w:color="000000"/>
-              <w:bottom w:val="single" w:sz="8" w:space="0" w:color="000000"/>
-              <w:right w:val="single" w:sz="8" w:space="0" w:color="000000"/>
-            </w:tcBorders>
-            <w:tcMar>
-              <w:top w:w="100" w:type="dxa"/>
-              <w:left w:w="100" w:type="dxa"/>
-              <w:bottom w:w="100" w:type="dxa"/>
-              <w:right w:w="100" w:type="dxa"/>
-            </w:tcMar>
-            <w:hideMark/>
-          </w:tcPr>
-          <w:p>
-            <w:pPr>
-              <w:rPr>
-                <w:sz w:val="24"/>
-                <w:szCs w:val="24"/>
-                <w:lang w:val="en-IE"/>
-              </w:rPr>
-            </w:pPr>
-            <w:r>
-              <w:rPr>
-                <w:sz w:val="24"/>
-                <w:szCs w:val="24"/>
-                <w:lang w:val="en-IE"/>
-              </w:rPr>
-              <w:t>User</w:t>
-            </w:r>
-          </w:p>
-        </w:tc>
-      </w:tr>
-      <w:tr>
-        <w:tc>
-          <w:tcPr>
-            <w:tcW w:w="2085" w:type="dxa"/>
-            <w:tcBorders>
-              <w:top w:val="single" w:sz="8" w:space="0" w:color="000000"/>
-              <w:left w:val="single" w:sz="8" w:space="0" w:color="000000"/>
-              <w:bottom w:val="single" w:sz="8" w:space="0" w:color="000000"/>
-              <w:right w:val="single" w:sz="8" w:space="0" w:color="000000"/>
-            </w:tcBorders>
-            <w:tcMar>
-              <w:top w:w="100" w:type="dxa"/>
-              <w:left w:w="100" w:type="dxa"/>
-              <w:bottom w:w="100" w:type="dxa"/>
-              <w:right w:w="100" w:type="dxa"/>
-            </w:tcMar>
-            <w:hideMark/>
-          </w:tcPr>
-          <w:p>
-            <w:pPr>
-              <w:rPr>
-                <w:sz w:val="24"/>
-                <w:szCs w:val="24"/>
-                <w:lang w:val="en-IE"/>
-              </w:rPr>
-            </w:pPr>
-            <w:r>
-              <w:rPr>
-                <w:sz w:val="24"/>
-                <w:szCs w:val="24"/>
-                <w:lang w:val="en-IE"/>
-              </w:rPr>
-              <w:t>Story</w:t>
-            </w:r>
-          </w:p>
-        </w:tc>
-        <w:tc>
-          <w:tcPr>
-            <w:tcW w:w="6915" w:type="dxa"/>
-            <w:tcBorders>
-              <w:top w:val="single" w:sz="8" w:space="0" w:color="000000"/>
-              <w:left w:val="single" w:sz="8" w:space="0" w:color="000000"/>
-              <w:bottom w:val="single" w:sz="8" w:space="0" w:color="000000"/>
-              <w:right w:val="single" w:sz="8" w:space="0" w:color="000000"/>
-            </w:tcBorders>
-            <w:tcMar>
-              <w:top w:w="100" w:type="dxa"/>
-              <w:left w:w="100" w:type="dxa"/>
-              <w:bottom w:w="100" w:type="dxa"/>
-              <w:right w:w="100" w:type="dxa"/>
-            </w:tcMar>
-            <w:hideMark/>
-          </w:tcPr>
-          <w:p>
-            <w:pPr>
-              <w:rPr>
-                <w:sz w:val="24"/>
-                <w:szCs w:val="24"/>
-                <w:lang w:val="en-IE"/>
-              </w:rPr>
-            </w:pPr>
-            <w:r>
-              <w:rPr>
-                <w:sz w:val="24"/>
-                <w:szCs w:val="24"/>
-                <w:lang w:val="en-IE"/>
-              </w:rPr>
-              <w:t xml:space="preserve">The user wants to </w:t>
-            </w:r>
-            <w:r>
-              <w:rPr>
-                <w:sz w:val="24"/>
-                <w:szCs w:val="24"/>
-                <w:lang w:val="en-IE"/>
-              </w:rPr>
-              <w:t>set specific preview settings in order to visualize the timeline, user would be able to set those and choose the right settings based on their hardware compatibilities, better settings results in more hardware resource usage, less settings results in less hardware resource usage, this directly impact how fast the preview is generated</w:t>
-            </w:r>
-            <w:r>
-              <w:rPr>
-                <w:sz w:val="24"/>
-                <w:szCs w:val="24"/>
-                <w:lang w:val="en-IE"/>
-              </w:rPr>
-              <w:t xml:space="preserve"> after certain changes so it directly depends on hardware the machine holds, therefore providing user with a way to select the best settings for comfortable use.</w:t>
+              <w:t>compatibilities, better settings results in more hardware resource usage, less settings results in less hardware resource usage, this directly impact how fast the preview is generated after certain changes so it directly depends on hardware the machine holds, therefore providing user with a way to select the best settings for comfortable use.</w:t>
             </w:r>
           </w:p>
         </w:tc>
@@ -3977,7 +3433,6 @@
     </w:tbl>
     <w:p>
       <w:pPr>
-        <w:jc w:val="center"/>
         <w:rPr>
           <w:sz w:val="24"/>
           <w:szCs w:val="24"/>
@@ -4071,7 +3526,7 @@
                 <w:szCs w:val="24"/>
                 <w:lang w:val="en-IE"/>
               </w:rPr>
-              <w:t>Pause preview.</w:t>
+              <w:t>Render the output</w:t>
             </w:r>
           </w:p>
         </w:tc>
@@ -4215,7 +3670,15 @@
                 <w:szCs w:val="24"/>
                 <w:lang w:val="en-IE"/>
               </w:rPr>
-              <w:t>The user wants to pause the preview. Based on where the timestamp pointer is, the VLC-media player would stop the clip at that timestamp.</w:t>
+              <w:t xml:space="preserve">The user wants to </w:t>
+            </w:r>
+            <w:r>
+              <w:rPr>
+                <w:sz w:val="24"/>
+                <w:szCs w:val="24"/>
+                <w:lang w:val="en-IE"/>
+              </w:rPr>
+              <w:t>export the final product, a tab would allow the user to specify render settings such as: fps (frames per second); width/height of the video; acceleration type based on what video graphics card the user hold if there are any suitable; maximum amount of CPU usage; location to export the file.</w:t>
             </w:r>
           </w:p>
         </w:tc>
@@ -4231,6 +3694,242 @@
         </w:rPr>
       </w:pPr>
     </w:p>
+    <w:tbl>
+      <w:tblPr>
+        <w:tblW w:w="9000" w:type="dxa"/>
+        <w:tblInd w:w="100" w:type="dxa"/>
+        <w:tblBorders>
+          <w:top w:val="single" w:sz="8" w:space="0" w:color="000000"/>
+          <w:left w:val="single" w:sz="8" w:space="0" w:color="000000"/>
+          <w:bottom w:val="single" w:sz="8" w:space="0" w:color="000000"/>
+          <w:right w:val="single" w:sz="8" w:space="0" w:color="000000"/>
+          <w:insideH w:val="single" w:sz="8" w:space="0" w:color="000000"/>
+          <w:insideV w:val="single" w:sz="8" w:space="0" w:color="000000"/>
+        </w:tblBorders>
+        <w:tblLayout w:type="fixed"/>
+        <w:tblLook w:val="0600" w:firstRow="0" w:lastRow="0" w:firstColumn="0" w:lastColumn="0" w:noHBand="1" w:noVBand="1"/>
+      </w:tblPr>
+      <w:tblGrid>
+        <w:gridCol w:w="2085"/>
+        <w:gridCol w:w="6915"/>
+      </w:tblGrid>
+      <w:tr>
+        <w:tc>
+          <w:tcPr>
+            <w:tcW w:w="2085" w:type="dxa"/>
+            <w:tcBorders>
+              <w:top w:val="single" w:sz="8" w:space="0" w:color="000000"/>
+              <w:left w:val="single" w:sz="8" w:space="0" w:color="000000"/>
+              <w:bottom w:val="single" w:sz="8" w:space="0" w:color="000000"/>
+              <w:right w:val="single" w:sz="8" w:space="0" w:color="000000"/>
+            </w:tcBorders>
+            <w:tcMar>
+              <w:top w:w="100" w:type="dxa"/>
+              <w:left w:w="100" w:type="dxa"/>
+              <w:bottom w:w="100" w:type="dxa"/>
+              <w:right w:w="100" w:type="dxa"/>
+            </w:tcMar>
+            <w:hideMark/>
+          </w:tcPr>
+          <w:p>
+            <w:pPr>
+              <w:rPr>
+                <w:sz w:val="24"/>
+                <w:szCs w:val="24"/>
+                <w:lang w:val="en-IE"/>
+              </w:rPr>
+            </w:pPr>
+            <w:r>
+              <w:rPr>
+                <w:sz w:val="24"/>
+                <w:szCs w:val="24"/>
+                <w:lang w:val="en-IE"/>
+              </w:rPr>
+              <w:t>Title (goal)</w:t>
+            </w:r>
+          </w:p>
+        </w:tc>
+        <w:tc>
+          <w:tcPr>
+            <w:tcW w:w="6915" w:type="dxa"/>
+            <w:tcBorders>
+              <w:top w:val="single" w:sz="8" w:space="0" w:color="000000"/>
+              <w:left w:val="single" w:sz="8" w:space="0" w:color="000000"/>
+              <w:bottom w:val="single" w:sz="8" w:space="0" w:color="000000"/>
+              <w:right w:val="single" w:sz="8" w:space="0" w:color="000000"/>
+            </w:tcBorders>
+            <w:tcMar>
+              <w:top w:w="100" w:type="dxa"/>
+              <w:left w:w="100" w:type="dxa"/>
+              <w:bottom w:w="100" w:type="dxa"/>
+              <w:right w:w="100" w:type="dxa"/>
+            </w:tcMar>
+            <w:hideMark/>
+          </w:tcPr>
+          <w:p>
+            <w:pPr>
+              <w:rPr>
+                <w:sz w:val="24"/>
+                <w:szCs w:val="24"/>
+                <w:lang w:val="en-IE"/>
+              </w:rPr>
+            </w:pPr>
+            <w:r>
+              <w:rPr>
+                <w:sz w:val="24"/>
+                <w:szCs w:val="24"/>
+                <w:lang w:val="en-IE"/>
+              </w:rPr>
+              <w:t>Use buttons instead of short keys</w:t>
+            </w:r>
+          </w:p>
+        </w:tc>
+      </w:tr>
+      <w:tr>
+        <w:tc>
+          <w:tcPr>
+            <w:tcW w:w="2085" w:type="dxa"/>
+            <w:tcBorders>
+              <w:top w:val="single" w:sz="8" w:space="0" w:color="000000"/>
+              <w:left w:val="single" w:sz="8" w:space="0" w:color="000000"/>
+              <w:bottom w:val="single" w:sz="8" w:space="0" w:color="000000"/>
+              <w:right w:val="single" w:sz="8" w:space="0" w:color="000000"/>
+            </w:tcBorders>
+            <w:tcMar>
+              <w:top w:w="100" w:type="dxa"/>
+              <w:left w:w="100" w:type="dxa"/>
+              <w:bottom w:w="100" w:type="dxa"/>
+              <w:right w:w="100" w:type="dxa"/>
+            </w:tcMar>
+            <w:hideMark/>
+          </w:tcPr>
+          <w:p>
+            <w:pPr>
+              <w:rPr>
+                <w:sz w:val="24"/>
+                <w:szCs w:val="24"/>
+                <w:lang w:val="en-IE"/>
+              </w:rPr>
+            </w:pPr>
+            <w:r>
+              <w:rPr>
+                <w:sz w:val="24"/>
+                <w:szCs w:val="24"/>
+                <w:lang w:val="en-IE"/>
+              </w:rPr>
+              <w:t>Primary Actor</w:t>
+            </w:r>
+          </w:p>
+        </w:tc>
+        <w:tc>
+          <w:tcPr>
+            <w:tcW w:w="6915" w:type="dxa"/>
+            <w:tcBorders>
+              <w:top w:val="single" w:sz="8" w:space="0" w:color="000000"/>
+              <w:left w:val="single" w:sz="8" w:space="0" w:color="000000"/>
+              <w:bottom w:val="single" w:sz="8" w:space="0" w:color="000000"/>
+              <w:right w:val="single" w:sz="8" w:space="0" w:color="000000"/>
+            </w:tcBorders>
+            <w:tcMar>
+              <w:top w:w="100" w:type="dxa"/>
+              <w:left w:w="100" w:type="dxa"/>
+              <w:bottom w:w="100" w:type="dxa"/>
+              <w:right w:w="100" w:type="dxa"/>
+            </w:tcMar>
+            <w:hideMark/>
+          </w:tcPr>
+          <w:p>
+            <w:pPr>
+              <w:rPr>
+                <w:sz w:val="24"/>
+                <w:szCs w:val="24"/>
+                <w:lang w:val="en-IE"/>
+              </w:rPr>
+            </w:pPr>
+            <w:r>
+              <w:rPr>
+                <w:sz w:val="24"/>
+                <w:szCs w:val="24"/>
+                <w:lang w:val="en-IE"/>
+              </w:rPr>
+              <w:t>User</w:t>
+            </w:r>
+          </w:p>
+        </w:tc>
+      </w:tr>
+      <w:tr>
+        <w:tc>
+          <w:tcPr>
+            <w:tcW w:w="2085" w:type="dxa"/>
+            <w:tcBorders>
+              <w:top w:val="single" w:sz="8" w:space="0" w:color="000000"/>
+              <w:left w:val="single" w:sz="8" w:space="0" w:color="000000"/>
+              <w:bottom w:val="single" w:sz="8" w:space="0" w:color="000000"/>
+              <w:right w:val="single" w:sz="8" w:space="0" w:color="000000"/>
+            </w:tcBorders>
+            <w:tcMar>
+              <w:top w:w="100" w:type="dxa"/>
+              <w:left w:w="100" w:type="dxa"/>
+              <w:bottom w:w="100" w:type="dxa"/>
+              <w:right w:w="100" w:type="dxa"/>
+            </w:tcMar>
+            <w:hideMark/>
+          </w:tcPr>
+          <w:p>
+            <w:pPr>
+              <w:rPr>
+                <w:sz w:val="24"/>
+                <w:szCs w:val="24"/>
+                <w:lang w:val="en-IE"/>
+              </w:rPr>
+            </w:pPr>
+            <w:r>
+              <w:rPr>
+                <w:sz w:val="24"/>
+                <w:szCs w:val="24"/>
+                <w:lang w:val="en-IE"/>
+              </w:rPr>
+              <w:t>Story</w:t>
+            </w:r>
+          </w:p>
+        </w:tc>
+        <w:tc>
+          <w:tcPr>
+            <w:tcW w:w="6915" w:type="dxa"/>
+            <w:tcBorders>
+              <w:top w:val="single" w:sz="8" w:space="0" w:color="000000"/>
+              <w:left w:val="single" w:sz="8" w:space="0" w:color="000000"/>
+              <w:bottom w:val="single" w:sz="8" w:space="0" w:color="000000"/>
+              <w:right w:val="single" w:sz="8" w:space="0" w:color="000000"/>
+            </w:tcBorders>
+            <w:tcMar>
+              <w:top w:w="100" w:type="dxa"/>
+              <w:left w:w="100" w:type="dxa"/>
+              <w:bottom w:w="100" w:type="dxa"/>
+              <w:right w:w="100" w:type="dxa"/>
+            </w:tcMar>
+            <w:hideMark/>
+          </w:tcPr>
+          <w:p>
+            <w:pPr>
+              <w:rPr>
+                <w:sz w:val="24"/>
+                <w:szCs w:val="24"/>
+                <w:lang w:val="en-IE"/>
+              </w:rPr>
+            </w:pPr>
+            <w:r>
+              <w:rPr>
+                <w:sz w:val="24"/>
+                <w:szCs w:val="24"/>
+                <w:lang w:val="en-IE"/>
+              </w:rPr>
+              <w:t>The user wants to use buttons instead of short keys, a tooltip will be available named Control Panel, that will open a form allowing the user to use buttons instead.</w:t>
+            </w:r>
+          </w:p>
+        </w:tc>
+      </w:tr>
+    </w:tbl>
     <w:p>
       <w:pPr>
         <w:jc w:val="center"/>
@@ -4241,6 +3940,250 @@
         </w:rPr>
       </w:pPr>
     </w:p>
+    <w:tbl>
+      <w:tblPr>
+        <w:tblW w:w="9000" w:type="dxa"/>
+        <w:tblInd w:w="100" w:type="dxa"/>
+        <w:tblBorders>
+          <w:top w:val="single" w:sz="8" w:space="0" w:color="000000"/>
+          <w:left w:val="single" w:sz="8" w:space="0" w:color="000000"/>
+          <w:bottom w:val="single" w:sz="8" w:space="0" w:color="000000"/>
+          <w:right w:val="single" w:sz="8" w:space="0" w:color="000000"/>
+          <w:insideH w:val="single" w:sz="8" w:space="0" w:color="000000"/>
+          <w:insideV w:val="single" w:sz="8" w:space="0" w:color="000000"/>
+        </w:tblBorders>
+        <w:tblLayout w:type="fixed"/>
+        <w:tblLook w:val="0600" w:firstRow="0" w:lastRow="0" w:firstColumn="0" w:lastColumn="0" w:noHBand="1" w:noVBand="1"/>
+      </w:tblPr>
+      <w:tblGrid>
+        <w:gridCol w:w="2085"/>
+        <w:gridCol w:w="6915"/>
+      </w:tblGrid>
+      <w:tr>
+        <w:tc>
+          <w:tcPr>
+            <w:tcW w:w="2085" w:type="dxa"/>
+            <w:tcBorders>
+              <w:top w:val="single" w:sz="8" w:space="0" w:color="000000"/>
+              <w:left w:val="single" w:sz="8" w:space="0" w:color="000000"/>
+              <w:bottom w:val="single" w:sz="8" w:space="0" w:color="000000"/>
+              <w:right w:val="single" w:sz="8" w:space="0" w:color="000000"/>
+            </w:tcBorders>
+            <w:tcMar>
+              <w:top w:w="100" w:type="dxa"/>
+              <w:left w:w="100" w:type="dxa"/>
+              <w:bottom w:w="100" w:type="dxa"/>
+              <w:right w:w="100" w:type="dxa"/>
+            </w:tcMar>
+            <w:hideMark/>
+          </w:tcPr>
+          <w:p>
+            <w:pPr>
+              <w:rPr>
+                <w:sz w:val="24"/>
+                <w:szCs w:val="24"/>
+                <w:lang w:val="en-IE"/>
+              </w:rPr>
+            </w:pPr>
+            <w:r>
+              <w:rPr>
+                <w:sz w:val="24"/>
+                <w:szCs w:val="24"/>
+                <w:lang w:val="en-IE"/>
+              </w:rPr>
+              <w:t>Title (goal)</w:t>
+            </w:r>
+          </w:p>
+        </w:tc>
+        <w:tc>
+          <w:tcPr>
+            <w:tcW w:w="6915" w:type="dxa"/>
+            <w:tcBorders>
+              <w:top w:val="single" w:sz="8" w:space="0" w:color="000000"/>
+              <w:left w:val="single" w:sz="8" w:space="0" w:color="000000"/>
+              <w:bottom w:val="single" w:sz="8" w:space="0" w:color="000000"/>
+              <w:right w:val="single" w:sz="8" w:space="0" w:color="000000"/>
+            </w:tcBorders>
+            <w:tcMar>
+              <w:top w:w="100" w:type="dxa"/>
+              <w:left w:w="100" w:type="dxa"/>
+              <w:bottom w:w="100" w:type="dxa"/>
+              <w:right w:w="100" w:type="dxa"/>
+            </w:tcMar>
+            <w:hideMark/>
+          </w:tcPr>
+          <w:p>
+            <w:pPr>
+              <w:rPr>
+                <w:sz w:val="24"/>
+                <w:szCs w:val="24"/>
+                <w:lang w:val="en-IE"/>
+              </w:rPr>
+            </w:pPr>
+            <w:r>
+              <w:rPr>
+                <w:sz w:val="24"/>
+                <w:szCs w:val="24"/>
+                <w:lang w:val="en-IE"/>
+              </w:rPr>
+              <w:t>Help</w:t>
+            </w:r>
+          </w:p>
+        </w:tc>
+      </w:tr>
+      <w:tr>
+        <w:tc>
+          <w:tcPr>
+            <w:tcW w:w="2085" w:type="dxa"/>
+            <w:tcBorders>
+              <w:top w:val="single" w:sz="8" w:space="0" w:color="000000"/>
+              <w:left w:val="single" w:sz="8" w:space="0" w:color="000000"/>
+              <w:bottom w:val="single" w:sz="8" w:space="0" w:color="000000"/>
+              <w:right w:val="single" w:sz="8" w:space="0" w:color="000000"/>
+            </w:tcBorders>
+            <w:tcMar>
+              <w:top w:w="100" w:type="dxa"/>
+              <w:left w:w="100" w:type="dxa"/>
+              <w:bottom w:w="100" w:type="dxa"/>
+              <w:right w:w="100" w:type="dxa"/>
+            </w:tcMar>
+            <w:hideMark/>
+          </w:tcPr>
+          <w:p>
+            <w:pPr>
+              <w:rPr>
+                <w:sz w:val="24"/>
+                <w:szCs w:val="24"/>
+                <w:lang w:val="en-IE"/>
+              </w:rPr>
+            </w:pPr>
+            <w:r>
+              <w:rPr>
+                <w:sz w:val="24"/>
+                <w:szCs w:val="24"/>
+                <w:lang w:val="en-IE"/>
+              </w:rPr>
+              <w:t>Primary Actor</w:t>
+            </w:r>
+          </w:p>
+        </w:tc>
+        <w:tc>
+          <w:tcPr>
+            <w:tcW w:w="6915" w:type="dxa"/>
+            <w:tcBorders>
+              <w:top w:val="single" w:sz="8" w:space="0" w:color="000000"/>
+              <w:left w:val="single" w:sz="8" w:space="0" w:color="000000"/>
+              <w:bottom w:val="single" w:sz="8" w:space="0" w:color="000000"/>
+              <w:right w:val="single" w:sz="8" w:space="0" w:color="000000"/>
+            </w:tcBorders>
+            <w:tcMar>
+              <w:top w:w="100" w:type="dxa"/>
+              <w:left w:w="100" w:type="dxa"/>
+              <w:bottom w:w="100" w:type="dxa"/>
+              <w:right w:w="100" w:type="dxa"/>
+            </w:tcMar>
+            <w:hideMark/>
+          </w:tcPr>
+          <w:p>
+            <w:pPr>
+              <w:rPr>
+                <w:sz w:val="24"/>
+                <w:szCs w:val="24"/>
+                <w:lang w:val="en-IE"/>
+              </w:rPr>
+            </w:pPr>
+            <w:r>
+              <w:rPr>
+                <w:sz w:val="24"/>
+                <w:szCs w:val="24"/>
+                <w:lang w:val="en-IE"/>
+              </w:rPr>
+              <w:t>User</w:t>
+            </w:r>
+          </w:p>
+        </w:tc>
+      </w:tr>
+      <w:tr>
+        <w:tc>
+          <w:tcPr>
+            <w:tcW w:w="2085" w:type="dxa"/>
+            <w:tcBorders>
+              <w:top w:val="single" w:sz="8" w:space="0" w:color="000000"/>
+              <w:left w:val="single" w:sz="8" w:space="0" w:color="000000"/>
+              <w:bottom w:val="single" w:sz="8" w:space="0" w:color="000000"/>
+              <w:right w:val="single" w:sz="8" w:space="0" w:color="000000"/>
+            </w:tcBorders>
+            <w:tcMar>
+              <w:top w:w="100" w:type="dxa"/>
+              <w:left w:w="100" w:type="dxa"/>
+              <w:bottom w:w="100" w:type="dxa"/>
+              <w:right w:w="100" w:type="dxa"/>
+            </w:tcMar>
+            <w:hideMark/>
+          </w:tcPr>
+          <w:p>
+            <w:pPr>
+              <w:rPr>
+                <w:sz w:val="24"/>
+                <w:szCs w:val="24"/>
+                <w:lang w:val="en-IE"/>
+              </w:rPr>
+            </w:pPr>
+            <w:r>
+              <w:rPr>
+                <w:sz w:val="24"/>
+                <w:szCs w:val="24"/>
+                <w:lang w:val="en-IE"/>
+              </w:rPr>
+              <w:t>Story</w:t>
+            </w:r>
+          </w:p>
+        </w:tc>
+        <w:tc>
+          <w:tcPr>
+            <w:tcW w:w="6915" w:type="dxa"/>
+            <w:tcBorders>
+              <w:top w:val="single" w:sz="8" w:space="0" w:color="000000"/>
+              <w:left w:val="single" w:sz="8" w:space="0" w:color="000000"/>
+              <w:bottom w:val="single" w:sz="8" w:space="0" w:color="000000"/>
+              <w:right w:val="single" w:sz="8" w:space="0" w:color="000000"/>
+            </w:tcBorders>
+            <w:tcMar>
+              <w:top w:w="100" w:type="dxa"/>
+              <w:left w:w="100" w:type="dxa"/>
+              <w:bottom w:w="100" w:type="dxa"/>
+              <w:right w:w="100" w:type="dxa"/>
+            </w:tcMar>
+            <w:hideMark/>
+          </w:tcPr>
+          <w:p>
+            <w:pPr>
+              <w:rPr>
+                <w:sz w:val="24"/>
+                <w:szCs w:val="24"/>
+                <w:lang w:val="en-IE"/>
+              </w:rPr>
+            </w:pPr>
+            <w:r>
+              <w:rPr>
+                <w:sz w:val="24"/>
+                <w:szCs w:val="24"/>
+                <w:lang w:val="en-IE"/>
+              </w:rPr>
+              <w:t xml:space="preserve">The user wants to </w:t>
+            </w:r>
+            <w:r>
+              <w:rPr>
+                <w:sz w:val="24"/>
+                <w:szCs w:val="24"/>
+                <w:lang w:val="en-IE"/>
+              </w:rPr>
+              <w:t>understand how to use the app, the help panel will show the user different examples of the app functionality such as: short keys; how to open the panel; operations available; etc.</w:t>
+            </w:r>
+          </w:p>
+        </w:tc>
+      </w:tr>
+    </w:tbl>
     <w:p>
       <w:pPr>
         <w:jc w:val="center"/>
@@ -4251,6 +4194,467 @@
         </w:rPr>
       </w:pPr>
     </w:p>
+    <w:tbl>
+      <w:tblPr>
+        <w:tblW w:w="9000" w:type="dxa"/>
+        <w:tblInd w:w="100" w:type="dxa"/>
+        <w:tblBorders>
+          <w:top w:val="single" w:sz="8" w:space="0" w:color="000000"/>
+          <w:left w:val="single" w:sz="8" w:space="0" w:color="000000"/>
+          <w:bottom w:val="single" w:sz="8" w:space="0" w:color="000000"/>
+          <w:right w:val="single" w:sz="8" w:space="0" w:color="000000"/>
+          <w:insideH w:val="single" w:sz="8" w:space="0" w:color="000000"/>
+          <w:insideV w:val="single" w:sz="8" w:space="0" w:color="000000"/>
+        </w:tblBorders>
+        <w:tblLayout w:type="fixed"/>
+        <w:tblLook w:val="0600" w:firstRow="0" w:lastRow="0" w:firstColumn="0" w:lastColumn="0" w:noHBand="1" w:noVBand="1"/>
+      </w:tblPr>
+      <w:tblGrid>
+        <w:gridCol w:w="2085"/>
+        <w:gridCol w:w="6915"/>
+      </w:tblGrid>
+      <w:tr>
+        <w:tc>
+          <w:tcPr>
+            <w:tcW w:w="2085" w:type="dxa"/>
+            <w:tcBorders>
+              <w:top w:val="single" w:sz="8" w:space="0" w:color="000000"/>
+              <w:left w:val="single" w:sz="8" w:space="0" w:color="000000"/>
+              <w:bottom w:val="single" w:sz="8" w:space="0" w:color="000000"/>
+              <w:right w:val="single" w:sz="8" w:space="0" w:color="000000"/>
+            </w:tcBorders>
+            <w:tcMar>
+              <w:top w:w="100" w:type="dxa"/>
+              <w:left w:w="100" w:type="dxa"/>
+              <w:bottom w:w="100" w:type="dxa"/>
+              <w:right w:w="100" w:type="dxa"/>
+            </w:tcMar>
+            <w:hideMark/>
+          </w:tcPr>
+          <w:p>
+            <w:pPr>
+              <w:rPr>
+                <w:sz w:val="24"/>
+                <w:szCs w:val="24"/>
+                <w:lang w:val="en-IE"/>
+              </w:rPr>
+            </w:pPr>
+            <w:r>
+              <w:rPr>
+                <w:sz w:val="24"/>
+                <w:szCs w:val="24"/>
+                <w:lang w:val="en-IE"/>
+              </w:rPr>
+              <w:t>Title (goal)</w:t>
+            </w:r>
+          </w:p>
+        </w:tc>
+        <w:tc>
+          <w:tcPr>
+            <w:tcW w:w="6915" w:type="dxa"/>
+            <w:tcBorders>
+              <w:top w:val="single" w:sz="8" w:space="0" w:color="000000"/>
+              <w:left w:val="single" w:sz="8" w:space="0" w:color="000000"/>
+              <w:bottom w:val="single" w:sz="8" w:space="0" w:color="000000"/>
+              <w:right w:val="single" w:sz="8" w:space="0" w:color="000000"/>
+            </w:tcBorders>
+            <w:tcMar>
+              <w:top w:w="100" w:type="dxa"/>
+              <w:left w:w="100" w:type="dxa"/>
+              <w:bottom w:w="100" w:type="dxa"/>
+              <w:right w:w="100" w:type="dxa"/>
+            </w:tcMar>
+            <w:hideMark/>
+          </w:tcPr>
+          <w:p>
+            <w:pPr>
+              <w:rPr>
+                <w:sz w:val="24"/>
+                <w:szCs w:val="24"/>
+                <w:lang w:val="en-IE"/>
+              </w:rPr>
+            </w:pPr>
+            <w:r>
+              <w:rPr>
+                <w:sz w:val="24"/>
+                <w:szCs w:val="24"/>
+                <w:lang w:val="en-IE"/>
+              </w:rPr>
+              <w:t>Save the project for future use</w:t>
+            </w:r>
+          </w:p>
+        </w:tc>
+      </w:tr>
+      <w:tr>
+        <w:tc>
+          <w:tcPr>
+            <w:tcW w:w="2085" w:type="dxa"/>
+            <w:tcBorders>
+              <w:top w:val="single" w:sz="8" w:space="0" w:color="000000"/>
+              <w:left w:val="single" w:sz="8" w:space="0" w:color="000000"/>
+              <w:bottom w:val="single" w:sz="8" w:space="0" w:color="000000"/>
+              <w:right w:val="single" w:sz="8" w:space="0" w:color="000000"/>
+            </w:tcBorders>
+            <w:tcMar>
+              <w:top w:w="100" w:type="dxa"/>
+              <w:left w:w="100" w:type="dxa"/>
+              <w:bottom w:w="100" w:type="dxa"/>
+              <w:right w:w="100" w:type="dxa"/>
+            </w:tcMar>
+            <w:hideMark/>
+          </w:tcPr>
+          <w:p>
+            <w:pPr>
+              <w:rPr>
+                <w:sz w:val="24"/>
+                <w:szCs w:val="24"/>
+                <w:lang w:val="en-IE"/>
+              </w:rPr>
+            </w:pPr>
+            <w:r>
+              <w:rPr>
+                <w:sz w:val="24"/>
+                <w:szCs w:val="24"/>
+                <w:lang w:val="en-IE"/>
+              </w:rPr>
+              <w:t>Primary Actor</w:t>
+            </w:r>
+          </w:p>
+        </w:tc>
+        <w:tc>
+          <w:tcPr>
+            <w:tcW w:w="6915" w:type="dxa"/>
+            <w:tcBorders>
+              <w:top w:val="single" w:sz="8" w:space="0" w:color="000000"/>
+              <w:left w:val="single" w:sz="8" w:space="0" w:color="000000"/>
+              <w:bottom w:val="single" w:sz="8" w:space="0" w:color="000000"/>
+              <w:right w:val="single" w:sz="8" w:space="0" w:color="000000"/>
+            </w:tcBorders>
+            <w:tcMar>
+              <w:top w:w="100" w:type="dxa"/>
+              <w:left w:w="100" w:type="dxa"/>
+              <w:bottom w:w="100" w:type="dxa"/>
+              <w:right w:w="100" w:type="dxa"/>
+            </w:tcMar>
+            <w:hideMark/>
+          </w:tcPr>
+          <w:p>
+            <w:pPr>
+              <w:rPr>
+                <w:sz w:val="24"/>
+                <w:szCs w:val="24"/>
+                <w:lang w:val="en-IE"/>
+              </w:rPr>
+            </w:pPr>
+            <w:r>
+              <w:rPr>
+                <w:sz w:val="24"/>
+                <w:szCs w:val="24"/>
+                <w:lang w:val="en-IE"/>
+              </w:rPr>
+              <w:t>User</w:t>
+            </w:r>
+          </w:p>
+        </w:tc>
+      </w:tr>
+      <w:tr>
+        <w:tc>
+          <w:tcPr>
+            <w:tcW w:w="2085" w:type="dxa"/>
+            <w:tcBorders>
+              <w:top w:val="single" w:sz="8" w:space="0" w:color="000000"/>
+              <w:left w:val="single" w:sz="8" w:space="0" w:color="000000"/>
+              <w:bottom w:val="single" w:sz="8" w:space="0" w:color="000000"/>
+              <w:right w:val="single" w:sz="8" w:space="0" w:color="000000"/>
+            </w:tcBorders>
+            <w:tcMar>
+              <w:top w:w="100" w:type="dxa"/>
+              <w:left w:w="100" w:type="dxa"/>
+              <w:bottom w:w="100" w:type="dxa"/>
+              <w:right w:w="100" w:type="dxa"/>
+            </w:tcMar>
+            <w:hideMark/>
+          </w:tcPr>
+          <w:p>
+            <w:pPr>
+              <w:rPr>
+                <w:sz w:val="24"/>
+                <w:szCs w:val="24"/>
+                <w:lang w:val="en-IE"/>
+              </w:rPr>
+            </w:pPr>
+            <w:r>
+              <w:rPr>
+                <w:sz w:val="24"/>
+                <w:szCs w:val="24"/>
+                <w:lang w:val="en-IE"/>
+              </w:rPr>
+              <w:t>Story</w:t>
+            </w:r>
+          </w:p>
+        </w:tc>
+        <w:tc>
+          <w:tcPr>
+            <w:tcW w:w="6915" w:type="dxa"/>
+            <w:tcBorders>
+              <w:top w:val="single" w:sz="8" w:space="0" w:color="000000"/>
+              <w:left w:val="single" w:sz="8" w:space="0" w:color="000000"/>
+              <w:bottom w:val="single" w:sz="8" w:space="0" w:color="000000"/>
+              <w:right w:val="single" w:sz="8" w:space="0" w:color="000000"/>
+            </w:tcBorders>
+            <w:tcMar>
+              <w:top w:w="100" w:type="dxa"/>
+              <w:left w:w="100" w:type="dxa"/>
+              <w:bottom w:w="100" w:type="dxa"/>
+              <w:right w:w="100" w:type="dxa"/>
+            </w:tcMar>
+            <w:hideMark/>
+          </w:tcPr>
+          <w:p>
+            <w:pPr>
+              <w:rPr>
+                <w:sz w:val="24"/>
+                <w:szCs w:val="24"/>
+                <w:lang w:val="en-IE"/>
+              </w:rPr>
+            </w:pPr>
+            <w:r>
+              <w:rPr>
+                <w:sz w:val="24"/>
+                <w:szCs w:val="24"/>
+                <w:lang w:val="en-IE"/>
+              </w:rPr>
+              <w:t>The user wants to save the current project so he can continue later, the user will have the option to “save project as” that will save necessary data.</w:t>
+            </w:r>
+          </w:p>
+        </w:tc>
+      </w:tr>
+      <w:tr>
+        <w:tc>
+          <w:tcPr>
+            <w:tcW w:w="2085" w:type="dxa"/>
+            <w:tcBorders>
+              <w:top w:val="single" w:sz="8" w:space="0" w:color="000000"/>
+              <w:left w:val="single" w:sz="8" w:space="0" w:color="000000"/>
+              <w:bottom w:val="single" w:sz="8" w:space="0" w:color="000000"/>
+              <w:right w:val="single" w:sz="8" w:space="0" w:color="000000"/>
+            </w:tcBorders>
+            <w:tcMar>
+              <w:top w:w="100" w:type="dxa"/>
+              <w:left w:w="100" w:type="dxa"/>
+              <w:bottom w:w="100" w:type="dxa"/>
+              <w:right w:w="100" w:type="dxa"/>
+            </w:tcMar>
+            <w:hideMark/>
+          </w:tcPr>
+          <w:p>
+            <w:pPr>
+              <w:rPr>
+                <w:sz w:val="24"/>
+                <w:szCs w:val="24"/>
+                <w:lang w:val="en-IE"/>
+              </w:rPr>
+            </w:pPr>
+            <w:r>
+              <w:rPr>
+                <w:sz w:val="24"/>
+                <w:szCs w:val="24"/>
+                <w:lang w:val="en-IE"/>
+              </w:rPr>
+              <w:lastRenderedPageBreak/>
+              <w:t>Title (goal)</w:t>
+            </w:r>
+          </w:p>
+        </w:tc>
+        <w:tc>
+          <w:tcPr>
+            <w:tcW w:w="6915" w:type="dxa"/>
+            <w:tcBorders>
+              <w:top w:val="single" w:sz="8" w:space="0" w:color="000000"/>
+              <w:left w:val="single" w:sz="8" w:space="0" w:color="000000"/>
+              <w:bottom w:val="single" w:sz="8" w:space="0" w:color="000000"/>
+              <w:right w:val="single" w:sz="8" w:space="0" w:color="000000"/>
+            </w:tcBorders>
+            <w:tcMar>
+              <w:top w:w="100" w:type="dxa"/>
+              <w:left w:w="100" w:type="dxa"/>
+              <w:bottom w:w="100" w:type="dxa"/>
+              <w:right w:w="100" w:type="dxa"/>
+            </w:tcMar>
+            <w:hideMark/>
+          </w:tcPr>
+          <w:p>
+            <w:pPr>
+              <w:rPr>
+                <w:sz w:val="24"/>
+                <w:szCs w:val="24"/>
+                <w:lang w:val="en-IE"/>
+              </w:rPr>
+            </w:pPr>
+            <w:r>
+              <w:rPr>
+                <w:sz w:val="24"/>
+                <w:szCs w:val="24"/>
+                <w:lang w:val="en-IE"/>
+              </w:rPr>
+              <w:t>Open existing project</w:t>
+            </w:r>
+          </w:p>
+        </w:tc>
+      </w:tr>
+      <w:tr>
+        <w:tc>
+          <w:tcPr>
+            <w:tcW w:w="2085" w:type="dxa"/>
+            <w:tcBorders>
+              <w:top w:val="single" w:sz="8" w:space="0" w:color="000000"/>
+              <w:left w:val="single" w:sz="8" w:space="0" w:color="000000"/>
+              <w:bottom w:val="single" w:sz="8" w:space="0" w:color="000000"/>
+              <w:right w:val="single" w:sz="8" w:space="0" w:color="000000"/>
+            </w:tcBorders>
+            <w:tcMar>
+              <w:top w:w="100" w:type="dxa"/>
+              <w:left w:w="100" w:type="dxa"/>
+              <w:bottom w:w="100" w:type="dxa"/>
+              <w:right w:w="100" w:type="dxa"/>
+            </w:tcMar>
+            <w:hideMark/>
+          </w:tcPr>
+          <w:p>
+            <w:pPr>
+              <w:rPr>
+                <w:sz w:val="24"/>
+                <w:szCs w:val="24"/>
+                <w:lang w:val="en-IE"/>
+              </w:rPr>
+            </w:pPr>
+            <w:r>
+              <w:rPr>
+                <w:sz w:val="24"/>
+                <w:szCs w:val="24"/>
+                <w:lang w:val="en-IE"/>
+              </w:rPr>
+              <w:t>Primary Actor</w:t>
+            </w:r>
+          </w:p>
+        </w:tc>
+        <w:tc>
+          <w:tcPr>
+            <w:tcW w:w="6915" w:type="dxa"/>
+            <w:tcBorders>
+              <w:top w:val="single" w:sz="8" w:space="0" w:color="000000"/>
+              <w:left w:val="single" w:sz="8" w:space="0" w:color="000000"/>
+              <w:bottom w:val="single" w:sz="8" w:space="0" w:color="000000"/>
+              <w:right w:val="single" w:sz="8" w:space="0" w:color="000000"/>
+            </w:tcBorders>
+            <w:tcMar>
+              <w:top w:w="100" w:type="dxa"/>
+              <w:left w:w="100" w:type="dxa"/>
+              <w:bottom w:w="100" w:type="dxa"/>
+              <w:right w:w="100" w:type="dxa"/>
+            </w:tcMar>
+            <w:hideMark/>
+          </w:tcPr>
+          <w:p>
+            <w:pPr>
+              <w:rPr>
+                <w:sz w:val="24"/>
+                <w:szCs w:val="24"/>
+                <w:lang w:val="en-IE"/>
+              </w:rPr>
+            </w:pPr>
+            <w:r>
+              <w:rPr>
+                <w:sz w:val="24"/>
+                <w:szCs w:val="24"/>
+                <w:lang w:val="en-IE"/>
+              </w:rPr>
+              <w:t>User</w:t>
+            </w:r>
+          </w:p>
+        </w:tc>
+      </w:tr>
+      <w:tr>
+        <w:tc>
+          <w:tcPr>
+            <w:tcW w:w="2085" w:type="dxa"/>
+            <w:tcBorders>
+              <w:top w:val="single" w:sz="8" w:space="0" w:color="000000"/>
+              <w:left w:val="single" w:sz="8" w:space="0" w:color="000000"/>
+              <w:bottom w:val="single" w:sz="8" w:space="0" w:color="000000"/>
+              <w:right w:val="single" w:sz="8" w:space="0" w:color="000000"/>
+            </w:tcBorders>
+            <w:tcMar>
+              <w:top w:w="100" w:type="dxa"/>
+              <w:left w:w="100" w:type="dxa"/>
+              <w:bottom w:w="100" w:type="dxa"/>
+              <w:right w:w="100" w:type="dxa"/>
+            </w:tcMar>
+            <w:hideMark/>
+          </w:tcPr>
+          <w:p>
+            <w:pPr>
+              <w:rPr>
+                <w:sz w:val="24"/>
+                <w:szCs w:val="24"/>
+                <w:lang w:val="en-IE"/>
+              </w:rPr>
+            </w:pPr>
+            <w:r>
+              <w:rPr>
+                <w:sz w:val="24"/>
+                <w:szCs w:val="24"/>
+                <w:lang w:val="en-IE"/>
+              </w:rPr>
+              <w:t>Story</w:t>
+            </w:r>
+          </w:p>
+        </w:tc>
+        <w:tc>
+          <w:tcPr>
+            <w:tcW w:w="6915" w:type="dxa"/>
+            <w:tcBorders>
+              <w:top w:val="single" w:sz="8" w:space="0" w:color="000000"/>
+              <w:left w:val="single" w:sz="8" w:space="0" w:color="000000"/>
+              <w:bottom w:val="single" w:sz="8" w:space="0" w:color="000000"/>
+              <w:right w:val="single" w:sz="8" w:space="0" w:color="000000"/>
+            </w:tcBorders>
+            <w:tcMar>
+              <w:top w:w="100" w:type="dxa"/>
+              <w:left w:w="100" w:type="dxa"/>
+              <w:bottom w:w="100" w:type="dxa"/>
+              <w:right w:w="100" w:type="dxa"/>
+            </w:tcMar>
+            <w:hideMark/>
+          </w:tcPr>
+          <w:p>
+            <w:pPr>
+              <w:rPr>
+                <w:sz w:val="24"/>
+                <w:szCs w:val="24"/>
+                <w:lang w:val="en-IE"/>
+              </w:rPr>
+            </w:pPr>
+            <w:r>
+              <w:rPr>
+                <w:sz w:val="24"/>
+                <w:szCs w:val="24"/>
+                <w:lang w:val="en-IE"/>
+              </w:rPr>
+              <w:t xml:space="preserve">The user wants to </w:t>
+            </w:r>
+            <w:r>
+              <w:rPr>
+                <w:sz w:val="24"/>
+                <w:szCs w:val="24"/>
+                <w:lang w:val="en-IE"/>
+              </w:rPr>
+              <w:t>open a saved project to continue, the user would have to open the project file that will be imported into the application.</w:t>
+            </w:r>
+          </w:p>
+        </w:tc>
+      </w:tr>
+    </w:tbl>
     <w:p>
       <w:pPr>
         <w:jc w:val="center"/>
@@ -4425,6 +4829,208 @@
       <w:pPr>
         <w:jc w:val="center"/>
         <w:rPr>
+          <w:sz w:val="24"/>
+          <w:szCs w:val="24"/>
+          <w:lang w:val="en-IE"/>
+        </w:rPr>
+      </w:pPr>
+    </w:p>
+    <w:p>
+      <w:pPr>
+        <w:jc w:val="center"/>
+        <w:rPr>
+          <w:sz w:val="24"/>
+          <w:szCs w:val="24"/>
+          <w:lang w:val="en-IE"/>
+        </w:rPr>
+      </w:pPr>
+    </w:p>
+    <w:p>
+      <w:pPr>
+        <w:jc w:val="center"/>
+        <w:rPr>
+          <w:b/>
+          <w:bCs/>
+          <w:sz w:val="24"/>
+          <w:szCs w:val="24"/>
+          <w:lang w:val="en-IE"/>
+        </w:rPr>
+      </w:pPr>
+    </w:p>
+    <w:p>
+      <w:pPr>
+        <w:jc w:val="center"/>
+        <w:rPr>
+          <w:b/>
+          <w:bCs/>
+          <w:sz w:val="24"/>
+          <w:szCs w:val="24"/>
+          <w:lang w:val="en-IE"/>
+        </w:rPr>
+      </w:pPr>
+    </w:p>
+    <w:p>
+      <w:pPr>
+        <w:jc w:val="center"/>
+        <w:rPr>
+          <w:b/>
+          <w:bCs/>
+          <w:sz w:val="24"/>
+          <w:szCs w:val="24"/>
+          <w:lang w:val="en-IE"/>
+        </w:rPr>
+      </w:pPr>
+    </w:p>
+    <w:p>
+      <w:pPr>
+        <w:jc w:val="center"/>
+        <w:rPr>
+          <w:b/>
+          <w:bCs/>
+          <w:sz w:val="24"/>
+          <w:szCs w:val="24"/>
+          <w:lang w:val="en-IE"/>
+        </w:rPr>
+      </w:pPr>
+    </w:p>
+    <w:p>
+      <w:pPr>
+        <w:jc w:val="center"/>
+        <w:rPr>
+          <w:b/>
+          <w:bCs/>
+          <w:sz w:val="24"/>
+          <w:szCs w:val="24"/>
+          <w:lang w:val="en-IE"/>
+        </w:rPr>
+      </w:pPr>
+    </w:p>
+    <w:p>
+      <w:pPr>
+        <w:jc w:val="center"/>
+        <w:rPr>
+          <w:b/>
+          <w:bCs/>
+          <w:sz w:val="24"/>
+          <w:szCs w:val="24"/>
+          <w:lang w:val="en-IE"/>
+        </w:rPr>
+      </w:pPr>
+    </w:p>
+    <w:p>
+      <w:pPr>
+        <w:jc w:val="center"/>
+        <w:rPr>
+          <w:b/>
+          <w:bCs/>
+          <w:sz w:val="24"/>
+          <w:szCs w:val="24"/>
+          <w:lang w:val="en-IE"/>
+        </w:rPr>
+      </w:pPr>
+    </w:p>
+    <w:p>
+      <w:pPr>
+        <w:jc w:val="center"/>
+        <w:rPr>
+          <w:b/>
+          <w:bCs/>
+          <w:sz w:val="24"/>
+          <w:szCs w:val="24"/>
+          <w:lang w:val="en-IE"/>
+        </w:rPr>
+      </w:pPr>
+    </w:p>
+    <w:p>
+      <w:pPr>
+        <w:jc w:val="center"/>
+        <w:rPr>
+          <w:b/>
+          <w:bCs/>
+          <w:sz w:val="24"/>
+          <w:szCs w:val="24"/>
+          <w:lang w:val="en-IE"/>
+        </w:rPr>
+      </w:pPr>
+    </w:p>
+    <w:p>
+      <w:pPr>
+        <w:jc w:val="center"/>
+        <w:rPr>
+          <w:b/>
+          <w:bCs/>
+          <w:sz w:val="24"/>
+          <w:szCs w:val="24"/>
+          <w:lang w:val="en-IE"/>
+        </w:rPr>
+      </w:pPr>
+    </w:p>
+    <w:p>
+      <w:pPr>
+        <w:jc w:val="center"/>
+        <w:rPr>
+          <w:b/>
+          <w:bCs/>
+          <w:sz w:val="24"/>
+          <w:szCs w:val="24"/>
+          <w:lang w:val="en-IE"/>
+        </w:rPr>
+      </w:pPr>
+    </w:p>
+    <w:p>
+      <w:pPr>
+        <w:jc w:val="center"/>
+        <w:rPr>
+          <w:b/>
+          <w:bCs/>
+          <w:sz w:val="24"/>
+          <w:szCs w:val="24"/>
+          <w:lang w:val="en-IE"/>
+        </w:rPr>
+      </w:pPr>
+    </w:p>
+    <w:p>
+      <w:pPr>
+        <w:jc w:val="center"/>
+        <w:rPr>
+          <w:b/>
+          <w:bCs/>
+          <w:sz w:val="24"/>
+          <w:szCs w:val="24"/>
+          <w:lang w:val="en-IE"/>
+        </w:rPr>
+      </w:pPr>
+    </w:p>
+    <w:p>
+      <w:pPr>
+        <w:jc w:val="center"/>
+        <w:rPr>
+          <w:b/>
+          <w:bCs/>
+          <w:sz w:val="24"/>
+          <w:szCs w:val="24"/>
+          <w:lang w:val="en-IE"/>
+        </w:rPr>
+      </w:pPr>
+    </w:p>
+    <w:p>
+      <w:pPr>
+        <w:jc w:val="center"/>
+        <w:rPr>
+          <w:b/>
+          <w:bCs/>
+          <w:sz w:val="24"/>
+          <w:szCs w:val="24"/>
+          <w:lang w:val="en-IE"/>
+        </w:rPr>
+      </w:pPr>
+    </w:p>
+    <w:p>
+      <w:pPr>
+        <w:jc w:val="center"/>
+        <w:rPr>
+          <w:b/>
+          <w:bCs/>
           <w:sz w:val="24"/>
           <w:szCs w:val="24"/>
           <w:lang w:val="en-IE"/>

</xml_diff>